<commit_message>
EDT T5 v2: Times New Roman, en-tete vierge sans bordures, sous-disciplines + compteurs discrets
Co-authored-by: arena-agent <297053741+arena-agent@users.noreply.github.com>
</commit_message>
<xml_diff>
--- a/EDT/emploi_du_temps_T5.docx
+++ b/EDT/emploi_du_temps_T5.docx
@@ -8,12 +8,12 @@
         <w:tblW w:type="auto" w:w="0"/>
         <w:tblLook w:firstColumn="1" w:firstRow="1" w:lastColumn="0" w:lastRow="0" w:noHBand="0" w:noVBand="1" w:val="04A0"/>
         <w:tblBorders>
-          <w:top w:val="single" w:sz="4" w:space="0" w:color="000000"/>
-          <w:left w:val="single" w:sz="4" w:space="0" w:color="000000"/>
-          <w:bottom w:val="single" w:sz="4" w:space="0" w:color="000000"/>
-          <w:right w:val="single" w:sz="4" w:space="0" w:color="000000"/>
-          <w:insideH w:val="single" w:sz="4" w:space="0" w:color="000000"/>
-          <w:insideV w:val="single" w:sz="4" w:space="0" w:color="000000"/>
+          <w:top w:val="none"/>
+          <w:left w:val="none"/>
+          <w:bottom w:val="none"/>
+          <w:right w:val="none"/>
+          <w:insideH w:val="none"/>
+          <w:insideV w:val="none"/>
         </w:tblBorders>
       </w:tblPr>
       <w:tblGrid>
@@ -26,6 +26,12 @@
           <w:tcPr>
             <w:tcW w:type="dxa" w:w="3968"/>
             <w:vAlign w:val="center"/>
+            <w:tcBorders>
+              <w:top w:val="nil"/>
+              <w:left w:val="nil"/>
+              <w:bottom w:val="nil"/>
+              <w:right w:val="nil"/>
+            </w:tcBorders>
           </w:tcPr>
           <w:p>
             <w:pPr>
@@ -34,11 +40,12 @@
             </w:pPr>
             <w:r>
               <w:rPr>
+                <w:rFonts w:ascii="Times New Roman" w:hAnsi="Times New Roman" w:cs="Times New Roman" w:eastAsia="Times New Roman"/>
                 <w:b w:val="0"/>
                 <w:i w:val="0"/>
                 <w:sz w:val="16"/>
               </w:rPr>
-              <w:t>DREN : Analamanga</w:t>
+              <w:t xml:space="preserve">DREN : </w:t>
             </w:r>
           </w:p>
         </w:tc>
@@ -46,6 +53,12 @@
           <w:tcPr>
             <w:tcW w:type="dxa" w:w="5669"/>
             <w:vAlign w:val="center"/>
+            <w:tcBorders>
+              <w:top w:val="nil"/>
+              <w:left w:val="nil"/>
+              <w:bottom w:val="nil"/>
+              <w:right w:val="nil"/>
+            </w:tcBorders>
           </w:tcPr>
           <w:p>
             <w:pPr>
@@ -54,6 +67,7 @@
             </w:pPr>
             <w:r>
               <w:rPr>
+                <w:rFonts w:ascii="Times New Roman" w:hAnsi="Times New Roman" w:cs="Times New Roman" w:eastAsia="Times New Roman"/>
                 <w:b w:val="0"/>
                 <w:i w:val="0"/>
                 <w:sz w:val="16"/>
@@ -65,6 +79,12 @@
           <w:tcPr>
             <w:tcW w:type="dxa" w:w="3968"/>
             <w:vAlign w:val="center"/>
+            <w:tcBorders>
+              <w:top w:val="nil"/>
+              <w:left w:val="nil"/>
+              <w:bottom w:val="nil"/>
+              <w:right w:val="nil"/>
+            </w:tcBorders>
           </w:tcPr>
           <w:p>
             <w:pPr>
@@ -73,6 +93,7 @@
             </w:pPr>
             <w:r>
               <w:rPr>
+                <w:rFonts w:ascii="Times New Roman" w:hAnsi="Times New Roman" w:cs="Times New Roman" w:eastAsia="Times New Roman"/>
                 <w:b w:val="0"/>
                 <w:i w:val="0"/>
                 <w:sz w:val="16"/>
@@ -87,6 +108,12 @@
           <w:tcPr>
             <w:tcW w:type="dxa" w:w="3968"/>
             <w:vAlign w:val="center"/>
+            <w:tcBorders>
+              <w:top w:val="nil"/>
+              <w:left w:val="nil"/>
+              <w:bottom w:val="nil"/>
+              <w:right w:val="nil"/>
+            </w:tcBorders>
           </w:tcPr>
           <w:p>
             <w:pPr>
@@ -95,11 +122,12 @@
             </w:pPr>
             <w:r>
               <w:rPr>
+                <w:rFonts w:ascii="Times New Roman" w:hAnsi="Times New Roman" w:cs="Times New Roman" w:eastAsia="Times New Roman"/>
                 <w:b w:val="0"/>
                 <w:i w:val="0"/>
                 <w:sz w:val="16"/>
               </w:rPr>
-              <w:t>CISCO : Antananarivo Atsimondrano</w:t>
+              <w:t xml:space="preserve">CISCO : </w:t>
             </w:r>
           </w:p>
         </w:tc>
@@ -108,6 +136,12 @@
             <w:tcW w:type="dxa" w:w="5669"/>
             <w:vMerge w:val="restart"/>
             <w:vAlign w:val="center"/>
+            <w:tcBorders>
+              <w:top w:val="nil"/>
+              <w:left w:val="nil"/>
+              <w:bottom w:val="nil"/>
+              <w:right w:val="nil"/>
+            </w:tcBorders>
           </w:tcPr>
           <w:p>
             <w:pPr>
@@ -116,6 +150,7 @@
             </w:pPr>
             <w:r>
               <w:rPr>
+                <w:rFonts w:ascii="Times New Roman" w:hAnsi="Times New Roman" w:cs="Times New Roman" w:eastAsia="Times New Roman"/>
                 <w:b/>
                 <w:i w:val="0"/>
                 <w:sz w:val="28"/>
@@ -128,6 +163,12 @@
           <w:tcPr>
             <w:tcW w:type="dxa" w:w="3968"/>
             <w:vAlign w:val="center"/>
+            <w:tcBorders>
+              <w:top w:val="nil"/>
+              <w:left w:val="nil"/>
+              <w:bottom w:val="nil"/>
+              <w:right w:val="nil"/>
+            </w:tcBorders>
           </w:tcPr>
           <w:p>
             <w:pPr>
@@ -136,11 +177,12 @@
             </w:pPr>
             <w:r>
               <w:rPr>
+                <w:rFonts w:ascii="Times New Roman" w:hAnsi="Times New Roman" w:cs="Times New Roman" w:eastAsia="Times New Roman"/>
                 <w:b w:val="0"/>
                 <w:i w:val="0"/>
                 <w:sz w:val="16"/>
               </w:rPr>
-              <w:t>Code : 102001</w:t>
+              <w:t xml:space="preserve">Code : </w:t>
             </w:r>
           </w:p>
         </w:tc>
@@ -150,6 +192,12 @@
           <w:tcPr>
             <w:tcW w:type="dxa" w:w="3968"/>
             <w:vAlign w:val="center"/>
+            <w:tcBorders>
+              <w:top w:val="nil"/>
+              <w:left w:val="nil"/>
+              <w:bottom w:val="nil"/>
+              <w:right w:val="nil"/>
+            </w:tcBorders>
           </w:tcPr>
           <w:p>
             <w:pPr>
@@ -158,11 +206,12 @@
             </w:pPr>
             <w:r>
               <w:rPr>
+                <w:rFonts w:ascii="Times New Roman" w:hAnsi="Times New Roman" w:cs="Times New Roman" w:eastAsia="Times New Roman"/>
                 <w:b w:val="0"/>
                 <w:i w:val="0"/>
                 <w:sz w:val="16"/>
               </w:rPr>
-              <w:t>ZAP : Ambohidratrimo</w:t>
+              <w:t xml:space="preserve">ZAP : </w:t>
             </w:r>
           </w:p>
         </w:tc>
@@ -177,6 +226,12 @@
           <w:tcPr>
             <w:tcW w:type="dxa" w:w="3968"/>
             <w:vAlign w:val="center"/>
+            <w:tcBorders>
+              <w:top w:val="nil"/>
+              <w:left w:val="nil"/>
+              <w:bottom w:val="nil"/>
+              <w:right w:val="nil"/>
+            </w:tcBorders>
           </w:tcPr>
           <w:p>
             <w:pPr>
@@ -185,6 +240,7 @@
             </w:pPr>
             <w:r>
               <w:rPr>
+                <w:rFonts w:ascii="Times New Roman" w:hAnsi="Times New Roman" w:cs="Times New Roman" w:eastAsia="Times New Roman"/>
                 <w:b/>
                 <w:i w:val="0"/>
                 <w:sz w:val="20"/>
@@ -200,6 +256,12 @@
             <w:tcW w:type="dxa" w:w="13605"/>
             <w:gridSpan w:val="3"/>
             <w:vAlign w:val="center"/>
+            <w:tcBorders>
+              <w:top w:val="nil"/>
+              <w:left w:val="nil"/>
+              <w:bottom w:val="nil"/>
+              <w:right w:val="nil"/>
+            </w:tcBorders>
           </w:tcPr>
           <w:p>
             <w:pPr>
@@ -208,11 +270,12 @@
             </w:pPr>
             <w:r>
               <w:rPr>
+                <w:rFonts w:ascii="Times New Roman" w:hAnsi="Times New Roman" w:cs="Times New Roman" w:eastAsia="Times New Roman"/>
                 <w:b/>
                 <w:i w:val="0"/>
                 <w:sz w:val="18"/>
               </w:rPr>
-              <w:t>EPP : EPP Ambohijatovo</w:t>
+              <w:t xml:space="preserve">École : </w:t>
             </w:r>
           </w:p>
         </w:tc>
@@ -258,6 +321,7 @@
             </w:pPr>
             <w:r>
               <w:rPr>
+                <w:rFonts w:ascii="Times New Roman" w:hAnsi="Times New Roman" w:cs="Times New Roman" w:eastAsia="Times New Roman"/>
                 <w:b/>
                 <w:i w:val="0"/>
                 <w:sz w:val="16"/>
@@ -279,6 +343,7 @@
             </w:pPr>
             <w:r>
               <w:rPr>
+                <w:rFonts w:ascii="Times New Roman" w:hAnsi="Times New Roman" w:cs="Times New Roman" w:eastAsia="Times New Roman"/>
                 <w:b/>
                 <w:i w:val="0"/>
                 <w:sz w:val="16"/>
@@ -302,6 +367,7 @@
             </w:pPr>
             <w:r>
               <w:rPr>
+                <w:rFonts w:ascii="Times New Roman" w:hAnsi="Times New Roman" w:cs="Times New Roman" w:eastAsia="Times New Roman"/>
                 <w:b/>
                 <w:i w:val="0"/>
                 <w:sz w:val="16"/>
@@ -325,6 +391,7 @@
             </w:pPr>
             <w:r>
               <w:rPr>
+                <w:rFonts w:ascii="Times New Roman" w:hAnsi="Times New Roman" w:cs="Times New Roman" w:eastAsia="Times New Roman"/>
                 <w:b/>
                 <w:i w:val="0"/>
                 <w:sz w:val="16"/>
@@ -348,6 +415,7 @@
             </w:pPr>
             <w:r>
               <w:rPr>
+                <w:rFonts w:ascii="Times New Roman" w:hAnsi="Times New Roman" w:cs="Times New Roman" w:eastAsia="Times New Roman"/>
                 <w:b/>
                 <w:i w:val="0"/>
                 <w:sz w:val="16"/>
@@ -371,6 +439,7 @@
             </w:pPr>
             <w:r>
               <w:rPr>
+                <w:rFonts w:ascii="Times New Roman" w:hAnsi="Times New Roman" w:cs="Times New Roman" w:eastAsia="Times New Roman"/>
                 <w:b/>
                 <w:i w:val="0"/>
                 <w:sz w:val="16"/>
@@ -401,6 +470,7 @@
             </w:pPr>
             <w:r>
               <w:rPr>
+                <w:rFonts w:ascii="Times New Roman" w:hAnsi="Times New Roman" w:cs="Times New Roman" w:eastAsia="Times New Roman"/>
                 <w:b/>
                 <w:i w:val="0"/>
                 <w:sz w:val="16"/>
@@ -422,6 +492,7 @@
             </w:pPr>
             <w:r>
               <w:rPr>
+                <w:rFonts w:ascii="Times New Roman" w:hAnsi="Times New Roman" w:cs="Times New Roman" w:eastAsia="Times New Roman"/>
                 <w:b/>
                 <w:i w:val="0"/>
                 <w:sz w:val="16"/>
@@ -445,6 +516,7 @@
             </w:pPr>
             <w:r>
               <w:rPr>
+                <w:rFonts w:ascii="Times New Roman" w:hAnsi="Times New Roman" w:cs="Times New Roman" w:eastAsia="Times New Roman"/>
                 <w:b/>
                 <w:i w:val="0"/>
                 <w:sz w:val="14"/>
@@ -465,11 +537,21 @@
             </w:pPr>
             <w:r>
               <w:rPr>
+                <w:rFonts w:ascii="Times New Roman" w:hAnsi="Times New Roman" w:cs="Times New Roman" w:eastAsia="Times New Roman"/>
                 <w:b w:val="0"/>
                 <w:i w:val="0"/>
                 <w:sz w:val="14"/>
               </w:rPr>
-              <w:t>Malagasy 1/8</w:t>
+              <w:t>Vakiteny</w:t>
+            </w:r>
+            <w:r>
+              <w:rPr>
+                <w:rFonts w:ascii="Times New Roman" w:hAnsi="Times New Roman" w:cs="Times New Roman" w:eastAsia="Times New Roman"/>
+                <w:b w:val="0"/>
+                <w:color w:val="999999"/>
+                <w:sz w:val="10"/>
+              </w:rPr>
+              <w:t xml:space="preserve"> 1/2</w:t>
             </w:r>
           </w:p>
         </w:tc>
@@ -485,11 +567,21 @@
             </w:pPr>
             <w:r>
               <w:rPr>
+                <w:rFonts w:ascii="Times New Roman" w:hAnsi="Times New Roman" w:cs="Times New Roman" w:eastAsia="Times New Roman"/>
                 <w:b w:val="0"/>
                 <w:i w:val="0"/>
                 <w:sz w:val="14"/>
               </w:rPr>
-              <w:t>Malagasy 3/8</w:t>
+              <w:t>Fiasan'ny teny</w:t>
+            </w:r>
+            <w:r>
+              <w:rPr>
+                <w:rFonts w:ascii="Times New Roman" w:hAnsi="Times New Roman" w:cs="Times New Roman" w:eastAsia="Times New Roman"/>
+                <w:b w:val="0"/>
+                <w:color w:val="999999"/>
+                <w:sz w:val="10"/>
+              </w:rPr>
+              <w:t xml:space="preserve"> 1/2</w:t>
             </w:r>
           </w:p>
         </w:tc>
@@ -505,11 +597,21 @@
             </w:pPr>
             <w:r>
               <w:rPr>
+                <w:rFonts w:ascii="Times New Roman" w:hAnsi="Times New Roman" w:cs="Times New Roman" w:eastAsia="Times New Roman"/>
                 <w:b w:val="0"/>
                 <w:i w:val="0"/>
                 <w:sz w:val="14"/>
               </w:rPr>
-              <w:t>Malagasy 5/8</w:t>
+              <w:t>Vakiteny</w:t>
+            </w:r>
+            <w:r>
+              <w:rPr>
+                <w:rFonts w:ascii="Times New Roman" w:hAnsi="Times New Roman" w:cs="Times New Roman" w:eastAsia="Times New Roman"/>
+                <w:b w:val="0"/>
+                <w:color w:val="999999"/>
+                <w:sz w:val="10"/>
+              </w:rPr>
+              <w:t xml:space="preserve"> 2/2</w:t>
             </w:r>
           </w:p>
         </w:tc>
@@ -525,11 +627,21 @@
             </w:pPr>
             <w:r>
               <w:rPr>
+                <w:rFonts w:ascii="Times New Roman" w:hAnsi="Times New Roman" w:cs="Times New Roman" w:eastAsia="Times New Roman"/>
                 <w:b w:val="0"/>
                 <w:i w:val="0"/>
                 <w:sz w:val="14"/>
               </w:rPr>
-              <w:t>Malagasy 6/8</w:t>
+              <w:t>Fiasan'ny teny</w:t>
+            </w:r>
+            <w:r>
+              <w:rPr>
+                <w:rFonts w:ascii="Times New Roman" w:hAnsi="Times New Roman" w:cs="Times New Roman" w:eastAsia="Times New Roman"/>
+                <w:b w:val="0"/>
+                <w:color w:val="999999"/>
+                <w:sz w:val="10"/>
+              </w:rPr>
+              <w:t xml:space="preserve"> 2/2</w:t>
             </w:r>
           </w:p>
         </w:tc>
@@ -545,11 +657,21 @@
             </w:pPr>
             <w:r>
               <w:rPr>
+                <w:rFonts w:ascii="Times New Roman" w:hAnsi="Times New Roman" w:cs="Times New Roman" w:eastAsia="Times New Roman"/>
                 <w:b w:val="0"/>
                 <w:i w:val="0"/>
                 <w:sz w:val="14"/>
               </w:rPr>
-              <w:t>Malagasy 8/8</w:t>
+              <w:t>Asa an-tsoratra</w:t>
+            </w:r>
+            <w:r>
+              <w:rPr>
+                <w:rFonts w:ascii="Times New Roman" w:hAnsi="Times New Roman" w:cs="Times New Roman" w:eastAsia="Times New Roman"/>
+                <w:b w:val="0"/>
+                <w:color w:val="999999"/>
+                <w:sz w:val="10"/>
+              </w:rPr>
+              <w:t xml:space="preserve"> 2/2</w:t>
             </w:r>
           </w:p>
         </w:tc>
@@ -572,6 +694,7 @@
             </w:pPr>
             <w:r>
               <w:rPr>
+                <w:rFonts w:ascii="Times New Roman" w:hAnsi="Times New Roman" w:cs="Times New Roman" w:eastAsia="Times New Roman"/>
                 <w:b w:val="0"/>
                 <w:i w:val="0"/>
                 <w:sz w:val="14"/>
@@ -592,11 +715,12 @@
             </w:pPr>
             <w:r>
               <w:rPr>
+                <w:rFonts w:ascii="Times New Roman" w:hAnsi="Times New Roman" w:cs="Times New Roman" w:eastAsia="Times New Roman"/>
                 <w:b w:val="0"/>
                 <w:i w:val="0"/>
                 <w:sz w:val="13"/>
               </w:rPr>
-              <w:t>4h (240 min) = 30 min × 8</w:t>
+              <w:t>4h (240 min) : Fanehoan-kevitra 20 min × 3 ; Vakiteny, Fiasan’ny teny, Asa an-tsoratra 30 min × 2 chacun</w:t>
             </w:r>
           </w:p>
         </w:tc>
@@ -615,6 +739,7 @@
             </w:pPr>
             <w:r>
               <w:rPr>
+                <w:rFonts w:ascii="Times New Roman" w:hAnsi="Times New Roman" w:cs="Times New Roman" w:eastAsia="Times New Roman"/>
                 <w:b/>
                 <w:i w:val="0"/>
                 <w:sz w:val="14"/>
@@ -635,11 +760,21 @@
             </w:pPr>
             <w:r>
               <w:rPr>
+                <w:rFonts w:ascii="Times New Roman" w:hAnsi="Times New Roman" w:cs="Times New Roman" w:eastAsia="Times New Roman"/>
                 <w:b w:val="0"/>
                 <w:i w:val="0"/>
                 <w:sz w:val="14"/>
               </w:rPr>
-              <w:t>Matematika 1/12</w:t>
+              <w:t>Matematika – Nombre</w:t>
+            </w:r>
+            <w:r>
+              <w:rPr>
+                <w:rFonts w:ascii="Times New Roman" w:hAnsi="Times New Roman" w:cs="Times New Roman" w:eastAsia="Times New Roman"/>
+                <w:b w:val="0"/>
+                <w:color w:val="999999"/>
+                <w:sz w:val="10"/>
+              </w:rPr>
+              <w:t xml:space="preserve"> 1/3</w:t>
             </w:r>
           </w:p>
         </w:tc>
@@ -655,11 +790,21 @@
             </w:pPr>
             <w:r>
               <w:rPr>
+                <w:rFonts w:ascii="Times New Roman" w:hAnsi="Times New Roman" w:cs="Times New Roman" w:eastAsia="Times New Roman"/>
                 <w:b w:val="0"/>
                 <w:i w:val="0"/>
                 <w:sz w:val="14"/>
               </w:rPr>
-              <w:t>Matematika 4/12</w:t>
+              <w:t>Matematika – Nombre</w:t>
+            </w:r>
+            <w:r>
+              <w:rPr>
+                <w:rFonts w:ascii="Times New Roman" w:hAnsi="Times New Roman" w:cs="Times New Roman" w:eastAsia="Times New Roman"/>
+                <w:b w:val="0"/>
+                <w:color w:val="999999"/>
+                <w:sz w:val="10"/>
+              </w:rPr>
+              <w:t xml:space="preserve"> 2/3</w:t>
             </w:r>
           </w:p>
         </w:tc>
@@ -675,11 +820,21 @@
             </w:pPr>
             <w:r>
               <w:rPr>
+                <w:rFonts w:ascii="Times New Roman" w:hAnsi="Times New Roman" w:cs="Times New Roman" w:eastAsia="Times New Roman"/>
                 <w:b w:val="0"/>
                 <w:i w:val="0"/>
                 <w:sz w:val="14"/>
               </w:rPr>
-              <w:t>Matematika 6/12</w:t>
+              <w:t>Matematika – Opération</w:t>
+            </w:r>
+            <w:r>
+              <w:rPr>
+                <w:rFonts w:ascii="Times New Roman" w:hAnsi="Times New Roman" w:cs="Times New Roman" w:eastAsia="Times New Roman"/>
+                <w:b w:val="0"/>
+                <w:color w:val="999999"/>
+                <w:sz w:val="10"/>
+              </w:rPr>
+              <w:t xml:space="preserve"> 2/3</w:t>
             </w:r>
           </w:p>
         </w:tc>
@@ -695,11 +850,21 @@
             </w:pPr>
             <w:r>
               <w:rPr>
+                <w:rFonts w:ascii="Times New Roman" w:hAnsi="Times New Roman" w:cs="Times New Roman" w:eastAsia="Times New Roman"/>
                 <w:b w:val="0"/>
                 <w:i w:val="0"/>
                 <w:sz w:val="14"/>
               </w:rPr>
-              <w:t>Matematika 9/12</w:t>
+              <w:t>Matematika – Nombre</w:t>
+            </w:r>
+            <w:r>
+              <w:rPr>
+                <w:rFonts w:ascii="Times New Roman" w:hAnsi="Times New Roman" w:cs="Times New Roman" w:eastAsia="Times New Roman"/>
+                <w:b w:val="0"/>
+                <w:color w:val="999999"/>
+                <w:sz w:val="10"/>
+              </w:rPr>
+              <w:t xml:space="preserve"> 3/3</w:t>
             </w:r>
           </w:p>
         </w:tc>
@@ -715,11 +880,21 @@
             </w:pPr>
             <w:r>
               <w:rPr>
+                <w:rFonts w:ascii="Times New Roman" w:hAnsi="Times New Roman" w:cs="Times New Roman" w:eastAsia="Times New Roman"/>
                 <w:b w:val="0"/>
                 <w:i w:val="0"/>
                 <w:sz w:val="14"/>
               </w:rPr>
-              <w:t>Matematika 11/12</w:t>
+              <w:t>Matematika – Opération</w:t>
+            </w:r>
+            <w:r>
+              <w:rPr>
+                <w:rFonts w:ascii="Times New Roman" w:hAnsi="Times New Roman" w:cs="Times New Roman" w:eastAsia="Times New Roman"/>
+                <w:b w:val="0"/>
+                <w:color w:val="999999"/>
+                <w:sz w:val="10"/>
+              </w:rPr>
+              <w:t xml:space="preserve"> 3/3</w:t>
             </w:r>
           </w:p>
         </w:tc>
@@ -742,6 +917,7 @@
             </w:pPr>
             <w:r>
               <w:rPr>
+                <w:rFonts w:ascii="Times New Roman" w:hAnsi="Times New Roman" w:cs="Times New Roman" w:eastAsia="Times New Roman"/>
                 <w:b w:val="0"/>
                 <w:i w:val="0"/>
                 <w:sz w:val="14"/>
@@ -762,11 +938,12 @@
             </w:pPr>
             <w:r>
               <w:rPr>
+                <w:rFonts w:ascii="Times New Roman" w:hAnsi="Times New Roman" w:cs="Times New Roman" w:eastAsia="Times New Roman"/>
                 <w:b w:val="0"/>
                 <w:i w:val="0"/>
                 <w:sz w:val="13"/>
               </w:rPr>
-              <w:t>5h (300 min) = 30 min × 10</w:t>
+              <w:t>5h (300 min) = 30 min × 10 (CO, CE, PO, Lecture-Fluidité, PE, FL)</w:t>
             </w:r>
           </w:p>
         </w:tc>
@@ -785,6 +962,7 @@
             </w:pPr>
             <w:r>
               <w:rPr>
+                <w:rFonts w:ascii="Times New Roman" w:hAnsi="Times New Roman" w:cs="Times New Roman" w:eastAsia="Times New Roman"/>
                 <w:b/>
                 <w:i w:val="0"/>
                 <w:sz w:val="14"/>
@@ -805,11 +983,21 @@
             </w:pPr>
             <w:r>
               <w:rPr>
+                <w:rFonts w:ascii="Times New Roman" w:hAnsi="Times New Roman" w:cs="Times New Roman" w:eastAsia="Times New Roman"/>
                 <w:b w:val="0"/>
                 <w:i w:val="0"/>
                 <w:sz w:val="14"/>
               </w:rPr>
-              <w:t>Français 1/10</w:t>
+              <w:t>Français – Compréhension orale</w:t>
+            </w:r>
+            <w:r>
+              <w:rPr>
+                <w:rFonts w:ascii="Times New Roman" w:hAnsi="Times New Roman" w:cs="Times New Roman" w:eastAsia="Times New Roman"/>
+                <w:b w:val="0"/>
+                <w:color w:val="999999"/>
+                <w:sz w:val="10"/>
+              </w:rPr>
+              <w:t xml:space="preserve"> 1/2</w:t>
             </w:r>
           </w:p>
         </w:tc>
@@ -825,11 +1013,21 @@
             </w:pPr>
             <w:r>
               <w:rPr>
+                <w:rFonts w:ascii="Times New Roman" w:hAnsi="Times New Roman" w:cs="Times New Roman" w:eastAsia="Times New Roman"/>
                 <w:b w:val="0"/>
                 <w:i w:val="0"/>
                 <w:sz w:val="14"/>
               </w:rPr>
-              <w:t>Français 3/10</w:t>
+              <w:t>Français – Production orale</w:t>
+            </w:r>
+            <w:r>
+              <w:rPr>
+                <w:rFonts w:ascii="Times New Roman" w:hAnsi="Times New Roman" w:cs="Times New Roman" w:eastAsia="Times New Roman"/>
+                <w:b w:val="0"/>
+                <w:color w:val="999999"/>
+                <w:sz w:val="10"/>
+              </w:rPr>
+              <w:t xml:space="preserve"> 1/1</w:t>
             </w:r>
           </w:p>
         </w:tc>
@@ -845,11 +1043,21 @@
             </w:pPr>
             <w:r>
               <w:rPr>
+                <w:rFonts w:ascii="Times New Roman" w:hAnsi="Times New Roman" w:cs="Times New Roman" w:eastAsia="Times New Roman"/>
                 <w:b w:val="0"/>
                 <w:i w:val="0"/>
                 <w:sz w:val="14"/>
               </w:rPr>
-              <w:t>Français 5/10</w:t>
+              <w:t>Français – Compréhension écrite</w:t>
+            </w:r>
+            <w:r>
+              <w:rPr>
+                <w:rFonts w:ascii="Times New Roman" w:hAnsi="Times New Roman" w:cs="Times New Roman" w:eastAsia="Times New Roman"/>
+                <w:b w:val="0"/>
+                <w:color w:val="999999"/>
+                <w:sz w:val="10"/>
+              </w:rPr>
+              <w:t xml:space="preserve"> 1/1</w:t>
             </w:r>
           </w:p>
         </w:tc>
@@ -865,11 +1073,21 @@
             </w:pPr>
             <w:r>
               <w:rPr>
+                <w:rFonts w:ascii="Times New Roman" w:hAnsi="Times New Roman" w:cs="Times New Roman" w:eastAsia="Times New Roman"/>
                 <w:b w:val="0"/>
                 <w:i w:val="0"/>
                 <w:sz w:val="14"/>
               </w:rPr>
-              <w:t>Français 7/10</w:t>
+              <w:t>Français – Lecture-Fluidité</w:t>
+            </w:r>
+            <w:r>
+              <w:rPr>
+                <w:rFonts w:ascii="Times New Roman" w:hAnsi="Times New Roman" w:cs="Times New Roman" w:eastAsia="Times New Roman"/>
+                <w:b w:val="0"/>
+                <w:color w:val="999999"/>
+                <w:sz w:val="10"/>
+              </w:rPr>
+              <w:t xml:space="preserve"> 1/2</w:t>
             </w:r>
           </w:p>
         </w:tc>
@@ -885,11 +1103,21 @@
             </w:pPr>
             <w:r>
               <w:rPr>
+                <w:rFonts w:ascii="Times New Roman" w:hAnsi="Times New Roman" w:cs="Times New Roman" w:eastAsia="Times New Roman"/>
                 <w:b w:val="0"/>
                 <w:i w:val="0"/>
                 <w:sz w:val="14"/>
               </w:rPr>
-              <w:t>Français 9/10</w:t>
+              <w:t>Français – Compréhension orale</w:t>
+            </w:r>
+            <w:r>
+              <w:rPr>
+                <w:rFonts w:ascii="Times New Roman" w:hAnsi="Times New Roman" w:cs="Times New Roman" w:eastAsia="Times New Roman"/>
+                <w:b w:val="0"/>
+                <w:color w:val="999999"/>
+                <w:sz w:val="10"/>
+              </w:rPr>
+              <w:t xml:space="preserve"> 2/2</w:t>
             </w:r>
           </w:p>
         </w:tc>
@@ -912,6 +1140,7 @@
             </w:pPr>
             <w:r>
               <w:rPr>
+                <w:rFonts w:ascii="Times New Roman" w:hAnsi="Times New Roman" w:cs="Times New Roman" w:eastAsia="Times New Roman"/>
                 <w:b w:val="0"/>
                 <w:i w:val="0"/>
                 <w:sz w:val="14"/>
@@ -932,11 +1161,12 @@
             </w:pPr>
             <w:r>
               <w:rPr>
+                <w:rFonts w:ascii="Times New Roman" w:hAnsi="Times New Roman" w:cs="Times New Roman" w:eastAsia="Times New Roman"/>
                 <w:b w:val="0"/>
                 <w:i w:val="0"/>
                 <w:sz w:val="13"/>
               </w:rPr>
-              <w:t>6h (360 min) = 30 min × 12</w:t>
+              <w:t>6h (360 min) = 30 min × 12 (Nombre, Opération, Algèbre, Géométrie, Mesure, Traitement de données)</w:t>
             </w:r>
           </w:p>
         </w:tc>
@@ -955,6 +1185,7 @@
             </w:pPr>
             <w:r>
               <w:rPr>
+                <w:rFonts w:ascii="Times New Roman" w:hAnsi="Times New Roman" w:cs="Times New Roman" w:eastAsia="Times New Roman"/>
                 <w:b/>
                 <w:i w:val="0"/>
                 <w:sz w:val="14"/>
@@ -975,11 +1206,21 @@
             </w:pPr>
             <w:r>
               <w:rPr>
+                <w:rFonts w:ascii="Times New Roman" w:hAnsi="Times New Roman" w:cs="Times New Roman" w:eastAsia="Times New Roman"/>
                 <w:b w:val="0"/>
                 <w:i w:val="0"/>
                 <w:sz w:val="14"/>
               </w:rPr>
-              <w:t>Matematika 2/12</w:t>
+              <w:t>Matematika – Opération</w:t>
+            </w:r>
+            <w:r>
+              <w:rPr>
+                <w:rFonts w:ascii="Times New Roman" w:hAnsi="Times New Roman" w:cs="Times New Roman" w:eastAsia="Times New Roman"/>
+                <w:b w:val="0"/>
+                <w:color w:val="999999"/>
+                <w:sz w:val="10"/>
+              </w:rPr>
+              <w:t xml:space="preserve"> 1/3</w:t>
             </w:r>
           </w:p>
         </w:tc>
@@ -995,11 +1236,21 @@
             </w:pPr>
             <w:r>
               <w:rPr>
+                <w:rFonts w:ascii="Times New Roman" w:hAnsi="Times New Roman" w:cs="Times New Roman" w:eastAsia="Times New Roman"/>
                 <w:b w:val="0"/>
                 <w:i w:val="0"/>
                 <w:sz w:val="14"/>
               </w:rPr>
-              <w:t>Géographie 1/2</w:t>
+              <w:t>Géographie</w:t>
+            </w:r>
+            <w:r>
+              <w:rPr>
+                <w:rFonts w:ascii="Times New Roman" w:hAnsi="Times New Roman" w:cs="Times New Roman" w:eastAsia="Times New Roman"/>
+                <w:b w:val="0"/>
+                <w:color w:val="999999"/>
+                <w:sz w:val="10"/>
+              </w:rPr>
+              <w:t xml:space="preserve"> 1/2</w:t>
             </w:r>
           </w:p>
         </w:tc>
@@ -1015,11 +1266,21 @@
             </w:pPr>
             <w:r>
               <w:rPr>
+                <w:rFonts w:ascii="Times New Roman" w:hAnsi="Times New Roman" w:cs="Times New Roman" w:eastAsia="Times New Roman"/>
                 <w:b w:val="0"/>
                 <w:i w:val="0"/>
                 <w:sz w:val="14"/>
               </w:rPr>
-              <w:t>Matematika 7/12</w:t>
+              <w:t>Matematika – Algèbre</w:t>
+            </w:r>
+            <w:r>
+              <w:rPr>
+                <w:rFonts w:ascii="Times New Roman" w:hAnsi="Times New Roman" w:cs="Times New Roman" w:eastAsia="Times New Roman"/>
+                <w:b w:val="0"/>
+                <w:color w:val="999999"/>
+                <w:sz w:val="10"/>
+              </w:rPr>
+              <w:t xml:space="preserve"> 1/1</w:t>
             </w:r>
           </w:p>
         </w:tc>
@@ -1035,11 +1296,21 @@
             </w:pPr>
             <w:r>
               <w:rPr>
+                <w:rFonts w:ascii="Times New Roman" w:hAnsi="Times New Roman" w:cs="Times New Roman" w:eastAsia="Times New Roman"/>
                 <w:b w:val="0"/>
                 <w:i w:val="0"/>
                 <w:sz w:val="14"/>
               </w:rPr>
-              <w:t>Tantara 2/2</w:t>
+              <w:t>Tantara</w:t>
+            </w:r>
+            <w:r>
+              <w:rPr>
+                <w:rFonts w:ascii="Times New Roman" w:hAnsi="Times New Roman" w:cs="Times New Roman" w:eastAsia="Times New Roman"/>
+                <w:b w:val="0"/>
+                <w:color w:val="999999"/>
+                <w:sz w:val="10"/>
+              </w:rPr>
+              <w:t xml:space="preserve"> 1/2</w:t>
             </w:r>
           </w:p>
         </w:tc>
@@ -1055,11 +1326,21 @@
             </w:pPr>
             <w:r>
               <w:rPr>
+                <w:rFonts w:ascii="Times New Roman" w:hAnsi="Times New Roman" w:cs="Times New Roman" w:eastAsia="Times New Roman"/>
                 <w:b w:val="0"/>
                 <w:i w:val="0"/>
                 <w:sz w:val="14"/>
               </w:rPr>
-              <w:t>Géographie 2/2</w:t>
+              <w:t>Géographie</w:t>
+            </w:r>
+            <w:r>
+              <w:rPr>
+                <w:rFonts w:ascii="Times New Roman" w:hAnsi="Times New Roman" w:cs="Times New Roman" w:eastAsia="Times New Roman"/>
+                <w:b w:val="0"/>
+                <w:color w:val="999999"/>
+                <w:sz w:val="10"/>
+              </w:rPr>
+              <w:t xml:space="preserve"> 2/2</w:t>
             </w:r>
           </w:p>
         </w:tc>
@@ -1082,6 +1363,7 @@
             </w:pPr>
             <w:r>
               <w:rPr>
+                <w:rFonts w:ascii="Times New Roman" w:hAnsi="Times New Roman" w:cs="Times New Roman" w:eastAsia="Times New Roman"/>
                 <w:b w:val="0"/>
                 <w:i w:val="0"/>
                 <w:sz w:val="14"/>
@@ -1102,6 +1384,7 @@
             </w:pPr>
             <w:r>
               <w:rPr>
+                <w:rFonts w:ascii="Times New Roman" w:hAnsi="Times New Roman" w:cs="Times New Roman" w:eastAsia="Times New Roman"/>
                 <w:b w:val="0"/>
                 <w:i w:val="0"/>
                 <w:sz w:val="13"/>
@@ -1125,6 +1408,7 @@
             </w:pPr>
             <w:r>
               <w:rPr>
+                <w:rFonts w:ascii="Times New Roman" w:hAnsi="Times New Roman" w:cs="Times New Roman" w:eastAsia="Times New Roman"/>
                 <w:b/>
                 <w:i w:val="0"/>
                 <w:sz w:val="14"/>
@@ -1145,11 +1429,21 @@
             </w:pPr>
             <w:r>
               <w:rPr>
+                <w:rFonts w:ascii="Times New Roman" w:hAnsi="Times New Roman" w:cs="Times New Roman" w:eastAsia="Times New Roman"/>
                 <w:b w:val="0"/>
                 <w:i w:val="0"/>
                 <w:sz w:val="14"/>
               </w:rPr>
-              <w:t>Anglais 1/3</w:t>
+              <w:t>Fanehoan-kevitra am-bava</w:t>
+            </w:r>
+            <w:r>
+              <w:rPr>
+                <w:rFonts w:ascii="Times New Roman" w:hAnsi="Times New Roman" w:cs="Times New Roman" w:eastAsia="Times New Roman"/>
+                <w:b w:val="0"/>
+                <w:color w:val="999999"/>
+                <w:sz w:val="10"/>
+              </w:rPr>
+              <w:t xml:space="preserve"> 1/3</w:t>
             </w:r>
           </w:p>
         </w:tc>
@@ -1165,11 +1459,21 @@
             </w:pPr>
             <w:r>
               <w:rPr>
+                <w:rFonts w:ascii="Times New Roman" w:hAnsi="Times New Roman" w:cs="Times New Roman" w:eastAsia="Times New Roman"/>
                 <w:b w:val="0"/>
                 <w:i w:val="0"/>
                 <w:sz w:val="14"/>
               </w:rPr>
-              <w:t>FOV 1/4</w:t>
+              <w:t>Anglais</w:t>
+            </w:r>
+            <w:r>
+              <w:rPr>
+                <w:rFonts w:ascii="Times New Roman" w:hAnsi="Times New Roman" w:cs="Times New Roman" w:eastAsia="Times New Roman"/>
+                <w:b w:val="0"/>
+                <w:color w:val="999999"/>
+                <w:sz w:val="10"/>
+              </w:rPr>
+              <w:t xml:space="preserve"> 1/3</w:t>
             </w:r>
           </w:p>
         </w:tc>
@@ -1185,11 +1489,21 @@
             </w:pPr>
             <w:r>
               <w:rPr>
+                <w:rFonts w:ascii="Times New Roman" w:hAnsi="Times New Roman" w:cs="Times New Roman" w:eastAsia="Times New Roman"/>
                 <w:b w:val="0"/>
                 <w:i w:val="0"/>
                 <w:sz w:val="14"/>
               </w:rPr>
-              <w:t>Anglais 2/3</w:t>
+              <w:t>Fanehoan-kevitra am-bava</w:t>
+            </w:r>
+            <w:r>
+              <w:rPr>
+                <w:rFonts w:ascii="Times New Roman" w:hAnsi="Times New Roman" w:cs="Times New Roman" w:eastAsia="Times New Roman"/>
+                <w:b w:val="0"/>
+                <w:color w:val="999999"/>
+                <w:sz w:val="10"/>
+              </w:rPr>
+              <w:t xml:space="preserve"> 2/3</w:t>
             </w:r>
           </w:p>
         </w:tc>
@@ -1205,11 +1519,21 @@
             </w:pPr>
             <w:r>
               <w:rPr>
+                <w:rFonts w:ascii="Times New Roman" w:hAnsi="Times New Roman" w:cs="Times New Roman" w:eastAsia="Times New Roman"/>
                 <w:b w:val="0"/>
                 <w:i w:val="0"/>
                 <w:sz w:val="14"/>
               </w:rPr>
-              <w:t>FOV 4/4</w:t>
+              <w:t>Anglais</w:t>
+            </w:r>
+            <w:r>
+              <w:rPr>
+                <w:rFonts w:ascii="Times New Roman" w:hAnsi="Times New Roman" w:cs="Times New Roman" w:eastAsia="Times New Roman"/>
+                <w:b w:val="0"/>
+                <w:color w:val="999999"/>
+                <w:sz w:val="10"/>
+              </w:rPr>
+              <w:t xml:space="preserve"> 2/3</w:t>
             </w:r>
           </w:p>
         </w:tc>
@@ -1225,11 +1549,21 @@
             </w:pPr>
             <w:r>
               <w:rPr>
+                <w:rFonts w:ascii="Times New Roman" w:hAnsi="Times New Roman" w:cs="Times New Roman" w:eastAsia="Times New Roman"/>
                 <w:b w:val="0"/>
                 <w:i w:val="0"/>
                 <w:sz w:val="14"/>
               </w:rPr>
-              <w:t>Anglais 3/3</w:t>
+              <w:t>Fanehoan-kevitra am-bava</w:t>
+            </w:r>
+            <w:r>
+              <w:rPr>
+                <w:rFonts w:ascii="Times New Roman" w:hAnsi="Times New Roman" w:cs="Times New Roman" w:eastAsia="Times New Roman"/>
+                <w:b w:val="0"/>
+                <w:color w:val="999999"/>
+                <w:sz w:val="10"/>
+              </w:rPr>
+              <w:t xml:space="preserve"> 3/3</w:t>
             </w:r>
           </w:p>
         </w:tc>
@@ -1252,6 +1586,7 @@
             </w:pPr>
             <w:r>
               <w:rPr>
+                <w:rFonts w:ascii="Times New Roman" w:hAnsi="Times New Roman" w:cs="Times New Roman" w:eastAsia="Times New Roman"/>
                 <w:b w:val="0"/>
                 <w:i w:val="0"/>
                 <w:sz w:val="14"/>
@@ -1272,6 +1607,7 @@
             </w:pPr>
             <w:r>
               <w:rPr>
+                <w:rFonts w:ascii="Times New Roman" w:hAnsi="Times New Roman" w:cs="Times New Roman" w:eastAsia="Times New Roman"/>
                 <w:b w:val="0"/>
                 <w:i w:val="0"/>
                 <w:sz w:val="13"/>
@@ -1295,6 +1631,7 @@
             </w:pPr>
             <w:r>
               <w:rPr>
+                <w:rFonts w:ascii="Times New Roman" w:hAnsi="Times New Roman" w:cs="Times New Roman" w:eastAsia="Times New Roman"/>
                 <w:b/>
                 <w:i w:val="0"/>
                 <w:sz w:val="14"/>
@@ -1316,6 +1653,7 @@
             </w:pPr>
             <w:r>
               <w:rPr>
+                <w:rFonts w:ascii="Times New Roman" w:hAnsi="Times New Roman" w:cs="Times New Roman" w:eastAsia="Times New Roman"/>
                 <w:b/>
                 <w:i w:val="0"/>
                 <w:sz w:val="14"/>
@@ -1337,6 +1675,7 @@
             </w:pPr>
             <w:r>
               <w:rPr>
+                <w:rFonts w:ascii="Times New Roman" w:hAnsi="Times New Roman" w:cs="Times New Roman" w:eastAsia="Times New Roman"/>
                 <w:b/>
                 <w:i w:val="0"/>
                 <w:sz w:val="14"/>
@@ -1358,6 +1697,7 @@
             </w:pPr>
             <w:r>
               <w:rPr>
+                <w:rFonts w:ascii="Times New Roman" w:hAnsi="Times New Roman" w:cs="Times New Roman" w:eastAsia="Times New Roman"/>
                 <w:b/>
                 <w:i w:val="0"/>
                 <w:sz w:val="14"/>
@@ -1379,6 +1719,7 @@
             </w:pPr>
             <w:r>
               <w:rPr>
+                <w:rFonts w:ascii="Times New Roman" w:hAnsi="Times New Roman" w:cs="Times New Roman" w:eastAsia="Times New Roman"/>
                 <w:b/>
                 <w:i w:val="0"/>
                 <w:sz w:val="14"/>
@@ -1400,6 +1741,7 @@
             </w:pPr>
             <w:r>
               <w:rPr>
+                <w:rFonts w:ascii="Times New Roman" w:hAnsi="Times New Roman" w:cs="Times New Roman" w:eastAsia="Times New Roman"/>
                 <w:b/>
                 <w:i w:val="0"/>
                 <w:sz w:val="14"/>
@@ -1427,6 +1769,7 @@
             </w:pPr>
             <w:r>
               <w:rPr>
+                <w:rFonts w:ascii="Times New Roman" w:hAnsi="Times New Roman" w:cs="Times New Roman" w:eastAsia="Times New Roman"/>
                 <w:b w:val="0"/>
                 <w:i w:val="0"/>
                 <w:sz w:val="14"/>
@@ -1447,6 +1790,7 @@
             </w:pPr>
             <w:r>
               <w:rPr>
+                <w:rFonts w:ascii="Times New Roman" w:hAnsi="Times New Roman" w:cs="Times New Roman" w:eastAsia="Times New Roman"/>
                 <w:b w:val="0"/>
                 <w:i w:val="0"/>
                 <w:sz w:val="13"/>
@@ -1470,6 +1814,7 @@
             </w:pPr>
             <w:r>
               <w:rPr>
+                <w:rFonts w:ascii="Times New Roman" w:hAnsi="Times New Roman" w:cs="Times New Roman" w:eastAsia="Times New Roman"/>
                 <w:b/>
                 <w:i w:val="0"/>
                 <w:sz w:val="14"/>
@@ -1490,11 +1835,21 @@
             </w:pPr>
             <w:r>
               <w:rPr>
+                <w:rFonts w:ascii="Times New Roman" w:hAnsi="Times New Roman" w:cs="Times New Roman" w:eastAsia="Times New Roman"/>
                 <w:b w:val="0"/>
                 <w:i w:val="0"/>
                 <w:sz w:val="14"/>
               </w:rPr>
-              <w:t>Français 2/10</w:t>
+              <w:t>Français – Fonct. de la langue</w:t>
+            </w:r>
+            <w:r>
+              <w:rPr>
+                <w:rFonts w:ascii="Times New Roman" w:hAnsi="Times New Roman" w:cs="Times New Roman" w:eastAsia="Times New Roman"/>
+                <w:b w:val="0"/>
+                <w:color w:val="999999"/>
+                <w:sz w:val="10"/>
+              </w:rPr>
+              <w:t xml:space="preserve"> 1/2</w:t>
             </w:r>
           </w:p>
         </w:tc>
@@ -1510,11 +1865,21 @@
             </w:pPr>
             <w:r>
               <w:rPr>
+                <w:rFonts w:ascii="Times New Roman" w:hAnsi="Times New Roman" w:cs="Times New Roman" w:eastAsia="Times New Roman"/>
                 <w:b w:val="0"/>
                 <w:i w:val="0"/>
                 <w:sz w:val="14"/>
               </w:rPr>
-              <w:t>Matematika 5/12</w:t>
+              <w:t>Matematika – Mesure</w:t>
+            </w:r>
+            <w:r>
+              <w:rPr>
+                <w:rFonts w:ascii="Times New Roman" w:hAnsi="Times New Roman" w:cs="Times New Roman" w:eastAsia="Times New Roman"/>
+                <w:b w:val="0"/>
+                <w:color w:val="999999"/>
+                <w:sz w:val="10"/>
+              </w:rPr>
+              <w:t xml:space="preserve"> 1/2</w:t>
             </w:r>
           </w:p>
         </w:tc>
@@ -1530,11 +1895,21 @@
             </w:pPr>
             <w:r>
               <w:rPr>
+                <w:rFonts w:ascii="Times New Roman" w:hAnsi="Times New Roman" w:cs="Times New Roman" w:eastAsia="Times New Roman"/>
                 <w:b w:val="0"/>
                 <w:i w:val="0"/>
                 <w:sz w:val="14"/>
               </w:rPr>
-              <w:t>Français 6/10</w:t>
+              <w:t>Français – Fonct. de la langue</w:t>
+            </w:r>
+            <w:r>
+              <w:rPr>
+                <w:rFonts w:ascii="Times New Roman" w:hAnsi="Times New Roman" w:cs="Times New Roman" w:eastAsia="Times New Roman"/>
+                <w:b w:val="0"/>
+                <w:color w:val="999999"/>
+                <w:sz w:val="10"/>
+              </w:rPr>
+              <w:t xml:space="preserve"> 2/2</w:t>
             </w:r>
           </w:p>
         </w:tc>
@@ -1550,11 +1925,21 @@
             </w:pPr>
             <w:r>
               <w:rPr>
+                <w:rFonts w:ascii="Times New Roman" w:hAnsi="Times New Roman" w:cs="Times New Roman" w:eastAsia="Times New Roman"/>
                 <w:b w:val="0"/>
                 <w:i w:val="0"/>
                 <w:sz w:val="14"/>
               </w:rPr>
-              <w:t>Matematika 10/12</w:t>
+              <w:t>Matematika – Mesure</w:t>
+            </w:r>
+            <w:r>
+              <w:rPr>
+                <w:rFonts w:ascii="Times New Roman" w:hAnsi="Times New Roman" w:cs="Times New Roman" w:eastAsia="Times New Roman"/>
+                <w:b w:val="0"/>
+                <w:color w:val="999999"/>
+                <w:sz w:val="10"/>
+              </w:rPr>
+              <w:t xml:space="preserve"> 2/2</w:t>
             </w:r>
           </w:p>
         </w:tc>
@@ -1570,11 +1955,21 @@
             </w:pPr>
             <w:r>
               <w:rPr>
+                <w:rFonts w:ascii="Times New Roman" w:hAnsi="Times New Roman" w:cs="Times New Roman" w:eastAsia="Times New Roman"/>
                 <w:b w:val="0"/>
                 <w:i w:val="0"/>
                 <w:sz w:val="14"/>
               </w:rPr>
-              <w:t>Français 10/10</w:t>
+              <w:t>Français – Lecture-Fluidité</w:t>
+            </w:r>
+            <w:r>
+              <w:rPr>
+                <w:rFonts w:ascii="Times New Roman" w:hAnsi="Times New Roman" w:cs="Times New Roman" w:eastAsia="Times New Roman"/>
+                <w:b w:val="0"/>
+                <w:color w:val="999999"/>
+                <w:sz w:val="10"/>
+              </w:rPr>
+              <w:t xml:space="preserve"> 2/2</w:t>
             </w:r>
           </w:p>
         </w:tc>
@@ -1597,6 +1992,7 @@
             </w:pPr>
             <w:r>
               <w:rPr>
+                <w:rFonts w:ascii="Times New Roman" w:hAnsi="Times New Roman" w:cs="Times New Roman" w:eastAsia="Times New Roman"/>
                 <w:b w:val="0"/>
                 <w:i w:val="0"/>
                 <w:sz w:val="14"/>
@@ -1617,6 +2013,7 @@
             </w:pPr>
             <w:r>
               <w:rPr>
+                <w:rFonts w:ascii="Times New Roman" w:hAnsi="Times New Roman" w:cs="Times New Roman" w:eastAsia="Times New Roman"/>
                 <w:b w:val="0"/>
                 <w:i w:val="0"/>
                 <w:sz w:val="13"/>
@@ -1640,6 +2037,7 @@
             </w:pPr>
             <w:r>
               <w:rPr>
+                <w:rFonts w:ascii="Times New Roman" w:hAnsi="Times New Roman" w:cs="Times New Roman" w:eastAsia="Times New Roman"/>
                 <w:b/>
                 <w:i w:val="0"/>
                 <w:sz w:val="14"/>
@@ -1660,11 +2058,21 @@
             </w:pPr>
             <w:r>
               <w:rPr>
+                <w:rFonts w:ascii="Times New Roman" w:hAnsi="Times New Roman" w:cs="Times New Roman" w:eastAsia="Times New Roman"/>
                 <w:b w:val="0"/>
                 <w:i w:val="0"/>
                 <w:sz w:val="14"/>
               </w:rPr>
-              <w:t>Tantara 1/2</w:t>
+              <w:t>Tantara</w:t>
+            </w:r>
+            <w:r>
+              <w:rPr>
+                <w:rFonts w:ascii="Times New Roman" w:hAnsi="Times New Roman" w:cs="Times New Roman" w:eastAsia="Times New Roman"/>
+                <w:b w:val="0"/>
+                <w:color w:val="999999"/>
+                <w:sz w:val="10"/>
+              </w:rPr>
+              <w:t xml:space="preserve"> 2/2</w:t>
             </w:r>
           </w:p>
         </w:tc>
@@ -1680,11 +2088,21 @@
             </w:pPr>
             <w:r>
               <w:rPr>
+                <w:rFonts w:ascii="Times New Roman" w:hAnsi="Times New Roman" w:cs="Times New Roman" w:eastAsia="Times New Roman"/>
                 <w:b w:val="0"/>
                 <w:i w:val="0"/>
                 <w:sz w:val="14"/>
               </w:rPr>
-              <w:t>Français 4/10</w:t>
+              <w:t>Français – Production écrite</w:t>
+            </w:r>
+            <w:r>
+              <w:rPr>
+                <w:rFonts w:ascii="Times New Roman" w:hAnsi="Times New Roman" w:cs="Times New Roman" w:eastAsia="Times New Roman"/>
+                <w:b w:val="0"/>
+                <w:color w:val="999999"/>
+                <w:sz w:val="10"/>
+              </w:rPr>
+              <w:t xml:space="preserve"> 1/2</w:t>
             </w:r>
           </w:p>
         </w:tc>
@@ -1700,11 +2118,21 @@
             </w:pPr>
             <w:r>
               <w:rPr>
+                <w:rFonts w:ascii="Times New Roman" w:hAnsi="Times New Roman" w:cs="Times New Roman" w:eastAsia="Times New Roman"/>
                 <w:b w:val="0"/>
                 <w:i w:val="0"/>
                 <w:sz w:val="14"/>
               </w:rPr>
-              <w:t>FOV 2/4</w:t>
+              <w:t>FOV</w:t>
+            </w:r>
+            <w:r>
+              <w:rPr>
+                <w:rFonts w:ascii="Times New Roman" w:hAnsi="Times New Roman" w:cs="Times New Roman" w:eastAsia="Times New Roman"/>
+                <w:b w:val="0"/>
+                <w:color w:val="999999"/>
+                <w:sz w:val="10"/>
+              </w:rPr>
+              <w:t xml:space="preserve"> 2/3</w:t>
             </w:r>
           </w:p>
         </w:tc>
@@ -1720,11 +2148,21 @@
             </w:pPr>
             <w:r>
               <w:rPr>
+                <w:rFonts w:ascii="Times New Roman" w:hAnsi="Times New Roman" w:cs="Times New Roman" w:eastAsia="Times New Roman"/>
                 <w:b w:val="0"/>
                 <w:i w:val="0"/>
                 <w:sz w:val="14"/>
               </w:rPr>
-              <w:t>Français 8/10</w:t>
+              <w:t>Français – Production écrite</w:t>
+            </w:r>
+            <w:r>
+              <w:rPr>
+                <w:rFonts w:ascii="Times New Roman" w:hAnsi="Times New Roman" w:cs="Times New Roman" w:eastAsia="Times New Roman"/>
+                <w:b w:val="0"/>
+                <w:color w:val="999999"/>
+                <w:sz w:val="10"/>
+              </w:rPr>
+              <w:t xml:space="preserve"> 2/2</w:t>
             </w:r>
           </w:p>
         </w:tc>
@@ -1740,11 +2178,21 @@
             </w:pPr>
             <w:r>
               <w:rPr>
+                <w:rFonts w:ascii="Times New Roman" w:hAnsi="Times New Roman" w:cs="Times New Roman" w:eastAsia="Times New Roman"/>
                 <w:b w:val="0"/>
                 <w:i w:val="0"/>
                 <w:sz w:val="14"/>
               </w:rPr>
-              <w:t>Sciences et Technologie 5/6</w:t>
+              <w:t>Sciences et Technologie</w:t>
+            </w:r>
+            <w:r>
+              <w:rPr>
+                <w:rFonts w:ascii="Times New Roman" w:hAnsi="Times New Roman" w:cs="Times New Roman" w:eastAsia="Times New Roman"/>
+                <w:b w:val="0"/>
+                <w:color w:val="999999"/>
+                <w:sz w:val="10"/>
+              </w:rPr>
+              <w:t xml:space="preserve"> 5/6</w:t>
             </w:r>
           </w:p>
         </w:tc>
@@ -1767,6 +2215,7 @@
             </w:pPr>
             <w:r>
               <w:rPr>
+                <w:rFonts w:ascii="Times New Roman" w:hAnsi="Times New Roman" w:cs="Times New Roman" w:eastAsia="Times New Roman"/>
                 <w:b w:val="0"/>
                 <w:i w:val="0"/>
                 <w:sz w:val="14"/>
@@ -1787,11 +2236,12 @@
             </w:pPr>
             <w:r>
               <w:rPr>
+                <w:rFonts w:ascii="Times New Roman" w:hAnsi="Times New Roman" w:cs="Times New Roman" w:eastAsia="Times New Roman"/>
                 <w:b w:val="0"/>
                 <w:i w:val="0"/>
                 <w:sz w:val="13"/>
               </w:rPr>
-              <w:t>1h 30 min (90 min) = 30 min × 1 + 20 min × 3</w:t>
+              <w:t>1h 30 min (90 min) = 30 min × 3</w:t>
             </w:r>
           </w:p>
         </w:tc>
@@ -1810,6 +2260,7 @@
             </w:pPr>
             <w:r>
               <w:rPr>
+                <w:rFonts w:ascii="Times New Roman" w:hAnsi="Times New Roman" w:cs="Times New Roman" w:eastAsia="Times New Roman"/>
                 <w:b/>
                 <w:i w:val="0"/>
                 <w:sz w:val="14"/>
@@ -1830,11 +2281,21 @@
             </w:pPr>
             <w:r>
               <w:rPr>
+                <w:rFonts w:ascii="Times New Roman" w:hAnsi="Times New Roman" w:cs="Times New Roman" w:eastAsia="Times New Roman"/>
                 <w:b w:val="0"/>
                 <w:i w:val="0"/>
                 <w:sz w:val="14"/>
               </w:rPr>
-              <w:t>Matematika 3/12</w:t>
+              <w:t>Matematika – Géométrie</w:t>
+            </w:r>
+            <w:r>
+              <w:rPr>
+                <w:rFonts w:ascii="Times New Roman" w:hAnsi="Times New Roman" w:cs="Times New Roman" w:eastAsia="Times New Roman"/>
+                <w:b w:val="0"/>
+                <w:color w:val="999999"/>
+                <w:sz w:val="10"/>
+              </w:rPr>
+              <w:t xml:space="preserve"> 1/2</w:t>
             </w:r>
           </w:p>
         </w:tc>
@@ -1850,11 +2311,21 @@
             </w:pPr>
             <w:r>
               <w:rPr>
+                <w:rFonts w:ascii="Times New Roman" w:hAnsi="Times New Roman" w:cs="Times New Roman" w:eastAsia="Times New Roman"/>
                 <w:b w:val="0"/>
                 <w:i w:val="0"/>
                 <w:sz w:val="14"/>
               </w:rPr>
-              <w:t>Sciences et Technologie 2/6</w:t>
+              <w:t>Sciences et Technologie</w:t>
+            </w:r>
+            <w:r>
+              <w:rPr>
+                <w:rFonts w:ascii="Times New Roman" w:hAnsi="Times New Roman" w:cs="Times New Roman" w:eastAsia="Times New Roman"/>
+                <w:b w:val="0"/>
+                <w:color w:val="999999"/>
+                <w:sz w:val="10"/>
+              </w:rPr>
+              <w:t xml:space="preserve"> 2/6</w:t>
             </w:r>
           </w:p>
         </w:tc>
@@ -1870,11 +2341,21 @@
             </w:pPr>
             <w:r>
               <w:rPr>
+                <w:rFonts w:ascii="Times New Roman" w:hAnsi="Times New Roman" w:cs="Times New Roman" w:eastAsia="Times New Roman"/>
                 <w:b w:val="0"/>
                 <w:i w:val="0"/>
                 <w:sz w:val="14"/>
               </w:rPr>
-              <w:t>Sciences et Technologie 3/6</w:t>
+              <w:t>Sciences et Technologie</w:t>
+            </w:r>
+            <w:r>
+              <w:rPr>
+                <w:rFonts w:ascii="Times New Roman" w:hAnsi="Times New Roman" w:cs="Times New Roman" w:eastAsia="Times New Roman"/>
+                <w:b w:val="0"/>
+                <w:color w:val="999999"/>
+                <w:sz w:val="10"/>
+              </w:rPr>
+              <w:t xml:space="preserve"> 3/6</w:t>
             </w:r>
           </w:p>
         </w:tc>
@@ -1890,11 +2371,21 @@
             </w:pPr>
             <w:r>
               <w:rPr>
+                <w:rFonts w:ascii="Times New Roman" w:hAnsi="Times New Roman" w:cs="Times New Roman" w:eastAsia="Times New Roman"/>
                 <w:b w:val="0"/>
                 <w:i w:val="0"/>
                 <w:sz w:val="14"/>
               </w:rPr>
-              <w:t>Sciences et Technologie 4/6</w:t>
+              <w:t>Sciences et Technologie</w:t>
+            </w:r>
+            <w:r>
+              <w:rPr>
+                <w:rFonts w:ascii="Times New Roman" w:hAnsi="Times New Roman" w:cs="Times New Roman" w:eastAsia="Times New Roman"/>
+                <w:b w:val="0"/>
+                <w:color w:val="999999"/>
+                <w:sz w:val="10"/>
+              </w:rPr>
+              <w:t xml:space="preserve"> 4/6</w:t>
             </w:r>
           </w:p>
         </w:tc>
@@ -1910,11 +2401,21 @@
             </w:pPr>
             <w:r>
               <w:rPr>
+                <w:rFonts w:ascii="Times New Roman" w:hAnsi="Times New Roman" w:cs="Times New Roman" w:eastAsia="Times New Roman"/>
                 <w:b w:val="0"/>
                 <w:i w:val="0"/>
                 <w:sz w:val="14"/>
               </w:rPr>
-              <w:t>Matematika 12/12</w:t>
+              <w:t>Matematika – Trait. de données</w:t>
+            </w:r>
+            <w:r>
+              <w:rPr>
+                <w:rFonts w:ascii="Times New Roman" w:hAnsi="Times New Roman" w:cs="Times New Roman" w:eastAsia="Times New Roman"/>
+                <w:b w:val="0"/>
+                <w:color w:val="999999"/>
+                <w:sz w:val="10"/>
+              </w:rPr>
+              <w:t xml:space="preserve"> 1/1</w:t>
             </w:r>
           </w:p>
         </w:tc>
@@ -1937,6 +2438,7 @@
             </w:pPr>
             <w:r>
               <w:rPr>
+                <w:rFonts w:ascii="Times New Roman" w:hAnsi="Times New Roman" w:cs="Times New Roman" w:eastAsia="Times New Roman"/>
                 <w:b w:val="0"/>
                 <w:i w:val="0"/>
                 <w:sz w:val="14"/>
@@ -1957,11 +2459,12 @@
             </w:pPr>
             <w:r>
               <w:rPr>
+                <w:rFonts w:ascii="Times New Roman" w:hAnsi="Times New Roman" w:cs="Times New Roman" w:eastAsia="Times New Roman"/>
                 <w:b w:val="0"/>
                 <w:i w:val="0"/>
                 <w:sz w:val="13"/>
               </w:rPr>
-              <w:t>1h 20 min (80 min) = 20 min × 4</w:t>
+              <w:t>1h 20 min (80 min) = 20 min × 4 (Arts visuels, Musique, Danse, Arts dramatiques)</w:t>
             </w:r>
           </w:p>
         </w:tc>
@@ -1980,6 +2483,7 @@
             </w:pPr>
             <w:r>
               <w:rPr>
+                <w:rFonts w:ascii="Times New Roman" w:hAnsi="Times New Roman" w:cs="Times New Roman" w:eastAsia="Times New Roman"/>
                 <w:b/>
                 <w:i w:val="0"/>
                 <w:sz w:val="14"/>
@@ -2000,11 +2504,21 @@
             </w:pPr>
             <w:r>
               <w:rPr>
+                <w:rFonts w:ascii="Times New Roman" w:hAnsi="Times New Roman" w:cs="Times New Roman" w:eastAsia="Times New Roman"/>
                 <w:b w:val="0"/>
                 <w:i w:val="0"/>
                 <w:sz w:val="14"/>
               </w:rPr>
-              <w:t>Sciences et Technologie 1/6</w:t>
+              <w:t>Sciences et Technologie</w:t>
+            </w:r>
+            <w:r>
+              <w:rPr>
+                <w:rFonts w:ascii="Times New Roman" w:hAnsi="Times New Roman" w:cs="Times New Roman" w:eastAsia="Times New Roman"/>
+                <w:b w:val="0"/>
+                <w:color w:val="999999"/>
+                <w:sz w:val="10"/>
+              </w:rPr>
+              <w:t xml:space="preserve"> 1/6</w:t>
             </w:r>
           </w:p>
         </w:tc>
@@ -2020,11 +2534,21 @@
             </w:pPr>
             <w:r>
               <w:rPr>
+                <w:rFonts w:ascii="Times New Roman" w:hAnsi="Times New Roman" w:cs="Times New Roman" w:eastAsia="Times New Roman"/>
                 <w:b w:val="0"/>
                 <w:i w:val="0"/>
                 <w:sz w:val="14"/>
               </w:rPr>
-              <w:t>EPS 1/4</w:t>
+              <w:t>FOV</w:t>
+            </w:r>
+            <w:r>
+              <w:rPr>
+                <w:rFonts w:ascii="Times New Roman" w:hAnsi="Times New Roman" w:cs="Times New Roman" w:eastAsia="Times New Roman"/>
+                <w:b w:val="0"/>
+                <w:color w:val="999999"/>
+                <w:sz w:val="10"/>
+              </w:rPr>
+              <w:t xml:space="preserve"> 1/3</w:t>
             </w:r>
           </w:p>
         </w:tc>
@@ -2040,11 +2564,21 @@
             </w:pPr>
             <w:r>
               <w:rPr>
+                <w:rFonts w:ascii="Times New Roman" w:hAnsi="Times New Roman" w:cs="Times New Roman" w:eastAsia="Times New Roman"/>
                 <w:b w:val="0"/>
                 <w:i w:val="0"/>
                 <w:sz w:val="14"/>
               </w:rPr>
-              <w:t>Matematika 8/12</w:t>
+              <w:t>Matematika – Géométrie</w:t>
+            </w:r>
+            <w:r>
+              <w:rPr>
+                <w:rFonts w:ascii="Times New Roman" w:hAnsi="Times New Roman" w:cs="Times New Roman" w:eastAsia="Times New Roman"/>
+                <w:b w:val="0"/>
+                <w:color w:val="999999"/>
+                <w:sz w:val="10"/>
+              </w:rPr>
+              <w:t xml:space="preserve"> 2/2</w:t>
             </w:r>
           </w:p>
         </w:tc>
@@ -2060,11 +2594,21 @@
             </w:pPr>
             <w:r>
               <w:rPr>
+                <w:rFonts w:ascii="Times New Roman" w:hAnsi="Times New Roman" w:cs="Times New Roman" w:eastAsia="Times New Roman"/>
                 <w:b w:val="0"/>
                 <w:i w:val="0"/>
                 <w:sz w:val="14"/>
               </w:rPr>
-              <w:t>EPS 3/4</w:t>
+              <w:t>FOV</w:t>
+            </w:r>
+            <w:r>
+              <w:rPr>
+                <w:rFonts w:ascii="Times New Roman" w:hAnsi="Times New Roman" w:cs="Times New Roman" w:eastAsia="Times New Roman"/>
+                <w:b w:val="0"/>
+                <w:color w:val="999999"/>
+                <w:sz w:val="10"/>
+              </w:rPr>
+              <w:t xml:space="preserve"> 3/3</w:t>
             </w:r>
           </w:p>
         </w:tc>
@@ -2080,11 +2624,21 @@
             </w:pPr>
             <w:r>
               <w:rPr>
+                <w:rFonts w:ascii="Times New Roman" w:hAnsi="Times New Roman" w:cs="Times New Roman" w:eastAsia="Times New Roman"/>
                 <w:b w:val="0"/>
                 <w:i w:val="0"/>
                 <w:sz w:val="14"/>
               </w:rPr>
-              <w:t>Sciences et Technologie 6/6</w:t>
+              <w:t>Sciences et Technologie</w:t>
+            </w:r>
+            <w:r>
+              <w:rPr>
+                <w:rFonts w:ascii="Times New Roman" w:hAnsi="Times New Roman" w:cs="Times New Roman" w:eastAsia="Times New Roman"/>
+                <w:b w:val="0"/>
+                <w:color w:val="999999"/>
+                <w:sz w:val="10"/>
+              </w:rPr>
+              <w:t xml:space="preserve"> 6/6</w:t>
             </w:r>
           </w:p>
         </w:tc>
@@ -2107,6 +2661,7 @@
             </w:pPr>
             <w:r>
               <w:rPr>
+                <w:rFonts w:ascii="Times New Roman" w:hAnsi="Times New Roman" w:cs="Times New Roman" w:eastAsia="Times New Roman"/>
                 <w:b w:val="0"/>
                 <w:i w:val="0"/>
                 <w:sz w:val="14"/>
@@ -2127,6 +2682,7 @@
             </w:pPr>
             <w:r>
               <w:rPr>
+                <w:rFonts w:ascii="Times New Roman" w:hAnsi="Times New Roman" w:cs="Times New Roman" w:eastAsia="Times New Roman"/>
                 <w:b w:val="0"/>
                 <w:i w:val="0"/>
                 <w:sz w:val="13"/>
@@ -2150,6 +2706,7 @@
             </w:pPr>
             <w:r>
               <w:rPr>
+                <w:rFonts w:ascii="Times New Roman" w:hAnsi="Times New Roman" w:cs="Times New Roman" w:eastAsia="Times New Roman"/>
                 <w:b/>
                 <w:i w:val="0"/>
                 <w:sz w:val="14"/>
@@ -2170,11 +2727,21 @@
             </w:pPr>
             <w:r>
               <w:rPr>
+                <w:rFonts w:ascii="Times New Roman" w:hAnsi="Times New Roman" w:cs="Times New Roman" w:eastAsia="Times New Roman"/>
                 <w:b w:val="0"/>
                 <w:i w:val="0"/>
                 <w:sz w:val="14"/>
               </w:rPr>
-              <w:t>Malagasy 2/8</w:t>
+              <w:t>Asa an-tsoratra</w:t>
+            </w:r>
+            <w:r>
+              <w:rPr>
+                <w:rFonts w:ascii="Times New Roman" w:hAnsi="Times New Roman" w:cs="Times New Roman" w:eastAsia="Times New Roman"/>
+                <w:b w:val="0"/>
+                <w:color w:val="999999"/>
+                <w:sz w:val="10"/>
+              </w:rPr>
+              <w:t xml:space="preserve"> 1/2</w:t>
             </w:r>
           </w:p>
         </w:tc>
@@ -2190,11 +2757,21 @@
             </w:pPr>
             <w:r>
               <w:rPr>
+                <w:rFonts w:ascii="Times New Roman" w:hAnsi="Times New Roman" w:cs="Times New Roman" w:eastAsia="Times New Roman"/>
                 <w:b w:val="0"/>
                 <w:i w:val="0"/>
                 <w:sz w:val="14"/>
               </w:rPr>
-              <w:t>Malagasy 4/8</w:t>
+              <w:t>EPS</w:t>
+            </w:r>
+            <w:r>
+              <w:rPr>
+                <w:rFonts w:ascii="Times New Roman" w:hAnsi="Times New Roman" w:cs="Times New Roman" w:eastAsia="Times New Roman"/>
+                <w:b w:val="0"/>
+                <w:color w:val="999999"/>
+                <w:sz w:val="10"/>
+              </w:rPr>
+              <w:t xml:space="preserve"> 1/4</w:t>
             </w:r>
           </w:p>
         </w:tc>
@@ -2210,11 +2787,21 @@
             </w:pPr>
             <w:r>
               <w:rPr>
+                <w:rFonts w:ascii="Times New Roman" w:hAnsi="Times New Roman" w:cs="Times New Roman" w:eastAsia="Times New Roman"/>
                 <w:b w:val="0"/>
                 <w:i w:val="0"/>
                 <w:sz w:val="14"/>
               </w:rPr>
-              <w:t>EPS 2/4</w:t>
+              <w:t>EPS</w:t>
+            </w:r>
+            <w:r>
+              <w:rPr>
+                <w:rFonts w:ascii="Times New Roman" w:hAnsi="Times New Roman" w:cs="Times New Roman" w:eastAsia="Times New Roman"/>
+                <w:b w:val="0"/>
+                <w:color w:val="999999"/>
+                <w:sz w:val="10"/>
+              </w:rPr>
+              <w:t xml:space="preserve"> 2/4</w:t>
             </w:r>
           </w:p>
         </w:tc>
@@ -2230,11 +2817,21 @@
             </w:pPr>
             <w:r>
               <w:rPr>
+                <w:rFonts w:ascii="Times New Roman" w:hAnsi="Times New Roman" w:cs="Times New Roman" w:eastAsia="Times New Roman"/>
                 <w:b w:val="0"/>
                 <w:i w:val="0"/>
                 <w:sz w:val="14"/>
               </w:rPr>
-              <w:t>Malagasy 7/8</w:t>
+              <w:t>EPS</w:t>
+            </w:r>
+            <w:r>
+              <w:rPr>
+                <w:rFonts w:ascii="Times New Roman" w:hAnsi="Times New Roman" w:cs="Times New Roman" w:eastAsia="Times New Roman"/>
+                <w:b w:val="0"/>
+                <w:color w:val="999999"/>
+                <w:sz w:val="10"/>
+              </w:rPr>
+              <w:t xml:space="preserve"> 3/4</w:t>
             </w:r>
           </w:p>
         </w:tc>
@@ -2250,11 +2847,21 @@
             </w:pPr>
             <w:r>
               <w:rPr>
+                <w:rFonts w:ascii="Times New Roman" w:hAnsi="Times New Roman" w:cs="Times New Roman" w:eastAsia="Times New Roman"/>
                 <w:b w:val="0"/>
                 <w:i w:val="0"/>
                 <w:sz w:val="14"/>
               </w:rPr>
-              <w:t>EPS 4/4</w:t>
+              <w:t>EPS</w:t>
+            </w:r>
+            <w:r>
+              <w:rPr>
+                <w:rFonts w:ascii="Times New Roman" w:hAnsi="Times New Roman" w:cs="Times New Roman" w:eastAsia="Times New Roman"/>
+                <w:b w:val="0"/>
+                <w:color w:val="999999"/>
+                <w:sz w:val="10"/>
+              </w:rPr>
+              <w:t xml:space="preserve"> 4/4</w:t>
             </w:r>
           </w:p>
         </w:tc>
@@ -2277,6 +2884,7 @@
             </w:pPr>
             <w:r>
               <w:rPr>
+                <w:rFonts w:ascii="Times New Roman" w:hAnsi="Times New Roman" w:cs="Times New Roman" w:eastAsia="Times New Roman"/>
                 <w:b w:val="0"/>
                 <w:i w:val="0"/>
                 <w:sz w:val="14"/>
@@ -2296,6 +2904,7 @@
             </w:pPr>
             <w:r>
               <w:rPr>
+                <w:rFonts w:ascii="Times New Roman" w:hAnsi="Times New Roman" w:cs="Times New Roman" w:eastAsia="Times New Roman"/>
                 <w:b w:val="0"/>
                 <w:i w:val="0"/>
                 <w:sz w:val="13"/>
@@ -2318,6 +2927,7 @@
             </w:pPr>
             <w:r>
               <w:rPr>
+                <w:rFonts w:ascii="Times New Roman" w:hAnsi="Times New Roman" w:cs="Times New Roman" w:eastAsia="Times New Roman"/>
                 <w:b/>
                 <w:i w:val="0"/>
                 <w:sz w:val="14"/>
@@ -2339,11 +2949,21 @@
             </w:pPr>
             <w:r>
               <w:rPr>
+                <w:rFonts w:ascii="Times New Roman" w:hAnsi="Times New Roman" w:cs="Times New Roman" w:eastAsia="Times New Roman"/>
                 <w:b w:val="0"/>
                 <w:i w:val="0"/>
                 <w:sz w:val="14"/>
               </w:rPr>
-              <w:t>Zavakanto 1/4</w:t>
+              <w:t>Zavakanto – Arts visuels</w:t>
+            </w:r>
+            <w:r>
+              <w:rPr>
+                <w:rFonts w:ascii="Times New Roman" w:hAnsi="Times New Roman" w:cs="Times New Roman" w:eastAsia="Times New Roman"/>
+                <w:b w:val="0"/>
+                <w:color w:val="999999"/>
+                <w:sz w:val="10"/>
+              </w:rPr>
+              <w:t xml:space="preserve"> 1/1</w:t>
             </w:r>
           </w:p>
         </w:tc>
@@ -2360,11 +2980,21 @@
             </w:pPr>
             <w:r>
               <w:rPr>
+                <w:rFonts w:ascii="Times New Roman" w:hAnsi="Times New Roman" w:cs="Times New Roman" w:eastAsia="Times New Roman"/>
                 <w:b w:val="0"/>
                 <w:i w:val="0"/>
                 <w:sz w:val="14"/>
               </w:rPr>
-              <w:t>Zavakanto 2/4</w:t>
+              <w:t>Zavakanto – Musique</w:t>
+            </w:r>
+            <w:r>
+              <w:rPr>
+                <w:rFonts w:ascii="Times New Roman" w:hAnsi="Times New Roman" w:cs="Times New Roman" w:eastAsia="Times New Roman"/>
+                <w:b w:val="0"/>
+                <w:color w:val="999999"/>
+                <w:sz w:val="10"/>
+              </w:rPr>
+              <w:t xml:space="preserve"> 1/1</w:t>
             </w:r>
           </w:p>
         </w:tc>
@@ -2381,11 +3011,21 @@
             </w:pPr>
             <w:r>
               <w:rPr>
+                <w:rFonts w:ascii="Times New Roman" w:hAnsi="Times New Roman" w:cs="Times New Roman" w:eastAsia="Times New Roman"/>
                 <w:b w:val="0"/>
                 <w:i w:val="0"/>
                 <w:sz w:val="14"/>
               </w:rPr>
-              <w:t>FOV 3/4</w:t>
+              <w:t>Anglais</w:t>
+            </w:r>
+            <w:r>
+              <w:rPr>
+                <w:rFonts w:ascii="Times New Roman" w:hAnsi="Times New Roman" w:cs="Times New Roman" w:eastAsia="Times New Roman"/>
+                <w:b w:val="0"/>
+                <w:color w:val="999999"/>
+                <w:sz w:val="10"/>
+              </w:rPr>
+              <w:t xml:space="preserve"> 3/3</w:t>
             </w:r>
           </w:p>
         </w:tc>
@@ -2402,11 +3042,21 @@
             </w:pPr>
             <w:r>
               <w:rPr>
+                <w:rFonts w:ascii="Times New Roman" w:hAnsi="Times New Roman" w:cs="Times New Roman" w:eastAsia="Times New Roman"/>
                 <w:b w:val="0"/>
                 <w:i w:val="0"/>
                 <w:sz w:val="14"/>
               </w:rPr>
-              <w:t>Zavakanto 3/4</w:t>
+              <w:t>Zavakanto – Danse</w:t>
+            </w:r>
+            <w:r>
+              <w:rPr>
+                <w:rFonts w:ascii="Times New Roman" w:hAnsi="Times New Roman" w:cs="Times New Roman" w:eastAsia="Times New Roman"/>
+                <w:b w:val="0"/>
+                <w:color w:val="999999"/>
+                <w:sz w:val="10"/>
+              </w:rPr>
+              <w:t xml:space="preserve"> 1/1</w:t>
             </w:r>
           </w:p>
         </w:tc>
@@ -2423,11 +3073,21 @@
             </w:pPr>
             <w:r>
               <w:rPr>
+                <w:rFonts w:ascii="Times New Roman" w:hAnsi="Times New Roman" w:cs="Times New Roman" w:eastAsia="Times New Roman"/>
                 <w:b w:val="0"/>
                 <w:i w:val="0"/>
                 <w:sz w:val="14"/>
               </w:rPr>
-              <w:t>Zavakanto 4/4</w:t>
+              <w:t>Zavakanto – Arts dramatiques</w:t>
+            </w:r>
+            <w:r>
+              <w:rPr>
+                <w:rFonts w:ascii="Times New Roman" w:hAnsi="Times New Roman" w:cs="Times New Roman" w:eastAsia="Times New Roman"/>
+                <w:b w:val="0"/>
+                <w:color w:val="999999"/>
+                <w:sz w:val="10"/>
+              </w:rPr>
+              <w:t xml:space="preserve"> 1/1</w:t>
             </w:r>
           </w:p>
         </w:tc>
@@ -2450,6 +3110,7 @@
             </w:pPr>
             <w:r>
               <w:rPr>
+                <w:rFonts w:ascii="Times New Roman" w:hAnsi="Times New Roman" w:cs="Times New Roman" w:eastAsia="Times New Roman"/>
                 <w:b w:val="0"/>
                 <w:i w:val="0"/>
                 <w:sz w:val="14"/>
@@ -2469,6 +3130,7 @@
             </w:pPr>
             <w:r>
               <w:rPr>
+                <w:rFonts w:ascii="Times New Roman" w:hAnsi="Times New Roman" w:cs="Times New Roman" w:eastAsia="Times New Roman"/>
                 <w:b w:val="0"/>
                 <w:i w:val="0"/>
                 <w:sz w:val="13"/>
@@ -2539,6 +3201,7 @@
             </w:pPr>
             <w:r>
               <w:rPr>
+                <w:rFonts w:ascii="Times New Roman" w:hAnsi="Times New Roman" w:cs="Times New Roman" w:eastAsia="Times New Roman"/>
                 <w:b w:val="0"/>
                 <w:i w:val="0"/>
                 <w:sz w:val="14"/>
@@ -2559,6 +3222,7 @@
             </w:pPr>
             <w:r>
               <w:rPr>
+                <w:rFonts w:ascii="Times New Roman" w:hAnsi="Times New Roman" w:cs="Times New Roman" w:eastAsia="Times New Roman"/>
                 <w:b w:val="0"/>
                 <w:i w:val="0"/>
                 <w:sz w:val="13"/>
@@ -2582,6 +3246,7 @@
             </w:pPr>
             <w:r>
               <w:rPr>
+                <w:rFonts w:ascii="Times New Roman" w:hAnsi="Times New Roman" w:cs="Times New Roman" w:eastAsia="Times New Roman"/>
                 <w:b w:val="0"/>
                 <w:i w:val="0"/>
                 <w:sz w:val="14"/>
@@ -2603,6 +3268,7 @@
             </w:pPr>
             <w:r>
               <w:rPr>
+                <w:rFonts w:ascii="Times New Roman" w:hAnsi="Times New Roman" w:cs="Times New Roman" w:eastAsia="Times New Roman"/>
                 <w:b/>
                 <w:i w:val="0"/>
                 <w:sz w:val="16"/>
@@ -2622,6 +3288,7 @@
       </w:pPr>
       <w:r>
         <w:rPr>
+          <w:rFonts w:ascii="Times New Roman" w:hAnsi="Times New Roman" w:cs="Times New Roman" w:eastAsia="Times New Roman"/>
           <w:b/>
           <w:sz w:val="20"/>
         </w:rPr>
@@ -2650,10 +3317,10 @@
       </w:pPr>
       <w:r>
         <w:rPr>
+          <w:rFonts w:ascii="Times New Roman" w:hAnsi="Times New Roman" w:cs="Times New Roman" w:eastAsia="Times New Roman"/>
           <w:b w:val="0"/>
           <w:sz w:val="20"/>
         </w:rPr>
-        <w:t xml:space="preserve">    RABE Fanja</w:t>
       </w:r>
     </w:p>
     <w:sectPr>
@@ -3030,7 +3697,7 @@
     <w:qFormat/>
     <w:rsid w:val="00FC693F"/>
     <w:rPr>
-      <w:rFonts w:ascii="Arial" w:hAnsi="Arial"/>
+      <w:rFonts w:ascii="Times New Roman" w:hAnsi="Times New Roman"/>
       <w:sz w:val="16"/>
     </w:rPr>
   </w:style>
@@ -3682,7 +4349,7 @@
       </w:tabs>
     </w:pPr>
     <w:rPr>
-      <w:rFonts w:ascii="Courier" w:hAnsi="Courier"/>
+      <w:rFonts w:ascii="Times New Roman" w:hAnsi="Times New Roman"/>
       <w:sz w:val="20"/>
       <w:szCs w:val="20"/>
     </w:rPr>
@@ -3694,7 +4361,7 @@
     <w:uiPriority w:val="99"/>
     <w:rsid w:val="0029639D"/>
     <w:rPr>
-      <w:rFonts w:ascii="Courier" w:hAnsi="Courier"/>
+      <w:rFonts w:ascii="Times New Roman" w:hAnsi="Times New Roman"/>
       <w:sz w:val="20"/>
       <w:szCs w:val="20"/>
     </w:rPr>

</xml_diff>

<commit_message>
EDT T5 v3: conformite stricte PE (seances Francais 45 min, Matematika 12x30, grille 2x45+6x30+2x20)
Co-authored-by: arena-agent <297053741+arena-agent@users.noreply.github.com>
</commit_message>
<xml_diff>
--- a/EDT/emploi_du_temps_T5.docx
+++ b/EDT/emploi_du_temps_T5.docx
@@ -521,7 +521,7 @@
                 <w:i w:val="0"/>
                 <w:sz w:val="14"/>
               </w:rPr>
-              <w:t>7h 30 – 8h 00</w:t>
+              <w:t>7h 30 – 8h 15</w:t>
             </w:r>
           </w:p>
         </w:tc>
@@ -542,7 +542,7 @@
                 <w:i w:val="0"/>
                 <w:sz w:val="14"/>
               </w:rPr>
-              <w:t>Vakiteny</w:t>
+              <w:t>Français – Compréhension orale</w:t>
             </w:r>
             <w:r>
               <w:rPr>
@@ -551,7 +551,7 @@
                 <w:color w:val="999999"/>
                 <w:sz w:val="10"/>
               </w:rPr>
-              <w:t xml:space="preserve"> 1/2</w:t>
+              <w:t xml:space="preserve"> 1/1</w:t>
             </w:r>
           </w:p>
         </w:tc>
@@ -572,7 +572,7 @@
                 <w:i w:val="0"/>
                 <w:sz w:val="14"/>
               </w:rPr>
-              <w:t>Fiasan'ny teny</w:t>
+              <w:t>Français – Compréhension écrite</w:t>
             </w:r>
             <w:r>
               <w:rPr>
@@ -581,7 +581,7 @@
                 <w:color w:val="999999"/>
                 <w:sz w:val="10"/>
               </w:rPr>
-              <w:t xml:space="preserve"> 1/2</w:t>
+              <w:t xml:space="preserve"> 1/1</w:t>
             </w:r>
           </w:p>
         </w:tc>
@@ -602,7 +602,7 @@
                 <w:i w:val="0"/>
                 <w:sz w:val="14"/>
               </w:rPr>
-              <w:t>Vakiteny</w:t>
+              <w:t>Français – Lecture-Fluidité</w:t>
             </w:r>
             <w:r>
               <w:rPr>
@@ -611,7 +611,7 @@
                 <w:color w:val="999999"/>
                 <w:sz w:val="10"/>
               </w:rPr>
-              <w:t xml:space="preserve"> 2/2</w:t>
+              <w:t xml:space="preserve"> 1/1</w:t>
             </w:r>
           </w:p>
         </w:tc>
@@ -632,7 +632,7 @@
                 <w:i w:val="0"/>
                 <w:sz w:val="14"/>
               </w:rPr>
-              <w:t>Fiasan'ny teny</w:t>
+              <w:t>Français – Production orale</w:t>
             </w:r>
             <w:r>
               <w:rPr>
@@ -641,7 +641,7 @@
                 <w:color w:val="999999"/>
                 <w:sz w:val="10"/>
               </w:rPr>
-              <w:t xml:space="preserve"> 2/2</w:t>
+              <w:t xml:space="preserve"> 1/1</w:t>
             </w:r>
           </w:p>
         </w:tc>
@@ -662,7 +662,7 @@
                 <w:i w:val="0"/>
                 <w:sz w:val="14"/>
               </w:rPr>
-              <w:t>Asa an-tsoratra</w:t>
+              <w:t>Sciences et Technologie</w:t>
             </w:r>
             <w:r>
               <w:rPr>
@@ -671,7 +671,7 @@
                 <w:color w:val="999999"/>
                 <w:sz w:val="10"/>
               </w:rPr>
-              <w:t xml:space="preserve"> 2/2</w:t>
+              <w:t xml:space="preserve"> 4/4</w:t>
             </w:r>
           </w:p>
         </w:tc>
@@ -720,7 +720,7 @@
                 <w:i w:val="0"/>
                 <w:sz w:val="13"/>
               </w:rPr>
-              <w:t>4h (240 min) : Fanehoan-kevitra 20 min × 3 ; Vakiteny, Fiasan’ny teny, Asa an-tsoratra 30 min × 2 chacun</w:t>
+              <w:t>4h (240 min) : Fanehoan-kevitra am-bava 20 min × 3 ; Vakiteny, Fiasan’ny teny, Asa an-tsoratra 30 min × 2 chacun</w:t>
             </w:r>
           </w:p>
         </w:tc>
@@ -744,7 +744,7 @@
                 <w:i w:val="0"/>
                 <w:sz w:val="14"/>
               </w:rPr>
-              <w:t>8h 00 – 8h 30</w:t>
+              <w:t>8h 15 – 8h 45</w:t>
             </w:r>
           </w:p>
         </w:tc>
@@ -825,7 +825,7 @@
                 <w:i w:val="0"/>
                 <w:sz w:val="14"/>
               </w:rPr>
-              <w:t>Matematika – Opération</w:t>
+              <w:t>Matematika – Algèbre</w:t>
             </w:r>
             <w:r>
               <w:rPr>
@@ -834,7 +834,7 @@
                 <w:color w:val="999999"/>
                 <w:sz w:val="10"/>
               </w:rPr>
-              <w:t xml:space="preserve"> 2/3</w:t>
+              <w:t xml:space="preserve"> 1/1</w:t>
             </w:r>
           </w:p>
         </w:tc>
@@ -885,7 +885,7 @@
                 <w:i w:val="0"/>
                 <w:sz w:val="14"/>
               </w:rPr>
-              <w:t>Matematika – Opération</w:t>
+              <w:t>Matematika – Mesure</w:t>
             </w:r>
             <w:r>
               <w:rPr>
@@ -894,7 +894,7 @@
                 <w:color w:val="999999"/>
                 <w:sz w:val="10"/>
               </w:rPr>
-              <w:t xml:space="preserve"> 3/3</w:t>
+              <w:t xml:space="preserve"> 2/2</w:t>
             </w:r>
           </w:p>
         </w:tc>
@@ -943,7 +943,7 @@
                 <w:i w:val="0"/>
                 <w:sz w:val="13"/>
               </w:rPr>
-              <w:t>5h (300 min) = 30 min × 10 (CO, CE, PO, Lecture-Fluidité, PE, FL)</w:t>
+              <w:t>5h (300 min) : CO, CE, PO, Lecture-Fluidité 45 min × 1 chacune ; Production écrite, Fonct. de la langue 30 min × 2 chacune</w:t>
             </w:r>
           </w:p>
         </w:tc>
@@ -967,7 +967,7 @@
                 <w:i w:val="0"/>
                 <w:sz w:val="14"/>
               </w:rPr>
-              <w:t>8h 30 – 9h 00</w:t>
+              <w:t>8h 45 – 9h 15</w:t>
             </w:r>
           </w:p>
         </w:tc>
@@ -988,7 +988,7 @@
                 <w:i w:val="0"/>
                 <w:sz w:val="14"/>
               </w:rPr>
-              <w:t>Français – Compréhension orale</w:t>
+              <w:t>Malagasy – Vakiteny</w:t>
             </w:r>
             <w:r>
               <w:rPr>
@@ -1018,67 +1018,7 @@
                 <w:i w:val="0"/>
                 <w:sz w:val="14"/>
               </w:rPr>
-              <w:t>Français – Production orale</w:t>
-            </w:r>
-            <w:r>
-              <w:rPr>
-                <w:rFonts w:ascii="Times New Roman" w:hAnsi="Times New Roman" w:cs="Times New Roman" w:eastAsia="Times New Roman"/>
-                <w:b w:val="0"/>
-                <w:color w:val="999999"/>
-                <w:sz w:val="10"/>
-              </w:rPr>
-              <w:t xml:space="preserve"> 1/1</w:t>
-            </w:r>
-          </w:p>
-        </w:tc>
-        <w:tc>
-          <w:tcPr>
-            <w:tcW w:type="dxa" w:w="1644"/>
-            <w:vAlign w:val="center"/>
-          </w:tcPr>
-          <w:p>
-            <w:pPr>
-              <w:jc w:val="center"/>
-              <w:spacing w:before="0" w:after="0" w:line="240" w:lineRule="auto"/>
-            </w:pPr>
-            <w:r>
-              <w:rPr>
-                <w:rFonts w:ascii="Times New Roman" w:hAnsi="Times New Roman" w:cs="Times New Roman" w:eastAsia="Times New Roman"/>
-                <w:b w:val="0"/>
-                <w:i w:val="0"/>
-                <w:sz w:val="14"/>
-              </w:rPr>
-              <w:t>Français – Compréhension écrite</w:t>
-            </w:r>
-            <w:r>
-              <w:rPr>
-                <w:rFonts w:ascii="Times New Roman" w:hAnsi="Times New Roman" w:cs="Times New Roman" w:eastAsia="Times New Roman"/>
-                <w:b w:val="0"/>
-                <w:color w:val="999999"/>
-                <w:sz w:val="10"/>
-              </w:rPr>
-              <w:t xml:space="preserve"> 1/1</w:t>
-            </w:r>
-          </w:p>
-        </w:tc>
-        <w:tc>
-          <w:tcPr>
-            <w:tcW w:type="dxa" w:w="1644"/>
-            <w:vAlign w:val="center"/>
-          </w:tcPr>
-          <w:p>
-            <w:pPr>
-              <w:jc w:val="center"/>
-              <w:spacing w:before="0" w:after="0" w:line="240" w:lineRule="auto"/>
-            </w:pPr>
-            <w:r>
-              <w:rPr>
-                <w:rFonts w:ascii="Times New Roman" w:hAnsi="Times New Roman" w:cs="Times New Roman" w:eastAsia="Times New Roman"/>
-                <w:b w:val="0"/>
-                <w:i w:val="0"/>
-                <w:sz w:val="14"/>
-              </w:rPr>
-              <w:t>Français – Lecture-Fluidité</w:t>
+              <w:t>Malagasy – Fiasan'ny teny</w:t>
             </w:r>
             <w:r>
               <w:rPr>
@@ -1108,7 +1048,67 @@
                 <w:i w:val="0"/>
                 <w:sz w:val="14"/>
               </w:rPr>
-              <w:t>Français – Compréhension orale</w:t>
+              <w:t>Malagasy – Vakiteny</w:t>
+            </w:r>
+            <w:r>
+              <w:rPr>
+                <w:rFonts w:ascii="Times New Roman" w:hAnsi="Times New Roman" w:cs="Times New Roman" w:eastAsia="Times New Roman"/>
+                <w:b w:val="0"/>
+                <w:color w:val="999999"/>
+                <w:sz w:val="10"/>
+              </w:rPr>
+              <w:t xml:space="preserve"> 2/2</w:t>
+            </w:r>
+          </w:p>
+        </w:tc>
+        <w:tc>
+          <w:tcPr>
+            <w:tcW w:type="dxa" w:w="1644"/>
+            <w:vAlign w:val="center"/>
+          </w:tcPr>
+          <w:p>
+            <w:pPr>
+              <w:jc w:val="center"/>
+              <w:spacing w:before="0" w:after="0" w:line="240" w:lineRule="auto"/>
+            </w:pPr>
+            <w:r>
+              <w:rPr>
+                <w:rFonts w:ascii="Times New Roman" w:hAnsi="Times New Roman" w:cs="Times New Roman" w:eastAsia="Times New Roman"/>
+                <w:b w:val="0"/>
+                <w:i w:val="0"/>
+                <w:sz w:val="14"/>
+              </w:rPr>
+              <w:t>Malagasy – Fiasan'ny teny</w:t>
+            </w:r>
+            <w:r>
+              <w:rPr>
+                <w:rFonts w:ascii="Times New Roman" w:hAnsi="Times New Roman" w:cs="Times New Roman" w:eastAsia="Times New Roman"/>
+                <w:b w:val="0"/>
+                <w:color w:val="999999"/>
+                <w:sz w:val="10"/>
+              </w:rPr>
+              <w:t xml:space="preserve"> 2/2</w:t>
+            </w:r>
+          </w:p>
+        </w:tc>
+        <w:tc>
+          <w:tcPr>
+            <w:tcW w:type="dxa" w:w="1644"/>
+            <w:vAlign w:val="center"/>
+          </w:tcPr>
+          <w:p>
+            <w:pPr>
+              <w:jc w:val="center"/>
+              <w:spacing w:before="0" w:after="0" w:line="240" w:lineRule="auto"/>
+            </w:pPr>
+            <w:r>
+              <w:rPr>
+                <w:rFonts w:ascii="Times New Roman" w:hAnsi="Times New Roman" w:cs="Times New Roman" w:eastAsia="Times New Roman"/>
+                <w:b w:val="0"/>
+                <w:i w:val="0"/>
+                <w:sz w:val="14"/>
+              </w:rPr>
+              <w:t>Malagasy – Asa an-tsoratra</w:t>
             </w:r>
             <w:r>
               <w:rPr>
@@ -1166,7 +1166,7 @@
                 <w:i w:val="0"/>
                 <w:sz w:val="13"/>
               </w:rPr>
-              <w:t>6h (360 min) = 30 min × 12 (Nombre, Opération, Algèbre, Géométrie, Mesure, Traitement de données)</w:t>
+              <w:t>6h (360 min) = 30 min × 12</w:t>
             </w:r>
           </w:p>
         </w:tc>
@@ -1190,7 +1190,7 @@
                 <w:i w:val="0"/>
                 <w:sz w:val="14"/>
               </w:rPr>
-              <w:t>9h 00 – 9h 30</w:t>
+              <w:t>9h 15 – 9h 45</w:t>
             </w:r>
           </w:p>
         </w:tc>
@@ -1241,7 +1241,37 @@
                 <w:i w:val="0"/>
                 <w:sz w:val="14"/>
               </w:rPr>
-              <w:t>Géographie</w:t>
+              <w:t>Matematika – Opération</w:t>
+            </w:r>
+            <w:r>
+              <w:rPr>
+                <w:rFonts w:ascii="Times New Roman" w:hAnsi="Times New Roman" w:cs="Times New Roman" w:eastAsia="Times New Roman"/>
+                <w:b w:val="0"/>
+                <w:color w:val="999999"/>
+                <w:sz w:val="10"/>
+              </w:rPr>
+              <w:t xml:space="preserve"> 2/3</w:t>
+            </w:r>
+          </w:p>
+        </w:tc>
+        <w:tc>
+          <w:tcPr>
+            <w:tcW w:type="dxa" w:w="1644"/>
+            <w:vAlign w:val="center"/>
+          </w:tcPr>
+          <w:p>
+            <w:pPr>
+              <w:jc w:val="center"/>
+              <w:spacing w:before="0" w:after="0" w:line="240" w:lineRule="auto"/>
+            </w:pPr>
+            <w:r>
+              <w:rPr>
+                <w:rFonts w:ascii="Times New Roman" w:hAnsi="Times New Roman" w:cs="Times New Roman" w:eastAsia="Times New Roman"/>
+                <w:b w:val="0"/>
+                <w:i w:val="0"/>
+                <w:sz w:val="14"/>
+              </w:rPr>
+              <w:t>Malagasy – Asa an-tsoratra</w:t>
             </w:r>
             <w:r>
               <w:rPr>
@@ -1271,7 +1301,7 @@
                 <w:i w:val="0"/>
                 <w:sz w:val="14"/>
               </w:rPr>
-              <w:t>Matematika – Algèbre</w:t>
+              <w:t>Matematika – Opération</w:t>
             </w:r>
             <w:r>
               <w:rPr>
@@ -1280,7 +1310,7 @@
                 <w:color w:val="999999"/>
                 <w:sz w:val="10"/>
               </w:rPr>
-              <w:t xml:space="preserve"> 1/1</w:t>
+              <w:t xml:space="preserve"> 3/3</w:t>
             </w:r>
           </w:p>
         </w:tc>
@@ -1301,7 +1331,7 @@
                 <w:i w:val="0"/>
                 <w:sz w:val="14"/>
               </w:rPr>
-              <w:t>Tantara</w:t>
+              <w:t>Matematika – Trait. de données</w:t>
             </w:r>
             <w:r>
               <w:rPr>
@@ -1310,37 +1340,7 @@
                 <w:color w:val="999999"/>
                 <w:sz w:val="10"/>
               </w:rPr>
-              <w:t xml:space="preserve"> 1/2</w:t>
-            </w:r>
-          </w:p>
-        </w:tc>
-        <w:tc>
-          <w:tcPr>
-            <w:tcW w:type="dxa" w:w="1644"/>
-            <w:vAlign w:val="center"/>
-          </w:tcPr>
-          <w:p>
-            <w:pPr>
-              <w:jc w:val="center"/>
-              <w:spacing w:before="0" w:after="0" w:line="240" w:lineRule="auto"/>
-            </w:pPr>
-            <w:r>
-              <w:rPr>
-                <w:rFonts w:ascii="Times New Roman" w:hAnsi="Times New Roman" w:cs="Times New Roman" w:eastAsia="Times New Roman"/>
-                <w:b w:val="0"/>
-                <w:i w:val="0"/>
-                <w:sz w:val="14"/>
-              </w:rPr>
-              <w:t>Géographie</w:t>
-            </w:r>
-            <w:r>
-              <w:rPr>
-                <w:rFonts w:ascii="Times New Roman" w:hAnsi="Times New Roman" w:cs="Times New Roman" w:eastAsia="Times New Roman"/>
-                <w:b w:val="0"/>
-                <w:color w:val="999999"/>
-                <w:sz w:val="10"/>
-              </w:rPr>
-              <w:t xml:space="preserve"> 2/2</w:t>
+              <w:t xml:space="preserve"> 1/1</w:t>
             </w:r>
           </w:p>
         </w:tc>
@@ -1389,7 +1389,7 @@
                 <w:i w:val="0"/>
                 <w:sz w:val="13"/>
               </w:rPr>
-              <w:t>3h (180 min) = 30 min × 6</w:t>
+              <w:t>3h (180 min) = 45 min × 4</w:t>
             </w:r>
           </w:p>
         </w:tc>
@@ -1413,7 +1413,7 @@
                 <w:i w:val="0"/>
                 <w:sz w:val="14"/>
               </w:rPr>
-              <w:t>9h 30 – 9h 50</w:t>
+              <w:t>9h 45 – 10h 05</w:t>
             </w:r>
           </w:p>
         </w:tc>
@@ -1434,7 +1434,7 @@
                 <w:i w:val="0"/>
                 <w:sz w:val="14"/>
               </w:rPr>
-              <w:t>Fanehoan-kevitra am-bava</w:t>
+              <w:t>Malagasy – Fanehoan-kevitra am-bava</w:t>
             </w:r>
             <w:r>
               <w:rPr>
@@ -1494,7 +1494,7 @@
                 <w:i w:val="0"/>
                 <w:sz w:val="14"/>
               </w:rPr>
-              <w:t>Fanehoan-kevitra am-bava</w:t>
+              <w:t>Malagasy – Fanehoan-kevitra am-bava</w:t>
             </w:r>
             <w:r>
               <w:rPr>
@@ -1533,7 +1533,7 @@
                 <w:color w:val="999999"/>
                 <w:sz w:val="10"/>
               </w:rPr>
-              <w:t xml:space="preserve"> 2/3</w:t>
+              <w:t xml:space="preserve"> 3/3</w:t>
             </w:r>
           </w:p>
         </w:tc>
@@ -1554,7 +1554,7 @@
                 <w:i w:val="0"/>
                 <w:sz w:val="14"/>
               </w:rPr>
-              <w:t>Fanehoan-kevitra am-bava</w:t>
+              <w:t>Malagasy – Fanehoan-kevitra am-bava</w:t>
             </w:r>
             <w:r>
               <w:rPr>
@@ -1636,7 +1636,7 @@
                 <w:i w:val="0"/>
                 <w:sz w:val="14"/>
               </w:rPr>
-              <w:t>9h 50 – 10h 10</w:t>
+              <w:t>10h 05 – 10h 25</w:t>
             </w:r>
           </w:p>
         </w:tc>
@@ -1819,7 +1819,7 @@
                 <w:i w:val="0"/>
                 <w:sz w:val="14"/>
               </w:rPr>
-              <w:t>10h 10 – 10h 40</w:t>
+              <w:t>10h 25 – 11h 10</w:t>
             </w:r>
           </w:p>
         </w:tc>
@@ -1840,7 +1840,7 @@
                 <w:i w:val="0"/>
                 <w:sz w:val="14"/>
               </w:rPr>
-              <w:t>Français – Fonct. de la langue</w:t>
+              <w:t>Sciences et Technologie</w:t>
             </w:r>
             <w:r>
               <w:rPr>
@@ -1849,7 +1849,7 @@
                 <w:color w:val="999999"/>
                 <w:sz w:val="10"/>
               </w:rPr>
-              <w:t xml:space="preserve"> 1/2</w:t>
+              <w:t xml:space="preserve"> 1/4</w:t>
             </w:r>
           </w:p>
         </w:tc>
@@ -1870,7 +1870,7 @@
                 <w:i w:val="0"/>
                 <w:sz w:val="14"/>
               </w:rPr>
-              <w:t>Matematika – Mesure</w:t>
+              <w:t>Sciences et Technologie</w:t>
             </w:r>
             <w:r>
               <w:rPr>
@@ -1879,7 +1879,7 @@
                 <w:color w:val="999999"/>
                 <w:sz w:val="10"/>
               </w:rPr>
-              <w:t xml:space="preserve"> 1/2</w:t>
+              <w:t xml:space="preserve"> 2/4</w:t>
             </w:r>
           </w:p>
         </w:tc>
@@ -1900,7 +1900,7 @@
                 <w:i w:val="0"/>
                 <w:sz w:val="14"/>
               </w:rPr>
-              <w:t>Français – Fonct. de la langue</w:t>
+              <w:t>EPS</w:t>
             </w:r>
             <w:r>
               <w:rPr>
@@ -1909,7 +1909,7 @@
                 <w:color w:val="999999"/>
                 <w:sz w:val="10"/>
               </w:rPr>
-              <w:t xml:space="preserve"> 2/2</w:t>
+              <w:t xml:space="preserve"> 1/3</w:t>
             </w:r>
           </w:p>
         </w:tc>
@@ -1930,7 +1930,7 @@
                 <w:i w:val="0"/>
                 <w:sz w:val="14"/>
               </w:rPr>
-              <w:t>Matematika – Mesure</w:t>
+              <w:t>Sciences et Technologie</w:t>
             </w:r>
             <w:r>
               <w:rPr>
@@ -1939,7 +1939,7 @@
                 <w:color w:val="999999"/>
                 <w:sz w:val="10"/>
               </w:rPr>
-              <w:t xml:space="preserve"> 2/2</w:t>
+              <w:t xml:space="preserve"> 3/4</w:t>
             </w:r>
           </w:p>
         </w:tc>
@@ -1960,7 +1960,7 @@
                 <w:i w:val="0"/>
                 <w:sz w:val="14"/>
               </w:rPr>
-              <w:t>Français – Lecture-Fluidité</w:t>
+              <w:t>EPS</w:t>
             </w:r>
             <w:r>
               <w:rPr>
@@ -1969,7 +1969,7 @@
                 <w:color w:val="999999"/>
                 <w:sz w:val="10"/>
               </w:rPr>
-              <w:t xml:space="preserve"> 2/2</w:t>
+              <w:t xml:space="preserve"> 3/3</w:t>
             </w:r>
           </w:p>
         </w:tc>
@@ -2042,7 +2042,7 @@
                 <w:i w:val="0"/>
                 <w:sz w:val="14"/>
               </w:rPr>
-              <w:t>10h 40 – 11h 10</w:t>
+              <w:t>11h 10 – 11h 40</w:t>
             </w:r>
           </w:p>
         </w:tc>
@@ -2072,7 +2072,7 @@
                 <w:color w:val="999999"/>
                 <w:sz w:val="10"/>
               </w:rPr>
-              <w:t xml:space="preserve"> 2/2</w:t>
+              <w:t xml:space="preserve"> 1/2</w:t>
             </w:r>
           </w:p>
         </w:tc>
@@ -2183,7 +2183,7 @@
                 <w:i w:val="0"/>
                 <w:sz w:val="14"/>
               </w:rPr>
-              <w:t>Sciences et Technologie</w:t>
+              <w:t>Français – Fonct. de la langue</w:t>
             </w:r>
             <w:r>
               <w:rPr>
@@ -2192,7 +2192,7 @@
                 <w:color w:val="999999"/>
                 <w:sz w:val="10"/>
               </w:rPr>
-              <w:t xml:space="preserve"> 5/6</w:t>
+              <w:t xml:space="preserve"> 2/2</w:t>
             </w:r>
           </w:p>
         </w:tc>
@@ -2265,7 +2265,7 @@
                 <w:i w:val="0"/>
                 <w:sz w:val="14"/>
               </w:rPr>
-              <w:t>11h 10 – 11h 40</w:t>
+              <w:t>11h 40 – 12h 10</w:t>
             </w:r>
           </w:p>
         </w:tc>
@@ -2286,7 +2286,37 @@
                 <w:i w:val="0"/>
                 <w:sz w:val="14"/>
               </w:rPr>
-              <w:t>Matematika – Géométrie</w:t>
+              <w:t>FOV</w:t>
+            </w:r>
+            <w:r>
+              <w:rPr>
+                <w:rFonts w:ascii="Times New Roman" w:hAnsi="Times New Roman" w:cs="Times New Roman" w:eastAsia="Times New Roman"/>
+                <w:b w:val="0"/>
+                <w:color w:val="999999"/>
+                <w:sz w:val="10"/>
+              </w:rPr>
+              <w:t xml:space="preserve"> 1/3</w:t>
+            </w:r>
+          </w:p>
+        </w:tc>
+        <w:tc>
+          <w:tcPr>
+            <w:tcW w:type="dxa" w:w="1644"/>
+            <w:vAlign w:val="center"/>
+          </w:tcPr>
+          <w:p>
+            <w:pPr>
+              <w:jc w:val="center"/>
+              <w:spacing w:before="0" w:after="0" w:line="240" w:lineRule="auto"/>
+            </w:pPr>
+            <w:r>
+              <w:rPr>
+                <w:rFonts w:ascii="Times New Roman" w:hAnsi="Times New Roman" w:cs="Times New Roman" w:eastAsia="Times New Roman"/>
+                <w:b w:val="0"/>
+                <w:i w:val="0"/>
+                <w:sz w:val="14"/>
+              </w:rPr>
+              <w:t>Géographie</w:t>
             </w:r>
             <w:r>
               <w:rPr>
@@ -2316,7 +2346,7 @@
                 <w:i w:val="0"/>
                 <w:sz w:val="14"/>
               </w:rPr>
-              <w:t>Sciences et Technologie</w:t>
+              <w:t>Tantara</w:t>
             </w:r>
             <w:r>
               <w:rPr>
@@ -2325,7 +2355,7 @@
                 <w:color w:val="999999"/>
                 <w:sz w:val="10"/>
               </w:rPr>
-              <w:t xml:space="preserve"> 2/6</w:t>
+              <w:t xml:space="preserve"> 2/2</w:t>
             </w:r>
           </w:p>
         </w:tc>
@@ -2346,7 +2376,7 @@
                 <w:i w:val="0"/>
                 <w:sz w:val="14"/>
               </w:rPr>
-              <w:t>Sciences et Technologie</w:t>
+              <w:t>EPS</w:t>
             </w:r>
             <w:r>
               <w:rPr>
@@ -2355,7 +2385,7 @@
                 <w:color w:val="999999"/>
                 <w:sz w:val="10"/>
               </w:rPr>
-              <w:t xml:space="preserve"> 3/6</w:t>
+              <w:t xml:space="preserve"> 2/3</w:t>
             </w:r>
           </w:p>
         </w:tc>
@@ -2376,7 +2406,7 @@
                 <w:i w:val="0"/>
                 <w:sz w:val="14"/>
               </w:rPr>
-              <w:t>Sciences et Technologie</w:t>
+              <w:t>Géographie</w:t>
             </w:r>
             <w:r>
               <w:rPr>
@@ -2385,37 +2415,7 @@
                 <w:color w:val="999999"/>
                 <w:sz w:val="10"/>
               </w:rPr>
-              <w:t xml:space="preserve"> 4/6</w:t>
-            </w:r>
-          </w:p>
-        </w:tc>
-        <w:tc>
-          <w:tcPr>
-            <w:tcW w:type="dxa" w:w="1644"/>
-            <w:vAlign w:val="center"/>
-          </w:tcPr>
-          <w:p>
-            <w:pPr>
-              <w:jc w:val="center"/>
-              <w:spacing w:before="0" w:after="0" w:line="240" w:lineRule="auto"/>
-            </w:pPr>
-            <w:r>
-              <w:rPr>
-                <w:rFonts w:ascii="Times New Roman" w:hAnsi="Times New Roman" w:cs="Times New Roman" w:eastAsia="Times New Roman"/>
-                <w:b w:val="0"/>
-                <w:i w:val="0"/>
-                <w:sz w:val="14"/>
-              </w:rPr>
-              <w:t>Matematika – Trait. de données</w:t>
-            </w:r>
-            <w:r>
-              <w:rPr>
-                <w:rFonts w:ascii="Times New Roman" w:hAnsi="Times New Roman" w:cs="Times New Roman" w:eastAsia="Times New Roman"/>
-                <w:b w:val="0"/>
-                <w:color w:val="999999"/>
-                <w:sz w:val="10"/>
-              </w:rPr>
-              <w:t xml:space="preserve"> 1/1</w:t>
+              <w:t xml:space="preserve"> 2/2</w:t>
             </w:r>
           </w:p>
         </w:tc>
@@ -2488,7 +2488,7 @@
                 <w:i w:val="0"/>
                 <w:sz w:val="14"/>
               </w:rPr>
-              <w:t>11h 40 – 12h 10</w:t>
+              <w:t>12h 10 – 12h 40</w:t>
             </w:r>
           </w:p>
         </w:tc>
@@ -2509,7 +2509,7 @@
                 <w:i w:val="0"/>
                 <w:sz w:val="14"/>
               </w:rPr>
-              <w:t>Sciences et Technologie</w:t>
+              <w:t>Français – Fonct. de la langue</w:t>
             </w:r>
             <w:r>
               <w:rPr>
@@ -2518,7 +2518,7 @@
                 <w:color w:val="999999"/>
                 <w:sz w:val="10"/>
               </w:rPr>
-              <w:t xml:space="preserve"> 1/6</w:t>
+              <w:t xml:space="preserve"> 1/2</w:t>
             </w:r>
           </w:p>
         </w:tc>
@@ -2539,7 +2539,7 @@
                 <w:i w:val="0"/>
                 <w:sz w:val="14"/>
               </w:rPr>
-              <w:t>FOV</w:t>
+              <w:t>Matematika – Géométrie</w:t>
             </w:r>
             <w:r>
               <w:rPr>
@@ -2548,7 +2548,37 @@
                 <w:color w:val="999999"/>
                 <w:sz w:val="10"/>
               </w:rPr>
-              <w:t xml:space="preserve"> 1/3</w:t>
+              <w:t xml:space="preserve"> 1/2</w:t>
+            </w:r>
+          </w:p>
+        </w:tc>
+        <w:tc>
+          <w:tcPr>
+            <w:tcW w:type="dxa" w:w="1644"/>
+            <w:vAlign w:val="center"/>
+          </w:tcPr>
+          <w:p>
+            <w:pPr>
+              <w:jc w:val="center"/>
+              <w:spacing w:before="0" w:after="0" w:line="240" w:lineRule="auto"/>
+            </w:pPr>
+            <w:r>
+              <w:rPr>
+                <w:rFonts w:ascii="Times New Roman" w:hAnsi="Times New Roman" w:cs="Times New Roman" w:eastAsia="Times New Roman"/>
+                <w:b w:val="0"/>
+                <w:i w:val="0"/>
+                <w:sz w:val="14"/>
+              </w:rPr>
+              <w:t>Matematika – Mesure</w:t>
+            </w:r>
+            <w:r>
+              <w:rPr>
+                <w:rFonts w:ascii="Times New Roman" w:hAnsi="Times New Roman" w:cs="Times New Roman" w:eastAsia="Times New Roman"/>
+                <w:b w:val="0"/>
+                <w:color w:val="999999"/>
+                <w:sz w:val="10"/>
+              </w:rPr>
+              <w:t xml:space="preserve"> 1/2</w:t>
             </w:r>
           </w:p>
         </w:tc>
@@ -2614,36 +2644,6 @@
         </w:tc>
         <w:tc>
           <w:tcPr>
-            <w:tcW w:type="dxa" w:w="1644"/>
-            <w:vAlign w:val="center"/>
-          </w:tcPr>
-          <w:p>
-            <w:pPr>
-              <w:jc w:val="center"/>
-              <w:spacing w:before="0" w:after="0" w:line="240" w:lineRule="auto"/>
-            </w:pPr>
-            <w:r>
-              <w:rPr>
-                <w:rFonts w:ascii="Times New Roman" w:hAnsi="Times New Roman" w:cs="Times New Roman" w:eastAsia="Times New Roman"/>
-                <w:b w:val="0"/>
-                <w:i w:val="0"/>
-                <w:sz w:val="14"/>
-              </w:rPr>
-              <w:t>Sciences et Technologie</w:t>
-            </w:r>
-            <w:r>
-              <w:rPr>
-                <w:rFonts w:ascii="Times New Roman" w:hAnsi="Times New Roman" w:cs="Times New Roman" w:eastAsia="Times New Roman"/>
-                <w:b w:val="0"/>
-                <w:color w:val="999999"/>
-                <w:sz w:val="10"/>
-              </w:rPr>
-              <w:t xml:space="preserve"> 6/6</w:t>
-            </w:r>
-          </w:p>
-        </w:tc>
-        <w:tc>
-          <w:tcPr>
             <w:tcW w:type="dxa" w:w="113"/>
             <w:shd w:val="clear" w:color="auto" w:fill="FFFFFF"/>
           </w:tcPr>
@@ -2687,7 +2687,7 @@
                 <w:i w:val="0"/>
                 <w:sz w:val="13"/>
               </w:rPr>
-              <w:t>2h (120 min) = 30 min × 4</w:t>
+              <w:t>2h (120 min) = 45 min × 2 + 30 min × 1</w:t>
             </w:r>
           </w:p>
         </w:tc>
@@ -2711,7 +2711,7 @@
                 <w:i w:val="0"/>
                 <w:sz w:val="14"/>
               </w:rPr>
-              <w:t>12h 10 – 12h 40</w:t>
+              <w:t>12h 40 – 13h 00</w:t>
             </w:r>
           </w:p>
         </w:tc>
@@ -2732,7 +2732,7 @@
                 <w:i w:val="0"/>
                 <w:sz w:val="14"/>
               </w:rPr>
-              <w:t>Asa an-tsoratra</w:t>
+              <w:t>Zavakanto – Arts visuels</w:t>
             </w:r>
             <w:r>
               <w:rPr>
@@ -2741,7 +2741,7 @@
                 <w:color w:val="999999"/>
                 <w:sz w:val="10"/>
               </w:rPr>
-              <w:t xml:space="preserve"> 1/2</w:t>
+              <w:t xml:space="preserve"> 1/1</w:t>
             </w:r>
           </w:p>
         </w:tc>
@@ -2762,7 +2762,7 @@
                 <w:i w:val="0"/>
                 <w:sz w:val="14"/>
               </w:rPr>
-              <w:t>EPS</w:t>
+              <w:t>Zavakanto – Musique</w:t>
             </w:r>
             <w:r>
               <w:rPr>
@@ -2771,7 +2771,7 @@
                 <w:color w:val="999999"/>
                 <w:sz w:val="10"/>
               </w:rPr>
-              <w:t xml:space="preserve"> 1/4</w:t>
+              <w:t xml:space="preserve"> 1/1</w:t>
             </w:r>
           </w:p>
         </w:tc>
@@ -2792,7 +2792,7 @@
                 <w:i w:val="0"/>
                 <w:sz w:val="14"/>
               </w:rPr>
-              <w:t>EPS</w:t>
+              <w:t>Anglais</w:t>
             </w:r>
             <w:r>
               <w:rPr>
@@ -2801,7 +2801,7 @@
                 <w:color w:val="999999"/>
                 <w:sz w:val="10"/>
               </w:rPr>
-              <w:t xml:space="preserve"> 2/4</w:t>
+              <w:t xml:space="preserve"> 2/3</w:t>
             </w:r>
           </w:p>
         </w:tc>
@@ -2822,7 +2822,7 @@
                 <w:i w:val="0"/>
                 <w:sz w:val="14"/>
               </w:rPr>
-              <w:t>EPS</w:t>
+              <w:t>Zavakanto – Danse</w:t>
             </w:r>
             <w:r>
               <w:rPr>
@@ -2831,7 +2831,7 @@
                 <w:color w:val="999999"/>
                 <w:sz w:val="10"/>
               </w:rPr>
-              <w:t xml:space="preserve"> 3/4</w:t>
+              <w:t xml:space="preserve"> 1/1</w:t>
             </w:r>
           </w:p>
         </w:tc>
@@ -2852,7 +2852,7 @@
                 <w:i w:val="0"/>
                 <w:sz w:val="14"/>
               </w:rPr>
-              <w:t>EPS</w:t>
+              <w:t>Zavakanto – Arts dramatiques</w:t>
             </w:r>
             <w:r>
               <w:rPr>
@@ -2861,7 +2861,7 @@
                 <w:color w:val="999999"/>
                 <w:sz w:val="10"/>
               </w:rPr>
-              <w:t xml:space="preserve"> 4/4</w:t>
+              <w:t xml:space="preserve"> 1/1</w:t>
             </w:r>
           </w:p>
         </w:tc>
@@ -2932,7 +2932,6 @@
                 <w:i w:val="0"/>
                 <w:sz w:val="14"/>
               </w:rPr>
-              <w:t>12h 40 – 13h 00</w:t>
             </w:r>
           </w:p>
         </w:tc>
@@ -2954,16 +2953,6 @@
                 <w:i w:val="0"/>
                 <w:sz w:val="14"/>
               </w:rPr>
-              <w:t>Zavakanto – Arts visuels</w:t>
-            </w:r>
-            <w:r>
-              <w:rPr>
-                <w:rFonts w:ascii="Times New Roman" w:hAnsi="Times New Roman" w:cs="Times New Roman" w:eastAsia="Times New Roman"/>
-                <w:b w:val="0"/>
-                <w:color w:val="999999"/>
-                <w:sz w:val="10"/>
-              </w:rPr>
-              <w:t xml:space="preserve"> 1/1</w:t>
             </w:r>
           </w:p>
         </w:tc>
@@ -2985,16 +2974,6 @@
                 <w:i w:val="0"/>
                 <w:sz w:val="14"/>
               </w:rPr>
-              <w:t>Zavakanto – Musique</w:t>
-            </w:r>
-            <w:r>
-              <w:rPr>
-                <w:rFonts w:ascii="Times New Roman" w:hAnsi="Times New Roman" w:cs="Times New Roman" w:eastAsia="Times New Roman"/>
-                <w:b w:val="0"/>
-                <w:color w:val="999999"/>
-                <w:sz w:val="10"/>
-              </w:rPr>
-              <w:t xml:space="preserve"> 1/1</w:t>
             </w:r>
           </w:p>
         </w:tc>
@@ -3016,16 +2995,6 @@
                 <w:i w:val="0"/>
                 <w:sz w:val="14"/>
               </w:rPr>
-              <w:t>Anglais</w:t>
-            </w:r>
-            <w:r>
-              <w:rPr>
-                <w:rFonts w:ascii="Times New Roman" w:hAnsi="Times New Roman" w:cs="Times New Roman" w:eastAsia="Times New Roman"/>
-                <w:b w:val="0"/>
-                <w:color w:val="999999"/>
-                <w:sz w:val="10"/>
-              </w:rPr>
-              <w:t xml:space="preserve"> 3/3</w:t>
             </w:r>
           </w:p>
         </w:tc>
@@ -3047,16 +3016,6 @@
                 <w:i w:val="0"/>
                 <w:sz w:val="14"/>
               </w:rPr>
-              <w:t>Zavakanto – Danse</w:t>
-            </w:r>
-            <w:r>
-              <w:rPr>
-                <w:rFonts w:ascii="Times New Roman" w:hAnsi="Times New Roman" w:cs="Times New Roman" w:eastAsia="Times New Roman"/>
-                <w:b w:val="0"/>
-                <w:color w:val="999999"/>
-                <w:sz w:val="10"/>
-              </w:rPr>
-              <w:t xml:space="preserve"> 1/1</w:t>
             </w:r>
           </w:p>
         </w:tc>
@@ -3078,16 +3037,6 @@
                 <w:i w:val="0"/>
                 <w:sz w:val="14"/>
               </w:rPr>
-              <w:t>Zavakanto – Arts dramatiques</w:t>
-            </w:r>
-            <w:r>
-              <w:rPr>
-                <w:rFonts w:ascii="Times New Roman" w:hAnsi="Times New Roman" w:cs="Times New Roman" w:eastAsia="Times New Roman"/>
-                <w:b w:val="0"/>
-                <w:color w:val="999999"/>
-                <w:sz w:val="10"/>
-              </w:rPr>
-              <w:t xml:space="preserve"> 1/1</w:t>
             </w:r>
           </w:p>
         </w:tc>
@@ -3096,7 +3045,13 @@
             <w:tcW w:type="dxa" w:w="113"/>
             <w:shd w:val="clear" w:color="auto" w:fill="FFFFFF"/>
           </w:tcPr>
-          <w:p/>
+          <w:p>
+            <w:r>
+              <w:rPr>
+                <w:rFonts w:ascii="Times New Roman" w:hAnsi="Times New Roman" w:cs="Times New Roman" w:eastAsia="Times New Roman"/>
+              </w:rPr>
+            </w:r>
+          </w:p>
         </w:tc>
         <w:tc>
           <w:tcPr>

</xml_diff>

<commit_message>
EDT T5 v3.1: Matematika -> Mathematiques (intitule officiel PE T5 p.86, discipline en francais)
Co-authored-by: arena-agent <297053741+arena-agent@users.noreply.github.com>
</commit_message>
<xml_diff>
--- a/EDT/emploi_du_temps_T5.docx
+++ b/EDT/emploi_du_temps_T5.docx
@@ -765,7 +765,7 @@
                 <w:i w:val="0"/>
                 <w:sz w:val="14"/>
               </w:rPr>
-              <w:t>Matematika – Nombre</w:t>
+              <w:t>Mathématiques – Nombre</w:t>
             </w:r>
             <w:r>
               <w:rPr>
@@ -795,7 +795,7 @@
                 <w:i w:val="0"/>
                 <w:sz w:val="14"/>
               </w:rPr>
-              <w:t>Matematika – Nombre</w:t>
+              <w:t>Mathématiques – Nombre</w:t>
             </w:r>
             <w:r>
               <w:rPr>
@@ -825,7 +825,7 @@
                 <w:i w:val="0"/>
                 <w:sz w:val="14"/>
               </w:rPr>
-              <w:t>Matematika – Algèbre</w:t>
+              <w:t>Mathématiques – Algèbre</w:t>
             </w:r>
             <w:r>
               <w:rPr>
@@ -855,7 +855,7 @@
                 <w:i w:val="0"/>
                 <w:sz w:val="14"/>
               </w:rPr>
-              <w:t>Matematika – Nombre</w:t>
+              <w:t>Mathématiques – Nombre</w:t>
             </w:r>
             <w:r>
               <w:rPr>
@@ -885,7 +885,7 @@
                 <w:i w:val="0"/>
                 <w:sz w:val="14"/>
               </w:rPr>
-              <w:t>Matematika – Mesure</w:t>
+              <w:t>Mathématiques – Mesure</w:t>
             </w:r>
             <w:r>
               <w:rPr>
@@ -1145,7 +1145,7 @@
                 <w:i w:val="0"/>
                 <w:sz w:val="14"/>
               </w:rPr>
-              <w:t>Matematika</w:t>
+              <w:t>Mathématiques</w:t>
             </w:r>
           </w:p>
         </w:tc>
@@ -1211,7 +1211,7 @@
                 <w:i w:val="0"/>
                 <w:sz w:val="14"/>
               </w:rPr>
-              <w:t>Matematika – Opération</w:t>
+              <w:t>Mathématiques – Opération</w:t>
             </w:r>
             <w:r>
               <w:rPr>
@@ -1241,7 +1241,7 @@
                 <w:i w:val="0"/>
                 <w:sz w:val="14"/>
               </w:rPr>
-              <w:t>Matematika – Opération</w:t>
+              <w:t>Mathématiques – Opération</w:t>
             </w:r>
             <w:r>
               <w:rPr>
@@ -1301,7 +1301,7 @@
                 <w:i w:val="0"/>
                 <w:sz w:val="14"/>
               </w:rPr>
-              <w:t>Matematika – Opération</w:t>
+              <w:t>Mathématiques – Opération</w:t>
             </w:r>
             <w:r>
               <w:rPr>
@@ -1331,7 +1331,7 @@
                 <w:i w:val="0"/>
                 <w:sz w:val="14"/>
               </w:rPr>
-              <w:t>Matematika – Trait. de données</w:t>
+              <w:t>Mathématiques – Trait. de données</w:t>
             </w:r>
             <w:r>
               <w:rPr>
@@ -2539,7 +2539,7 @@
                 <w:i w:val="0"/>
                 <w:sz w:val="14"/>
               </w:rPr>
-              <w:t>Matematika – Géométrie</w:t>
+              <w:t>Mathématiques – Géométrie</w:t>
             </w:r>
             <w:r>
               <w:rPr>
@@ -2569,7 +2569,7 @@
                 <w:i w:val="0"/>
                 <w:sz w:val="14"/>
               </w:rPr>
-              <w:t>Matematika – Mesure</w:t>
+              <w:t>Mathématiques – Mesure</w:t>
             </w:r>
             <w:r>
               <w:rPr>
@@ -2599,7 +2599,7 @@
                 <w:i w:val="0"/>
                 <w:sz w:val="14"/>
               </w:rPr>
-              <w:t>Matematika – Géométrie</w:t>
+              <w:t>Mathématiques – Géométrie</w:t>
             </w:r>
             <w:r>
               <w:rPr>

</xml_diff>

<commit_message>
EDT T5 v4: journee ouverte par l'oral, alternance litteraire/scientifique, Zavakanto en cloture
Co-authored-by: arena-agent <297053741+arena-agent@users.noreply.github.com>
</commit_message>
<xml_diff>
--- a/EDT/emploi_du_temps_T5.docx
+++ b/EDT/emploi_du_temps_T5.docx
@@ -521,7 +521,230 @@
                 <w:i w:val="0"/>
                 <w:sz w:val="14"/>
               </w:rPr>
-              <w:t>7h 30 – 8h 15</w:t>
+              <w:t>7h 30 – 7h 50</w:t>
+            </w:r>
+          </w:p>
+        </w:tc>
+        <w:tc>
+          <w:tcPr>
+            <w:tcW w:type="dxa" w:w="1644"/>
+            <w:vAlign w:val="center"/>
+          </w:tcPr>
+          <w:p>
+            <w:pPr>
+              <w:jc w:val="center"/>
+              <w:spacing w:before="0" w:after="0" w:line="240" w:lineRule="auto"/>
+            </w:pPr>
+            <w:r>
+              <w:rPr>
+                <w:rFonts w:ascii="Times New Roman" w:hAnsi="Times New Roman" w:cs="Times New Roman" w:eastAsia="Times New Roman"/>
+                <w:b w:val="0"/>
+                <w:i w:val="0"/>
+                <w:sz w:val="14"/>
+              </w:rPr>
+              <w:t>Malagasy – Fanehoan-kevitra am-bava</w:t>
+            </w:r>
+            <w:r>
+              <w:rPr>
+                <w:rFonts w:ascii="Times New Roman" w:hAnsi="Times New Roman" w:cs="Times New Roman" w:eastAsia="Times New Roman"/>
+                <w:b w:val="0"/>
+                <w:color w:val="999999"/>
+                <w:sz w:val="10"/>
+              </w:rPr>
+              <w:t xml:space="preserve"> 1/3</w:t>
+            </w:r>
+          </w:p>
+        </w:tc>
+        <w:tc>
+          <w:tcPr>
+            <w:tcW w:type="dxa" w:w="1644"/>
+            <w:vAlign w:val="center"/>
+          </w:tcPr>
+          <w:p>
+            <w:pPr>
+              <w:jc w:val="center"/>
+              <w:spacing w:before="0" w:after="0" w:line="240" w:lineRule="auto"/>
+            </w:pPr>
+            <w:r>
+              <w:rPr>
+                <w:rFonts w:ascii="Times New Roman" w:hAnsi="Times New Roman" w:cs="Times New Roman" w:eastAsia="Times New Roman"/>
+                <w:b w:val="0"/>
+                <w:i w:val="0"/>
+                <w:sz w:val="14"/>
+              </w:rPr>
+              <w:t>Anglais</w:t>
+            </w:r>
+            <w:r>
+              <w:rPr>
+                <w:rFonts w:ascii="Times New Roman" w:hAnsi="Times New Roman" w:cs="Times New Roman" w:eastAsia="Times New Roman"/>
+                <w:b w:val="0"/>
+                <w:color w:val="999999"/>
+                <w:sz w:val="10"/>
+              </w:rPr>
+              <w:t xml:space="preserve"> 1/3</w:t>
+            </w:r>
+          </w:p>
+        </w:tc>
+        <w:tc>
+          <w:tcPr>
+            <w:tcW w:type="dxa" w:w="1644"/>
+            <w:vAlign w:val="center"/>
+          </w:tcPr>
+          <w:p>
+            <w:pPr>
+              <w:jc w:val="center"/>
+              <w:spacing w:before="0" w:after="0" w:line="240" w:lineRule="auto"/>
+            </w:pPr>
+            <w:r>
+              <w:rPr>
+                <w:rFonts w:ascii="Times New Roman" w:hAnsi="Times New Roman" w:cs="Times New Roman" w:eastAsia="Times New Roman"/>
+                <w:b w:val="0"/>
+                <w:i w:val="0"/>
+                <w:sz w:val="14"/>
+              </w:rPr>
+              <w:t>Malagasy – Fanehoan-kevitra am-bava</w:t>
+            </w:r>
+            <w:r>
+              <w:rPr>
+                <w:rFonts w:ascii="Times New Roman" w:hAnsi="Times New Roman" w:cs="Times New Roman" w:eastAsia="Times New Roman"/>
+                <w:b w:val="0"/>
+                <w:color w:val="999999"/>
+                <w:sz w:val="10"/>
+              </w:rPr>
+              <w:t xml:space="preserve"> 2/3</w:t>
+            </w:r>
+          </w:p>
+        </w:tc>
+        <w:tc>
+          <w:tcPr>
+            <w:tcW w:type="dxa" w:w="1644"/>
+            <w:vAlign w:val="center"/>
+          </w:tcPr>
+          <w:p>
+            <w:pPr>
+              <w:jc w:val="center"/>
+              <w:spacing w:before="0" w:after="0" w:line="240" w:lineRule="auto"/>
+            </w:pPr>
+            <w:r>
+              <w:rPr>
+                <w:rFonts w:ascii="Times New Roman" w:hAnsi="Times New Roman" w:cs="Times New Roman" w:eastAsia="Times New Roman"/>
+                <w:b w:val="0"/>
+                <w:i w:val="0"/>
+                <w:sz w:val="14"/>
+              </w:rPr>
+              <w:t>Anglais</w:t>
+            </w:r>
+            <w:r>
+              <w:rPr>
+                <w:rFonts w:ascii="Times New Roman" w:hAnsi="Times New Roman" w:cs="Times New Roman" w:eastAsia="Times New Roman"/>
+                <w:b w:val="0"/>
+                <w:color w:val="999999"/>
+                <w:sz w:val="10"/>
+              </w:rPr>
+              <w:t xml:space="preserve"> 3/3</w:t>
+            </w:r>
+          </w:p>
+        </w:tc>
+        <w:tc>
+          <w:tcPr>
+            <w:tcW w:type="dxa" w:w="1644"/>
+            <w:vAlign w:val="center"/>
+          </w:tcPr>
+          <w:p>
+            <w:pPr>
+              <w:jc w:val="center"/>
+              <w:spacing w:before="0" w:after="0" w:line="240" w:lineRule="auto"/>
+            </w:pPr>
+            <w:r>
+              <w:rPr>
+                <w:rFonts w:ascii="Times New Roman" w:hAnsi="Times New Roman" w:cs="Times New Roman" w:eastAsia="Times New Roman"/>
+                <w:b w:val="0"/>
+                <w:i w:val="0"/>
+                <w:sz w:val="14"/>
+              </w:rPr>
+              <w:t>Malagasy – Fanehoan-kevitra am-bava</w:t>
+            </w:r>
+            <w:r>
+              <w:rPr>
+                <w:rFonts w:ascii="Times New Roman" w:hAnsi="Times New Roman" w:cs="Times New Roman" w:eastAsia="Times New Roman"/>
+                <w:b w:val="0"/>
+                <w:color w:val="999999"/>
+                <w:sz w:val="10"/>
+              </w:rPr>
+              <w:t xml:space="preserve"> 3/3</w:t>
+            </w:r>
+          </w:p>
+        </w:tc>
+        <w:tc>
+          <w:tcPr>
+            <w:tcW w:type="dxa" w:w="113"/>
+            <w:shd w:val="clear" w:color="auto" w:fill="FFFFFF"/>
+          </w:tcPr>
+          <w:p/>
+        </w:tc>
+        <w:tc>
+          <w:tcPr>
+            <w:tcW w:type="dxa" w:w="1190"/>
+            <w:vAlign w:val="center"/>
+          </w:tcPr>
+          <w:p>
+            <w:pPr>
+              <w:jc w:val="left"/>
+              <w:spacing w:before="0" w:after="0" w:line="240" w:lineRule="auto"/>
+            </w:pPr>
+            <w:r>
+              <w:rPr>
+                <w:rFonts w:ascii="Times New Roman" w:hAnsi="Times New Roman" w:cs="Times New Roman" w:eastAsia="Times New Roman"/>
+                <w:b w:val="0"/>
+                <w:i w:val="0"/>
+                <w:sz w:val="14"/>
+              </w:rPr>
+              <w:t>Malagasy</w:t>
+            </w:r>
+          </w:p>
+        </w:tc>
+        <w:tc>
+          <w:tcPr>
+            <w:tcW w:type="dxa" w:w="3344"/>
+            <w:vAlign w:val="center"/>
+          </w:tcPr>
+          <w:p>
+            <w:pPr>
+              <w:jc w:val="left"/>
+              <w:spacing w:before="0" w:after="0" w:line="240" w:lineRule="auto"/>
+            </w:pPr>
+            <w:r>
+              <w:rPr>
+                <w:rFonts w:ascii="Times New Roman" w:hAnsi="Times New Roman" w:cs="Times New Roman" w:eastAsia="Times New Roman"/>
+                <w:b w:val="0"/>
+                <w:i w:val="0"/>
+                <w:sz w:val="13"/>
+              </w:rPr>
+              <w:t>4h (240 min) : Fanehoan-kevitra am-bava 20 min × 3 ; Vakiteny, Fiasan’ny teny, Asa an-tsoratra 30 min × 2 chacun</w:t>
+            </w:r>
+          </w:p>
+        </w:tc>
+      </w:tr>
+      <w:tr>
+        <w:tc>
+          <w:tcPr>
+            <w:tcW w:type="dxa" w:w="1133"/>
+            <w:vAlign w:val="center"/>
+            <w:shd w:val="clear" w:color="auto" w:fill="6DFFE3"/>
+          </w:tcPr>
+          <w:p>
+            <w:pPr>
+              <w:jc w:val="center"/>
+              <w:spacing w:before="0" w:after="0" w:line="240" w:lineRule="auto"/>
+            </w:pPr>
+            <w:r>
+              <w:rPr>
+                <w:rFonts w:ascii="Times New Roman" w:hAnsi="Times New Roman" w:cs="Times New Roman" w:eastAsia="Times New Roman"/>
+                <w:b/>
+                <w:i w:val="0"/>
+                <w:sz w:val="14"/>
+              </w:rPr>
+              <w:t>7h 50 – 8h 35</w:t>
             </w:r>
           </w:p>
         </w:tc>
@@ -662,200 +885,7 @@
                 <w:i w:val="0"/>
                 <w:sz w:val="14"/>
               </w:rPr>
-              <w:t>Sciences et Technologie</w:t>
-            </w:r>
-            <w:r>
-              <w:rPr>
-                <w:rFonts w:ascii="Times New Roman" w:hAnsi="Times New Roman" w:cs="Times New Roman" w:eastAsia="Times New Roman"/>
-                <w:b w:val="0"/>
-                <w:color w:val="999999"/>
-                <w:sz w:val="10"/>
-              </w:rPr>
-              <w:t xml:space="preserve"> 4/4</w:t>
-            </w:r>
-          </w:p>
-        </w:tc>
-        <w:tc>
-          <w:tcPr>
-            <w:tcW w:type="dxa" w:w="113"/>
-            <w:shd w:val="clear" w:color="auto" w:fill="FFFFFF"/>
-          </w:tcPr>
-          <w:p/>
-        </w:tc>
-        <w:tc>
-          <w:tcPr>
-            <w:tcW w:type="dxa" w:w="1190"/>
-            <w:vAlign w:val="center"/>
-          </w:tcPr>
-          <w:p>
-            <w:pPr>
-              <w:jc w:val="left"/>
-              <w:spacing w:before="0" w:after="0" w:line="240" w:lineRule="auto"/>
-            </w:pPr>
-            <w:r>
-              <w:rPr>
-                <w:rFonts w:ascii="Times New Roman" w:hAnsi="Times New Roman" w:cs="Times New Roman" w:eastAsia="Times New Roman"/>
-                <w:b w:val="0"/>
-                <w:i w:val="0"/>
-                <w:sz w:val="14"/>
-              </w:rPr>
-              <w:t>Malagasy</w:t>
-            </w:r>
-          </w:p>
-        </w:tc>
-        <w:tc>
-          <w:tcPr>
-            <w:tcW w:type="dxa" w:w="3344"/>
-            <w:vAlign w:val="center"/>
-          </w:tcPr>
-          <w:p>
-            <w:pPr>
-              <w:jc w:val="left"/>
-              <w:spacing w:before="0" w:after="0" w:line="240" w:lineRule="auto"/>
-            </w:pPr>
-            <w:r>
-              <w:rPr>
-                <w:rFonts w:ascii="Times New Roman" w:hAnsi="Times New Roman" w:cs="Times New Roman" w:eastAsia="Times New Roman"/>
-                <w:b w:val="0"/>
-                <w:i w:val="0"/>
-                <w:sz w:val="13"/>
-              </w:rPr>
-              <w:t>4h (240 min) : Fanehoan-kevitra am-bava 20 min × 3 ; Vakiteny, Fiasan’ny teny, Asa an-tsoratra 30 min × 2 chacun</w:t>
-            </w:r>
-          </w:p>
-        </w:tc>
-      </w:tr>
-      <w:tr>
-        <w:tc>
-          <w:tcPr>
-            <w:tcW w:type="dxa" w:w="1133"/>
-            <w:vAlign w:val="center"/>
-            <w:shd w:val="clear" w:color="auto" w:fill="6DFFE3"/>
-          </w:tcPr>
-          <w:p>
-            <w:pPr>
-              <w:jc w:val="center"/>
-              <w:spacing w:before="0" w:after="0" w:line="240" w:lineRule="auto"/>
-            </w:pPr>
-            <w:r>
-              <w:rPr>
-                <w:rFonts w:ascii="Times New Roman" w:hAnsi="Times New Roman" w:cs="Times New Roman" w:eastAsia="Times New Roman"/>
-                <w:b/>
-                <w:i w:val="0"/>
-                <w:sz w:val="14"/>
-              </w:rPr>
-              <w:t>8h 15 – 8h 45</w:t>
-            </w:r>
-          </w:p>
-        </w:tc>
-        <w:tc>
-          <w:tcPr>
-            <w:tcW w:type="dxa" w:w="1644"/>
-            <w:vAlign w:val="center"/>
-          </w:tcPr>
-          <w:p>
-            <w:pPr>
-              <w:jc w:val="center"/>
-              <w:spacing w:before="0" w:after="0" w:line="240" w:lineRule="auto"/>
-            </w:pPr>
-            <w:r>
-              <w:rPr>
-                <w:rFonts w:ascii="Times New Roman" w:hAnsi="Times New Roman" w:cs="Times New Roman" w:eastAsia="Times New Roman"/>
-                <w:b w:val="0"/>
-                <w:i w:val="0"/>
-                <w:sz w:val="14"/>
-              </w:rPr>
-              <w:t>Mathématiques – Nombre</w:t>
-            </w:r>
-            <w:r>
-              <w:rPr>
-                <w:rFonts w:ascii="Times New Roman" w:hAnsi="Times New Roman" w:cs="Times New Roman" w:eastAsia="Times New Roman"/>
-                <w:b w:val="0"/>
-                <w:color w:val="999999"/>
-                <w:sz w:val="10"/>
-              </w:rPr>
-              <w:t xml:space="preserve"> 1/3</w:t>
-            </w:r>
-          </w:p>
-        </w:tc>
-        <w:tc>
-          <w:tcPr>
-            <w:tcW w:type="dxa" w:w="1644"/>
-            <w:vAlign w:val="center"/>
-          </w:tcPr>
-          <w:p>
-            <w:pPr>
-              <w:jc w:val="center"/>
-              <w:spacing w:before="0" w:after="0" w:line="240" w:lineRule="auto"/>
-            </w:pPr>
-            <w:r>
-              <w:rPr>
-                <w:rFonts w:ascii="Times New Roman" w:hAnsi="Times New Roman" w:cs="Times New Roman" w:eastAsia="Times New Roman"/>
-                <w:b w:val="0"/>
-                <w:i w:val="0"/>
-                <w:sz w:val="14"/>
-              </w:rPr>
-              <w:t>Mathématiques – Nombre</w:t>
-            </w:r>
-            <w:r>
-              <w:rPr>
-                <w:rFonts w:ascii="Times New Roman" w:hAnsi="Times New Roman" w:cs="Times New Roman" w:eastAsia="Times New Roman"/>
-                <w:b w:val="0"/>
-                <w:color w:val="999999"/>
-                <w:sz w:val="10"/>
-              </w:rPr>
-              <w:t xml:space="preserve"> 2/3</w:t>
-            </w:r>
-          </w:p>
-        </w:tc>
-        <w:tc>
-          <w:tcPr>
-            <w:tcW w:type="dxa" w:w="1644"/>
-            <w:vAlign w:val="center"/>
-          </w:tcPr>
-          <w:p>
-            <w:pPr>
-              <w:jc w:val="center"/>
-              <w:spacing w:before="0" w:after="0" w:line="240" w:lineRule="auto"/>
-            </w:pPr>
-            <w:r>
-              <w:rPr>
-                <w:rFonts w:ascii="Times New Roman" w:hAnsi="Times New Roman" w:cs="Times New Roman" w:eastAsia="Times New Roman"/>
-                <w:b w:val="0"/>
-                <w:i w:val="0"/>
-                <w:sz w:val="14"/>
-              </w:rPr>
-              <w:t>Mathématiques – Algèbre</w:t>
-            </w:r>
-            <w:r>
-              <w:rPr>
-                <w:rFonts w:ascii="Times New Roman" w:hAnsi="Times New Roman" w:cs="Times New Roman" w:eastAsia="Times New Roman"/>
-                <w:b w:val="0"/>
-                <w:color w:val="999999"/>
-                <w:sz w:val="10"/>
-              </w:rPr>
-              <w:t xml:space="preserve"> 1/1</w:t>
-            </w:r>
-          </w:p>
-        </w:tc>
-        <w:tc>
-          <w:tcPr>
-            <w:tcW w:type="dxa" w:w="1644"/>
-            <w:vAlign w:val="center"/>
-          </w:tcPr>
-          <w:p>
-            <w:pPr>
-              <w:jc w:val="center"/>
-              <w:spacing w:before="0" w:after="0" w:line="240" w:lineRule="auto"/>
-            </w:pPr>
-            <w:r>
-              <w:rPr>
-                <w:rFonts w:ascii="Times New Roman" w:hAnsi="Times New Roman" w:cs="Times New Roman" w:eastAsia="Times New Roman"/>
-                <w:b w:val="0"/>
-                <w:i w:val="0"/>
-                <w:sz w:val="14"/>
-              </w:rPr>
-              <w:t>Mathématiques – Nombre</w:t>
+              <w:t>EPS</w:t>
             </w:r>
             <w:r>
               <w:rPr>
@@ -865,36 +895,6 @@
                 <w:sz w:val="10"/>
               </w:rPr>
               <w:t xml:space="preserve"> 3/3</w:t>
-            </w:r>
-          </w:p>
-        </w:tc>
-        <w:tc>
-          <w:tcPr>
-            <w:tcW w:type="dxa" w:w="1644"/>
-            <w:vAlign w:val="center"/>
-          </w:tcPr>
-          <w:p>
-            <w:pPr>
-              <w:jc w:val="center"/>
-              <w:spacing w:before="0" w:after="0" w:line="240" w:lineRule="auto"/>
-            </w:pPr>
-            <w:r>
-              <w:rPr>
-                <w:rFonts w:ascii="Times New Roman" w:hAnsi="Times New Roman" w:cs="Times New Roman" w:eastAsia="Times New Roman"/>
-                <w:b w:val="0"/>
-                <w:i w:val="0"/>
-                <w:sz w:val="14"/>
-              </w:rPr>
-              <w:t>Mathématiques – Mesure</w:t>
-            </w:r>
-            <w:r>
-              <w:rPr>
-                <w:rFonts w:ascii="Times New Roman" w:hAnsi="Times New Roman" w:cs="Times New Roman" w:eastAsia="Times New Roman"/>
-                <w:b w:val="0"/>
-                <w:color w:val="999999"/>
-                <w:sz w:val="10"/>
-              </w:rPr>
-              <w:t xml:space="preserve"> 2/2</w:t>
             </w:r>
           </w:p>
         </w:tc>
@@ -967,7 +967,230 @@
                 <w:i w:val="0"/>
                 <w:sz w:val="14"/>
               </w:rPr>
-              <w:t>8h 45 – 9h 15</w:t>
+              <w:t>8h 35 – 9h 05</w:t>
+            </w:r>
+          </w:p>
+        </w:tc>
+        <w:tc>
+          <w:tcPr>
+            <w:tcW w:type="dxa" w:w="1644"/>
+            <w:vAlign w:val="center"/>
+          </w:tcPr>
+          <w:p>
+            <w:pPr>
+              <w:jc w:val="center"/>
+              <w:spacing w:before="0" w:after="0" w:line="240" w:lineRule="auto"/>
+            </w:pPr>
+            <w:r>
+              <w:rPr>
+                <w:rFonts w:ascii="Times New Roman" w:hAnsi="Times New Roman" w:cs="Times New Roman" w:eastAsia="Times New Roman"/>
+                <w:b w:val="0"/>
+                <w:i w:val="0"/>
+                <w:sz w:val="14"/>
+              </w:rPr>
+              <w:t>Mathématiques – Nombre</w:t>
+            </w:r>
+            <w:r>
+              <w:rPr>
+                <w:rFonts w:ascii="Times New Roman" w:hAnsi="Times New Roman" w:cs="Times New Roman" w:eastAsia="Times New Roman"/>
+                <w:b w:val="0"/>
+                <w:color w:val="999999"/>
+                <w:sz w:val="10"/>
+              </w:rPr>
+              <w:t xml:space="preserve"> 1/3</w:t>
+            </w:r>
+          </w:p>
+        </w:tc>
+        <w:tc>
+          <w:tcPr>
+            <w:tcW w:type="dxa" w:w="1644"/>
+            <w:vAlign w:val="center"/>
+          </w:tcPr>
+          <w:p>
+            <w:pPr>
+              <w:jc w:val="center"/>
+              <w:spacing w:before="0" w:after="0" w:line="240" w:lineRule="auto"/>
+            </w:pPr>
+            <w:r>
+              <w:rPr>
+                <w:rFonts w:ascii="Times New Roman" w:hAnsi="Times New Roman" w:cs="Times New Roman" w:eastAsia="Times New Roman"/>
+                <w:b w:val="0"/>
+                <w:i w:val="0"/>
+                <w:sz w:val="14"/>
+              </w:rPr>
+              <w:t>Mathématiques – Opération</w:t>
+            </w:r>
+            <w:r>
+              <w:rPr>
+                <w:rFonts w:ascii="Times New Roman" w:hAnsi="Times New Roman" w:cs="Times New Roman" w:eastAsia="Times New Roman"/>
+                <w:b w:val="0"/>
+                <w:color w:val="999999"/>
+                <w:sz w:val="10"/>
+              </w:rPr>
+              <w:t xml:space="preserve"> 1/3</w:t>
+            </w:r>
+          </w:p>
+        </w:tc>
+        <w:tc>
+          <w:tcPr>
+            <w:tcW w:type="dxa" w:w="1644"/>
+            <w:vAlign w:val="center"/>
+          </w:tcPr>
+          <w:p>
+            <w:pPr>
+              <w:jc w:val="center"/>
+              <w:spacing w:before="0" w:after="0" w:line="240" w:lineRule="auto"/>
+            </w:pPr>
+            <w:r>
+              <w:rPr>
+                <w:rFonts w:ascii="Times New Roman" w:hAnsi="Times New Roman" w:cs="Times New Roman" w:eastAsia="Times New Roman"/>
+                <w:b w:val="0"/>
+                <w:i w:val="0"/>
+                <w:sz w:val="14"/>
+              </w:rPr>
+              <w:t>Mathématiques – Nombre</w:t>
+            </w:r>
+            <w:r>
+              <w:rPr>
+                <w:rFonts w:ascii="Times New Roman" w:hAnsi="Times New Roman" w:cs="Times New Roman" w:eastAsia="Times New Roman"/>
+                <w:b w:val="0"/>
+                <w:color w:val="999999"/>
+                <w:sz w:val="10"/>
+              </w:rPr>
+              <w:t xml:space="preserve"> 2/3</w:t>
+            </w:r>
+          </w:p>
+        </w:tc>
+        <w:tc>
+          <w:tcPr>
+            <w:tcW w:type="dxa" w:w="1644"/>
+            <w:vAlign w:val="center"/>
+          </w:tcPr>
+          <w:p>
+            <w:pPr>
+              <w:jc w:val="center"/>
+              <w:spacing w:before="0" w:after="0" w:line="240" w:lineRule="auto"/>
+            </w:pPr>
+            <w:r>
+              <w:rPr>
+                <w:rFonts w:ascii="Times New Roman" w:hAnsi="Times New Roman" w:cs="Times New Roman" w:eastAsia="Times New Roman"/>
+                <w:b w:val="0"/>
+                <w:i w:val="0"/>
+                <w:sz w:val="14"/>
+              </w:rPr>
+              <w:t>Mathématiques – Opération</w:t>
+            </w:r>
+            <w:r>
+              <w:rPr>
+                <w:rFonts w:ascii="Times New Roman" w:hAnsi="Times New Roman" w:cs="Times New Roman" w:eastAsia="Times New Roman"/>
+                <w:b w:val="0"/>
+                <w:color w:val="999999"/>
+                <w:sz w:val="10"/>
+              </w:rPr>
+              <w:t xml:space="preserve"> 2/3</w:t>
+            </w:r>
+          </w:p>
+        </w:tc>
+        <w:tc>
+          <w:tcPr>
+            <w:tcW w:type="dxa" w:w="1644"/>
+            <w:vAlign w:val="center"/>
+          </w:tcPr>
+          <w:p>
+            <w:pPr>
+              <w:jc w:val="center"/>
+              <w:spacing w:before="0" w:after="0" w:line="240" w:lineRule="auto"/>
+            </w:pPr>
+            <w:r>
+              <w:rPr>
+                <w:rFonts w:ascii="Times New Roman" w:hAnsi="Times New Roman" w:cs="Times New Roman" w:eastAsia="Times New Roman"/>
+                <w:b w:val="0"/>
+                <w:i w:val="0"/>
+                <w:sz w:val="14"/>
+              </w:rPr>
+              <w:t>Mathématiques – Nombre</w:t>
+            </w:r>
+            <w:r>
+              <w:rPr>
+                <w:rFonts w:ascii="Times New Roman" w:hAnsi="Times New Roman" w:cs="Times New Roman" w:eastAsia="Times New Roman"/>
+                <w:b w:val="0"/>
+                <w:color w:val="999999"/>
+                <w:sz w:val="10"/>
+              </w:rPr>
+              <w:t xml:space="preserve"> 3/3</w:t>
+            </w:r>
+          </w:p>
+        </w:tc>
+        <w:tc>
+          <w:tcPr>
+            <w:tcW w:type="dxa" w:w="113"/>
+            <w:shd w:val="clear" w:color="auto" w:fill="FFFFFF"/>
+          </w:tcPr>
+          <w:p/>
+        </w:tc>
+        <w:tc>
+          <w:tcPr>
+            <w:tcW w:type="dxa" w:w="1190"/>
+            <w:vAlign w:val="center"/>
+          </w:tcPr>
+          <w:p>
+            <w:pPr>
+              <w:jc w:val="left"/>
+              <w:spacing w:before="0" w:after="0" w:line="240" w:lineRule="auto"/>
+            </w:pPr>
+            <w:r>
+              <w:rPr>
+                <w:rFonts w:ascii="Times New Roman" w:hAnsi="Times New Roman" w:cs="Times New Roman" w:eastAsia="Times New Roman"/>
+                <w:b w:val="0"/>
+                <w:i w:val="0"/>
+                <w:sz w:val="14"/>
+              </w:rPr>
+              <w:t>Mathématiques</w:t>
+            </w:r>
+          </w:p>
+        </w:tc>
+        <w:tc>
+          <w:tcPr>
+            <w:tcW w:type="dxa" w:w="3344"/>
+            <w:vAlign w:val="center"/>
+          </w:tcPr>
+          <w:p>
+            <w:pPr>
+              <w:jc w:val="left"/>
+              <w:spacing w:before="0" w:after="0" w:line="240" w:lineRule="auto"/>
+            </w:pPr>
+            <w:r>
+              <w:rPr>
+                <w:rFonts w:ascii="Times New Roman" w:hAnsi="Times New Roman" w:cs="Times New Roman" w:eastAsia="Times New Roman"/>
+                <w:b w:val="0"/>
+                <w:i w:val="0"/>
+                <w:sz w:val="13"/>
+              </w:rPr>
+              <w:t>6h (360 min) = 30 min × 12</w:t>
+            </w:r>
+          </w:p>
+        </w:tc>
+      </w:tr>
+      <w:tr>
+        <w:tc>
+          <w:tcPr>
+            <w:tcW w:type="dxa" w:w="1133"/>
+            <w:vAlign w:val="center"/>
+            <w:shd w:val="clear" w:color="auto" w:fill="6DFFE3"/>
+          </w:tcPr>
+          <w:p>
+            <w:pPr>
+              <w:jc w:val="center"/>
+              <w:spacing w:before="0" w:after="0" w:line="240" w:lineRule="auto"/>
+            </w:pPr>
+            <w:r>
+              <w:rPr>
+                <w:rFonts w:ascii="Times New Roman" w:hAnsi="Times New Roman" w:cs="Times New Roman" w:eastAsia="Times New Roman"/>
+                <w:b/>
+                <w:i w:val="0"/>
+                <w:sz w:val="14"/>
+              </w:rPr>
+              <w:t>9h 05 – 9h 35</w:t>
             </w:r>
           </w:p>
         </w:tc>
@@ -1145,229 +1368,6 @@
                 <w:i w:val="0"/>
                 <w:sz w:val="14"/>
               </w:rPr>
-              <w:t>Mathématiques</w:t>
-            </w:r>
-          </w:p>
-        </w:tc>
-        <w:tc>
-          <w:tcPr>
-            <w:tcW w:type="dxa" w:w="3344"/>
-            <w:vAlign w:val="center"/>
-          </w:tcPr>
-          <w:p>
-            <w:pPr>
-              <w:jc w:val="left"/>
-              <w:spacing w:before="0" w:after="0" w:line="240" w:lineRule="auto"/>
-            </w:pPr>
-            <w:r>
-              <w:rPr>
-                <w:rFonts w:ascii="Times New Roman" w:hAnsi="Times New Roman" w:cs="Times New Roman" w:eastAsia="Times New Roman"/>
-                <w:b w:val="0"/>
-                <w:i w:val="0"/>
-                <w:sz w:val="13"/>
-              </w:rPr>
-              <w:t>6h (360 min) = 30 min × 12</w:t>
-            </w:r>
-          </w:p>
-        </w:tc>
-      </w:tr>
-      <w:tr>
-        <w:tc>
-          <w:tcPr>
-            <w:tcW w:type="dxa" w:w="1133"/>
-            <w:vAlign w:val="center"/>
-            <w:shd w:val="clear" w:color="auto" w:fill="6DFFE3"/>
-          </w:tcPr>
-          <w:p>
-            <w:pPr>
-              <w:jc w:val="center"/>
-              <w:spacing w:before="0" w:after="0" w:line="240" w:lineRule="auto"/>
-            </w:pPr>
-            <w:r>
-              <w:rPr>
-                <w:rFonts w:ascii="Times New Roman" w:hAnsi="Times New Roman" w:cs="Times New Roman" w:eastAsia="Times New Roman"/>
-                <w:b/>
-                <w:i w:val="0"/>
-                <w:sz w:val="14"/>
-              </w:rPr>
-              <w:t>9h 15 – 9h 45</w:t>
-            </w:r>
-          </w:p>
-        </w:tc>
-        <w:tc>
-          <w:tcPr>
-            <w:tcW w:type="dxa" w:w="1644"/>
-            <w:vAlign w:val="center"/>
-          </w:tcPr>
-          <w:p>
-            <w:pPr>
-              <w:jc w:val="center"/>
-              <w:spacing w:before="0" w:after="0" w:line="240" w:lineRule="auto"/>
-            </w:pPr>
-            <w:r>
-              <w:rPr>
-                <w:rFonts w:ascii="Times New Roman" w:hAnsi="Times New Roman" w:cs="Times New Roman" w:eastAsia="Times New Roman"/>
-                <w:b w:val="0"/>
-                <w:i w:val="0"/>
-                <w:sz w:val="14"/>
-              </w:rPr>
-              <w:t>Mathématiques – Opération</w:t>
-            </w:r>
-            <w:r>
-              <w:rPr>
-                <w:rFonts w:ascii="Times New Roman" w:hAnsi="Times New Roman" w:cs="Times New Roman" w:eastAsia="Times New Roman"/>
-                <w:b w:val="0"/>
-                <w:color w:val="999999"/>
-                <w:sz w:val="10"/>
-              </w:rPr>
-              <w:t xml:space="preserve"> 1/3</w:t>
-            </w:r>
-          </w:p>
-        </w:tc>
-        <w:tc>
-          <w:tcPr>
-            <w:tcW w:type="dxa" w:w="1644"/>
-            <w:vAlign w:val="center"/>
-          </w:tcPr>
-          <w:p>
-            <w:pPr>
-              <w:jc w:val="center"/>
-              <w:spacing w:before="0" w:after="0" w:line="240" w:lineRule="auto"/>
-            </w:pPr>
-            <w:r>
-              <w:rPr>
-                <w:rFonts w:ascii="Times New Roman" w:hAnsi="Times New Roman" w:cs="Times New Roman" w:eastAsia="Times New Roman"/>
-                <w:b w:val="0"/>
-                <w:i w:val="0"/>
-                <w:sz w:val="14"/>
-              </w:rPr>
-              <w:t>Mathématiques – Opération</w:t>
-            </w:r>
-            <w:r>
-              <w:rPr>
-                <w:rFonts w:ascii="Times New Roman" w:hAnsi="Times New Roman" w:cs="Times New Roman" w:eastAsia="Times New Roman"/>
-                <w:b w:val="0"/>
-                <w:color w:val="999999"/>
-                <w:sz w:val="10"/>
-              </w:rPr>
-              <w:t xml:space="preserve"> 2/3</w:t>
-            </w:r>
-          </w:p>
-        </w:tc>
-        <w:tc>
-          <w:tcPr>
-            <w:tcW w:type="dxa" w:w="1644"/>
-            <w:vAlign w:val="center"/>
-          </w:tcPr>
-          <w:p>
-            <w:pPr>
-              <w:jc w:val="center"/>
-              <w:spacing w:before="0" w:after="0" w:line="240" w:lineRule="auto"/>
-            </w:pPr>
-            <w:r>
-              <w:rPr>
-                <w:rFonts w:ascii="Times New Roman" w:hAnsi="Times New Roman" w:cs="Times New Roman" w:eastAsia="Times New Roman"/>
-                <w:b w:val="0"/>
-                <w:i w:val="0"/>
-                <w:sz w:val="14"/>
-              </w:rPr>
-              <w:t>Malagasy – Asa an-tsoratra</w:t>
-            </w:r>
-            <w:r>
-              <w:rPr>
-                <w:rFonts w:ascii="Times New Roman" w:hAnsi="Times New Roman" w:cs="Times New Roman" w:eastAsia="Times New Roman"/>
-                <w:b w:val="0"/>
-                <w:color w:val="999999"/>
-                <w:sz w:val="10"/>
-              </w:rPr>
-              <w:t xml:space="preserve"> 1/2</w:t>
-            </w:r>
-          </w:p>
-        </w:tc>
-        <w:tc>
-          <w:tcPr>
-            <w:tcW w:type="dxa" w:w="1644"/>
-            <w:vAlign w:val="center"/>
-          </w:tcPr>
-          <w:p>
-            <w:pPr>
-              <w:jc w:val="center"/>
-              <w:spacing w:before="0" w:after="0" w:line="240" w:lineRule="auto"/>
-            </w:pPr>
-            <w:r>
-              <w:rPr>
-                <w:rFonts w:ascii="Times New Roman" w:hAnsi="Times New Roman" w:cs="Times New Roman" w:eastAsia="Times New Roman"/>
-                <w:b w:val="0"/>
-                <w:i w:val="0"/>
-                <w:sz w:val="14"/>
-              </w:rPr>
-              <w:t>Mathématiques – Opération</w:t>
-            </w:r>
-            <w:r>
-              <w:rPr>
-                <w:rFonts w:ascii="Times New Roman" w:hAnsi="Times New Roman" w:cs="Times New Roman" w:eastAsia="Times New Roman"/>
-                <w:b w:val="0"/>
-                <w:color w:val="999999"/>
-                <w:sz w:val="10"/>
-              </w:rPr>
-              <w:t xml:space="preserve"> 3/3</w:t>
-            </w:r>
-          </w:p>
-        </w:tc>
-        <w:tc>
-          <w:tcPr>
-            <w:tcW w:type="dxa" w:w="1644"/>
-            <w:vAlign w:val="center"/>
-          </w:tcPr>
-          <w:p>
-            <w:pPr>
-              <w:jc w:val="center"/>
-              <w:spacing w:before="0" w:after="0" w:line="240" w:lineRule="auto"/>
-            </w:pPr>
-            <w:r>
-              <w:rPr>
-                <w:rFonts w:ascii="Times New Roman" w:hAnsi="Times New Roman" w:cs="Times New Roman" w:eastAsia="Times New Roman"/>
-                <w:b w:val="0"/>
-                <w:i w:val="0"/>
-                <w:sz w:val="14"/>
-              </w:rPr>
-              <w:t>Mathématiques – Trait. de données</w:t>
-            </w:r>
-            <w:r>
-              <w:rPr>
-                <w:rFonts w:ascii="Times New Roman" w:hAnsi="Times New Roman" w:cs="Times New Roman" w:eastAsia="Times New Roman"/>
-                <w:b w:val="0"/>
-                <w:color w:val="999999"/>
-                <w:sz w:val="10"/>
-              </w:rPr>
-              <w:t xml:space="preserve"> 1/1</w:t>
-            </w:r>
-          </w:p>
-        </w:tc>
-        <w:tc>
-          <w:tcPr>
-            <w:tcW w:type="dxa" w:w="113"/>
-            <w:shd w:val="clear" w:color="auto" w:fill="FFFFFF"/>
-          </w:tcPr>
-          <w:p/>
-        </w:tc>
-        <w:tc>
-          <w:tcPr>
-            <w:tcW w:type="dxa" w:w="1190"/>
-            <w:vAlign w:val="center"/>
-          </w:tcPr>
-          <w:p>
-            <w:pPr>
-              <w:jc w:val="left"/>
-              <w:spacing w:before="0" w:after="0" w:line="240" w:lineRule="auto"/>
-            </w:pPr>
-            <w:r>
-              <w:rPr>
-                <w:rFonts w:ascii="Times New Roman" w:hAnsi="Times New Roman" w:cs="Times New Roman" w:eastAsia="Times New Roman"/>
-                <w:b w:val="0"/>
-                <w:i w:val="0"/>
-                <w:sz w:val="14"/>
-              </w:rPr>
               <w:t>Sciences et Technologie</w:t>
             </w:r>
           </w:p>
@@ -1413,7 +1413,7 @@
                 <w:i w:val="0"/>
                 <w:sz w:val="14"/>
               </w:rPr>
-              <w:t>9h 45 – 10h 05</w:t>
+              <w:t>9h 35 – 10h 05</w:t>
             </w:r>
           </w:p>
         </w:tc>
@@ -1434,7 +1434,7 @@
                 <w:i w:val="0"/>
                 <w:sz w:val="14"/>
               </w:rPr>
-              <w:t>Malagasy – Fanehoan-kevitra am-bava</w:t>
+              <w:t>Mathématiques – Mesure</w:t>
             </w:r>
             <w:r>
               <w:rPr>
@@ -1443,7 +1443,7 @@
                 <w:color w:val="999999"/>
                 <w:sz w:val="10"/>
               </w:rPr>
-              <w:t xml:space="preserve"> 1/3</w:t>
+              <w:t xml:space="preserve"> 1/2</w:t>
             </w:r>
           </w:p>
         </w:tc>
@@ -1464,7 +1464,7 @@
                 <w:i w:val="0"/>
                 <w:sz w:val="14"/>
               </w:rPr>
-              <w:t>Anglais</w:t>
+              <w:t>Mathématiques – Géométrie</w:t>
             </w:r>
             <w:r>
               <w:rPr>
@@ -1473,7 +1473,7 @@
                 <w:color w:val="999999"/>
                 <w:sz w:val="10"/>
               </w:rPr>
-              <w:t xml:space="preserve"> 1/3</w:t>
+              <w:t xml:space="preserve"> 1/2</w:t>
             </w:r>
           </w:p>
         </w:tc>
@@ -1494,7 +1494,7 @@
                 <w:i w:val="0"/>
                 <w:sz w:val="14"/>
               </w:rPr>
-              <w:t>Malagasy – Fanehoan-kevitra am-bava</w:t>
+              <w:t>Mathématiques – Mesure</w:t>
             </w:r>
             <w:r>
               <w:rPr>
@@ -1503,7 +1503,7 @@
                 <w:color w:val="999999"/>
                 <w:sz w:val="10"/>
               </w:rPr>
-              <w:t xml:space="preserve"> 2/3</w:t>
+              <w:t xml:space="preserve"> 2/2</w:t>
             </w:r>
           </w:p>
         </w:tc>
@@ -1524,7 +1524,7 @@
                 <w:i w:val="0"/>
                 <w:sz w:val="14"/>
               </w:rPr>
-              <w:t>Anglais</w:t>
+              <w:t>Mathématiques – Géométrie</w:t>
             </w:r>
             <w:r>
               <w:rPr>
@@ -1533,7 +1533,7 @@
                 <w:color w:val="999999"/>
                 <w:sz w:val="10"/>
               </w:rPr>
-              <w:t xml:space="preserve"> 3/3</w:t>
+              <w:t xml:space="preserve"> 2/2</w:t>
             </w:r>
           </w:p>
         </w:tc>
@@ -1554,7 +1554,7 @@
                 <w:i w:val="0"/>
                 <w:sz w:val="14"/>
               </w:rPr>
-              <w:t>Malagasy – Fanehoan-kevitra am-bava</w:t>
+              <w:t>Mathématiques – Opération</w:t>
             </w:r>
             <w:r>
               <w:rPr>
@@ -1909,7 +1909,7 @@
                 <w:color w:val="999999"/>
                 <w:sz w:val="10"/>
               </w:rPr>
-              <w:t xml:space="preserve"> 1/3</w:t>
+              <w:t xml:space="preserve"> 2/3</w:t>
             </w:r>
           </w:p>
         </w:tc>
@@ -1960,7 +1960,7 @@
                 <w:i w:val="0"/>
                 <w:sz w:val="14"/>
               </w:rPr>
-              <w:t>EPS</w:t>
+              <w:t>Sciences et Technologie</w:t>
             </w:r>
             <w:r>
               <w:rPr>
@@ -1969,7 +1969,7 @@
                 <w:color w:val="999999"/>
                 <w:sz w:val="10"/>
               </w:rPr>
-              <w:t xml:space="preserve"> 3/3</w:t>
+              <w:t xml:space="preserve"> 4/4</w:t>
             </w:r>
           </w:p>
         </w:tc>
@@ -2123,7 +2123,7 @@
                 <w:i w:val="0"/>
                 <w:sz w:val="14"/>
               </w:rPr>
-              <w:t>FOV</w:t>
+              <w:t>Tantara</w:t>
             </w:r>
             <w:r>
               <w:rPr>
@@ -2132,7 +2132,7 @@
                 <w:color w:val="999999"/>
                 <w:sz w:val="10"/>
               </w:rPr>
-              <w:t xml:space="preserve"> 2/3</w:t>
+              <w:t xml:space="preserve"> 2/2</w:t>
             </w:r>
           </w:p>
         </w:tc>
@@ -2183,7 +2183,7 @@
                 <w:i w:val="0"/>
                 <w:sz w:val="14"/>
               </w:rPr>
-              <w:t>Français – Fonct. de la langue</w:t>
+              <w:t>FOV</w:t>
             </w:r>
             <w:r>
               <w:rPr>
@@ -2192,7 +2192,7 @@
                 <w:color w:val="999999"/>
                 <w:sz w:val="10"/>
               </w:rPr>
-              <w:t xml:space="preserve"> 2/2</w:t>
+              <w:t xml:space="preserve"> 3/3</w:t>
             </w:r>
           </w:p>
         </w:tc>
@@ -2286,7 +2286,7 @@
                 <w:i w:val="0"/>
                 <w:sz w:val="14"/>
               </w:rPr>
-              <w:t>FOV</w:t>
+              <w:t>EPS</w:t>
             </w:r>
             <w:r>
               <w:rPr>
@@ -2296,6 +2296,36 @@
                 <w:sz w:val="10"/>
               </w:rPr>
               <w:t xml:space="preserve"> 1/3</w:t>
+            </w:r>
+          </w:p>
+        </w:tc>
+        <w:tc>
+          <w:tcPr>
+            <w:tcW w:type="dxa" w:w="1644"/>
+            <w:vAlign w:val="center"/>
+          </w:tcPr>
+          <w:p>
+            <w:pPr>
+              <w:jc w:val="center"/>
+              <w:spacing w:before="0" w:after="0" w:line="240" w:lineRule="auto"/>
+            </w:pPr>
+            <w:r>
+              <w:rPr>
+                <w:rFonts w:ascii="Times New Roman" w:hAnsi="Times New Roman" w:cs="Times New Roman" w:eastAsia="Times New Roman"/>
+                <w:b w:val="0"/>
+                <w:i w:val="0"/>
+                <w:sz w:val="14"/>
+              </w:rPr>
+              <w:t>Mathématiques – Algèbre</w:t>
+            </w:r>
+            <w:r>
+              <w:rPr>
+                <w:rFonts w:ascii="Times New Roman" w:hAnsi="Times New Roman" w:cs="Times New Roman" w:eastAsia="Times New Roman"/>
+                <w:b w:val="0"/>
+                <w:color w:val="999999"/>
+                <w:sz w:val="10"/>
+              </w:rPr>
+              <w:t xml:space="preserve"> 1/1</w:t>
             </w:r>
           </w:p>
         </w:tc>
@@ -2346,7 +2376,7 @@
                 <w:i w:val="0"/>
                 <w:sz w:val="14"/>
               </w:rPr>
-              <w:t>Tantara</w:t>
+              <w:t>Mathématiques – Trait. de données</w:t>
             </w:r>
             <w:r>
               <w:rPr>
@@ -2355,37 +2385,7 @@
                 <w:color w:val="999999"/>
                 <w:sz w:val="10"/>
               </w:rPr>
-              <w:t xml:space="preserve"> 2/2</w:t>
-            </w:r>
-          </w:p>
-        </w:tc>
-        <w:tc>
-          <w:tcPr>
-            <w:tcW w:type="dxa" w:w="1644"/>
-            <w:vAlign w:val="center"/>
-          </w:tcPr>
-          <w:p>
-            <w:pPr>
-              <w:jc w:val="center"/>
-              <w:spacing w:before="0" w:after="0" w:line="240" w:lineRule="auto"/>
-            </w:pPr>
-            <w:r>
-              <w:rPr>
-                <w:rFonts w:ascii="Times New Roman" w:hAnsi="Times New Roman" w:cs="Times New Roman" w:eastAsia="Times New Roman"/>
-                <w:b w:val="0"/>
-                <w:i w:val="0"/>
-                <w:sz w:val="14"/>
-              </w:rPr>
-              <w:t>EPS</w:t>
-            </w:r>
-            <w:r>
-              <w:rPr>
-                <w:rFonts w:ascii="Times New Roman" w:hAnsi="Times New Roman" w:cs="Times New Roman" w:eastAsia="Times New Roman"/>
-                <w:b w:val="0"/>
-                <w:color w:val="999999"/>
-                <w:sz w:val="10"/>
-              </w:rPr>
-              <w:t xml:space="preserve"> 2/3</w:t>
+              <w:t xml:space="preserve"> 1/1</w:t>
             </w:r>
           </w:p>
         </w:tc>
@@ -2509,6 +2509,36 @@
                 <w:i w:val="0"/>
                 <w:sz w:val="14"/>
               </w:rPr>
+              <w:t>FOV</w:t>
+            </w:r>
+            <w:r>
+              <w:rPr>
+                <w:rFonts w:ascii="Times New Roman" w:hAnsi="Times New Roman" w:cs="Times New Roman" w:eastAsia="Times New Roman"/>
+                <w:b w:val="0"/>
+                <w:color w:val="999999"/>
+                <w:sz w:val="10"/>
+              </w:rPr>
+              <w:t xml:space="preserve"> 1/3</w:t>
+            </w:r>
+          </w:p>
+        </w:tc>
+        <w:tc>
+          <w:tcPr>
+            <w:tcW w:type="dxa" w:w="1644"/>
+            <w:vAlign w:val="center"/>
+          </w:tcPr>
+          <w:p>
+            <w:pPr>
+              <w:jc w:val="center"/>
+              <w:spacing w:before="0" w:after="0" w:line="240" w:lineRule="auto"/>
+            </w:pPr>
+            <w:r>
+              <w:rPr>
+                <w:rFonts w:ascii="Times New Roman" w:hAnsi="Times New Roman" w:cs="Times New Roman" w:eastAsia="Times New Roman"/>
+                <w:b w:val="0"/>
+                <w:i w:val="0"/>
+                <w:sz w:val="14"/>
+              </w:rPr>
               <w:t>Français – Fonct. de la langue</w:t>
             </w:r>
             <w:r>
@@ -2539,7 +2569,7 @@
                 <w:i w:val="0"/>
                 <w:sz w:val="14"/>
               </w:rPr>
-              <w:t>Mathématiques – Géométrie</w:t>
+              <w:t>Malagasy – Asa an-tsoratra</w:t>
             </w:r>
             <w:r>
               <w:rPr>
@@ -2569,7 +2599,7 @@
                 <w:i w:val="0"/>
                 <w:sz w:val="14"/>
               </w:rPr>
-              <w:t>Mathématiques – Mesure</w:t>
+              <w:t>FOV</w:t>
             </w:r>
             <w:r>
               <w:rPr>
@@ -2578,7 +2608,7 @@
                 <w:color w:val="999999"/>
                 <w:sz w:val="10"/>
               </w:rPr>
-              <w:t xml:space="preserve"> 1/2</w:t>
+              <w:t xml:space="preserve"> 2/3</w:t>
             </w:r>
           </w:p>
         </w:tc>
@@ -2599,7 +2629,7 @@
                 <w:i w:val="0"/>
                 <w:sz w:val="14"/>
               </w:rPr>
-              <w:t>Mathématiques – Géométrie</w:t>
+              <w:t>Français – Fonct. de la langue</w:t>
             </w:r>
             <w:r>
               <w:rPr>
@@ -2609,36 +2639,6 @@
                 <w:sz w:val="10"/>
               </w:rPr>
               <w:t xml:space="preserve"> 2/2</w:t>
-            </w:r>
-          </w:p>
-        </w:tc>
-        <w:tc>
-          <w:tcPr>
-            <w:tcW w:type="dxa" w:w="1644"/>
-            <w:vAlign w:val="center"/>
-          </w:tcPr>
-          <w:p>
-            <w:pPr>
-              <w:jc w:val="center"/>
-              <w:spacing w:before="0" w:after="0" w:line="240" w:lineRule="auto"/>
-            </w:pPr>
-            <w:r>
-              <w:rPr>
-                <w:rFonts w:ascii="Times New Roman" w:hAnsi="Times New Roman" w:cs="Times New Roman" w:eastAsia="Times New Roman"/>
-                <w:b w:val="0"/>
-                <w:i w:val="0"/>
-                <w:sz w:val="14"/>
-              </w:rPr>
-              <w:t>FOV</w:t>
-            </w:r>
-            <w:r>
-              <w:rPr>
-                <w:rFonts w:ascii="Times New Roman" w:hAnsi="Times New Roman" w:cs="Times New Roman" w:eastAsia="Times New Roman"/>
-                <w:b w:val="0"/>
-                <w:color w:val="999999"/>
-                <w:sz w:val="10"/>
-              </w:rPr>
-              <w:t xml:space="preserve"> 3/3</w:t>
             </w:r>
           </w:p>
         </w:tc>

</xml_diff>

<commit_message>
EDT T1-T5 : deux recreations de 10 min, grilles conformes aux PE (T1 8x20+5x30 ; T2/T3 seances 25 min ; T4 clone T5)
Co-authored-by: arena-agent <297053741+arena-agent@users.noreply.github.com>
</commit_message>
<xml_diff>
--- a/EDT/emploi_du_temps_T5.docx
+++ b/EDT/emploi_du_temps_T5.docx
@@ -1413,7 +1413,7 @@
                 <w:i w:val="0"/>
                 <w:sz w:val="14"/>
               </w:rPr>
-              <w:t>9h 35 – 10h 05</w:t>
+              <w:t>9h 35 – 9h 45</w:t>
             </w:r>
           </w:p>
         </w:tc>
@@ -1421,6 +1421,7 @@
           <w:tcPr>
             <w:tcW w:type="dxa" w:w="1644"/>
             <w:vAlign w:val="center"/>
+            <w:shd w:val="clear" w:color="auto" w:fill="FFFF99"/>
           </w:tcPr>
           <w:p>
             <w:pPr>
@@ -1434,16 +1435,7 @@
                 <w:i w:val="0"/>
                 <w:sz w:val="14"/>
               </w:rPr>
-              <w:t>Mathématiques – Mesure</w:t>
-            </w:r>
-            <w:r>
-              <w:rPr>
-                <w:rFonts w:ascii="Times New Roman" w:hAnsi="Times New Roman" w:cs="Times New Roman" w:eastAsia="Times New Roman"/>
-                <w:b w:val="0"/>
-                <w:color w:val="999999"/>
-                <w:sz w:val="10"/>
-              </w:rPr>
-              <w:t xml:space="preserve"> 1/2</w:t>
+              <w:t>RÉCRÉATION</w:t>
             </w:r>
           </w:p>
         </w:tc>
@@ -1451,6 +1443,7 @@
           <w:tcPr>
             <w:tcW w:type="dxa" w:w="1644"/>
             <w:vAlign w:val="center"/>
+            <w:shd w:val="clear" w:color="auto" w:fill="FFFF99"/>
           </w:tcPr>
           <w:p>
             <w:pPr>
@@ -1464,16 +1457,7 @@
                 <w:i w:val="0"/>
                 <w:sz w:val="14"/>
               </w:rPr>
-              <w:t>Mathématiques – Géométrie</w:t>
-            </w:r>
-            <w:r>
-              <w:rPr>
-                <w:rFonts w:ascii="Times New Roman" w:hAnsi="Times New Roman" w:cs="Times New Roman" w:eastAsia="Times New Roman"/>
-                <w:b w:val="0"/>
-                <w:color w:val="999999"/>
-                <w:sz w:val="10"/>
-              </w:rPr>
-              <w:t xml:space="preserve"> 1/2</w:t>
+              <w:t>RÉCRÉATION</w:t>
             </w:r>
           </w:p>
         </w:tc>
@@ -1481,6 +1465,7 @@
           <w:tcPr>
             <w:tcW w:type="dxa" w:w="1644"/>
             <w:vAlign w:val="center"/>
+            <w:shd w:val="clear" w:color="auto" w:fill="FFFF99"/>
           </w:tcPr>
           <w:p>
             <w:pPr>
@@ -1494,16 +1479,7 @@
                 <w:i w:val="0"/>
                 <w:sz w:val="14"/>
               </w:rPr>
-              <w:t>Mathématiques – Mesure</w:t>
-            </w:r>
-            <w:r>
-              <w:rPr>
-                <w:rFonts w:ascii="Times New Roman" w:hAnsi="Times New Roman" w:cs="Times New Roman" w:eastAsia="Times New Roman"/>
-                <w:b w:val="0"/>
-                <w:color w:val="999999"/>
-                <w:sz w:val="10"/>
-              </w:rPr>
-              <w:t xml:space="preserve"> 2/2</w:t>
+              <w:t>RÉCRÉATION</w:t>
             </w:r>
           </w:p>
         </w:tc>
@@ -1511,6 +1487,7 @@
           <w:tcPr>
             <w:tcW w:type="dxa" w:w="1644"/>
             <w:vAlign w:val="center"/>
+            <w:shd w:val="clear" w:color="auto" w:fill="FFFF99"/>
           </w:tcPr>
           <w:p>
             <w:pPr>
@@ -1524,16 +1501,7 @@
                 <w:i w:val="0"/>
                 <w:sz w:val="14"/>
               </w:rPr>
-              <w:t>Mathématiques – Géométrie</w:t>
-            </w:r>
-            <w:r>
-              <w:rPr>
-                <w:rFonts w:ascii="Times New Roman" w:hAnsi="Times New Roman" w:cs="Times New Roman" w:eastAsia="Times New Roman"/>
-                <w:b w:val="0"/>
-                <w:color w:val="999999"/>
-                <w:sz w:val="10"/>
-              </w:rPr>
-              <w:t xml:space="preserve"> 2/2</w:t>
+              <w:t>RÉCRÉATION</w:t>
             </w:r>
           </w:p>
         </w:tc>
@@ -1541,6 +1509,7 @@
           <w:tcPr>
             <w:tcW w:type="dxa" w:w="1644"/>
             <w:vAlign w:val="center"/>
+            <w:shd w:val="clear" w:color="auto" w:fill="FFFF99"/>
           </w:tcPr>
           <w:p>
             <w:pPr>
@@ -1554,16 +1523,7 @@
                 <w:i w:val="0"/>
                 <w:sz w:val="14"/>
               </w:rPr>
-              <w:t>Mathématiques – Opération</w:t>
-            </w:r>
-            <w:r>
-              <w:rPr>
-                <w:rFonts w:ascii="Times New Roman" w:hAnsi="Times New Roman" w:cs="Times New Roman" w:eastAsia="Times New Roman"/>
-                <w:b w:val="0"/>
-                <w:color w:val="999999"/>
-                <w:sz w:val="10"/>
-              </w:rPr>
-              <w:t xml:space="preserve"> 3/3</w:t>
+              <w:t>RÉCRÉATION</w:t>
             </w:r>
           </w:p>
         </w:tc>
@@ -1636,7 +1596,7 @@
                 <w:i w:val="0"/>
                 <w:sz w:val="14"/>
               </w:rPr>
-              <w:t>10h 05 – 10h 25</w:t>
+              <w:t>9h 45 – 10h 15</w:t>
             </w:r>
           </w:p>
         </w:tc>
@@ -1644,7 +1604,6 @@
           <w:tcPr>
             <w:tcW w:type="dxa" w:w="1644"/>
             <w:vAlign w:val="center"/>
-            <w:shd w:val="clear" w:color="auto" w:fill="FFFF99"/>
           </w:tcPr>
           <w:p>
             <w:pPr>
@@ -1658,7 +1617,16 @@
                 <w:i w:val="0"/>
                 <w:sz w:val="14"/>
               </w:rPr>
-              <w:t>RÉCRÉATION</w:t>
+              <w:t>Mathématiques – Mesure</w:t>
+            </w:r>
+            <w:r>
+              <w:rPr>
+                <w:rFonts w:ascii="Times New Roman" w:hAnsi="Times New Roman" w:cs="Times New Roman" w:eastAsia="Times New Roman"/>
+                <w:b w:val="0"/>
+                <w:color w:val="999999"/>
+                <w:sz w:val="10"/>
+              </w:rPr>
+              <w:t xml:space="preserve"> 1/2</w:t>
             </w:r>
           </w:p>
         </w:tc>
@@ -1666,7 +1634,6 @@
           <w:tcPr>
             <w:tcW w:type="dxa" w:w="1644"/>
             <w:vAlign w:val="center"/>
-            <w:shd w:val="clear" w:color="auto" w:fill="FFFF99"/>
           </w:tcPr>
           <w:p>
             <w:pPr>
@@ -1680,7 +1647,16 @@
                 <w:i w:val="0"/>
                 <w:sz w:val="14"/>
               </w:rPr>
-              <w:t>RÉCRÉATION</w:t>
+              <w:t>Mathématiques – Géométrie</w:t>
+            </w:r>
+            <w:r>
+              <w:rPr>
+                <w:rFonts w:ascii="Times New Roman" w:hAnsi="Times New Roman" w:cs="Times New Roman" w:eastAsia="Times New Roman"/>
+                <w:b w:val="0"/>
+                <w:color w:val="999999"/>
+                <w:sz w:val="10"/>
+              </w:rPr>
+              <w:t xml:space="preserve"> 1/2</w:t>
             </w:r>
           </w:p>
         </w:tc>
@@ -1688,7 +1664,6 @@
           <w:tcPr>
             <w:tcW w:type="dxa" w:w="1644"/>
             <w:vAlign w:val="center"/>
-            <w:shd w:val="clear" w:color="auto" w:fill="FFFF99"/>
           </w:tcPr>
           <w:p>
             <w:pPr>
@@ -1702,7 +1677,16 @@
                 <w:i w:val="0"/>
                 <w:sz w:val="14"/>
               </w:rPr>
-              <w:t>RÉCRÉATION</w:t>
+              <w:t>Mathématiques – Mesure</w:t>
+            </w:r>
+            <w:r>
+              <w:rPr>
+                <w:rFonts w:ascii="Times New Roman" w:hAnsi="Times New Roman" w:cs="Times New Roman" w:eastAsia="Times New Roman"/>
+                <w:b w:val="0"/>
+                <w:color w:val="999999"/>
+                <w:sz w:val="10"/>
+              </w:rPr>
+              <w:t xml:space="preserve"> 2/2</w:t>
             </w:r>
           </w:p>
         </w:tc>
@@ -1710,7 +1694,6 @@
           <w:tcPr>
             <w:tcW w:type="dxa" w:w="1644"/>
             <w:vAlign w:val="center"/>
-            <w:shd w:val="clear" w:color="auto" w:fill="FFFF99"/>
           </w:tcPr>
           <w:p>
             <w:pPr>
@@ -1724,7 +1707,16 @@
                 <w:i w:val="0"/>
                 <w:sz w:val="14"/>
               </w:rPr>
-              <w:t>RÉCRÉATION</w:t>
+              <w:t>Mathématiques – Géométrie</w:t>
+            </w:r>
+            <w:r>
+              <w:rPr>
+                <w:rFonts w:ascii="Times New Roman" w:hAnsi="Times New Roman" w:cs="Times New Roman" w:eastAsia="Times New Roman"/>
+                <w:b w:val="0"/>
+                <w:color w:val="999999"/>
+                <w:sz w:val="10"/>
+              </w:rPr>
+              <w:t xml:space="preserve"> 2/2</w:t>
             </w:r>
           </w:p>
         </w:tc>
@@ -1732,7 +1724,6 @@
           <w:tcPr>
             <w:tcW w:type="dxa" w:w="1644"/>
             <w:vAlign w:val="center"/>
-            <w:shd w:val="clear" w:color="auto" w:fill="FFFF99"/>
           </w:tcPr>
           <w:p>
             <w:pPr>
@@ -1746,7 +1737,16 @@
                 <w:i w:val="0"/>
                 <w:sz w:val="14"/>
               </w:rPr>
-              <w:t>RÉCRÉATION</w:t>
+              <w:t>Mathématiques – Opération</w:t>
+            </w:r>
+            <w:r>
+              <w:rPr>
+                <w:rFonts w:ascii="Times New Roman" w:hAnsi="Times New Roman" w:cs="Times New Roman" w:eastAsia="Times New Roman"/>
+                <w:b w:val="0"/>
+                <w:color w:val="999999"/>
+                <w:sz w:val="10"/>
+              </w:rPr>
+              <w:t xml:space="preserve"> 3/3</w:t>
             </w:r>
           </w:p>
         </w:tc>
@@ -1819,7 +1819,7 @@
                 <w:i w:val="0"/>
                 <w:sz w:val="14"/>
               </w:rPr>
-              <w:t>10h 25 – 11h 10</w:t>
+              <w:t>10h 15 – 11h 00</w:t>
             </w:r>
           </w:p>
         </w:tc>
@@ -2042,6 +2042,189 @@
                 <w:i w:val="0"/>
                 <w:sz w:val="14"/>
               </w:rPr>
+              <w:t>11h 00 – 11h 10</w:t>
+            </w:r>
+          </w:p>
+        </w:tc>
+        <w:tc>
+          <w:tcPr>
+            <w:tcW w:type="dxa" w:w="1644"/>
+            <w:vAlign w:val="center"/>
+            <w:shd w:val="clear" w:color="auto" w:fill="FFFF99"/>
+          </w:tcPr>
+          <w:p>
+            <w:pPr>
+              <w:jc w:val="center"/>
+              <w:spacing w:before="0" w:after="0" w:line="240" w:lineRule="auto"/>
+            </w:pPr>
+            <w:r>
+              <w:rPr>
+                <w:rFonts w:ascii="Times New Roman" w:hAnsi="Times New Roman" w:cs="Times New Roman" w:eastAsia="Times New Roman"/>
+                <w:b w:val="0"/>
+                <w:i w:val="0"/>
+                <w:sz w:val="14"/>
+              </w:rPr>
+              <w:t>RÉCRÉATION</w:t>
+            </w:r>
+          </w:p>
+        </w:tc>
+        <w:tc>
+          <w:tcPr>
+            <w:tcW w:type="dxa" w:w="1644"/>
+            <w:vAlign w:val="center"/>
+            <w:shd w:val="clear" w:color="auto" w:fill="FFFF99"/>
+          </w:tcPr>
+          <w:p>
+            <w:pPr>
+              <w:jc w:val="center"/>
+              <w:spacing w:before="0" w:after="0" w:line="240" w:lineRule="auto"/>
+            </w:pPr>
+            <w:r>
+              <w:rPr>
+                <w:rFonts w:ascii="Times New Roman" w:hAnsi="Times New Roman" w:cs="Times New Roman" w:eastAsia="Times New Roman"/>
+                <w:b w:val="0"/>
+                <w:i w:val="0"/>
+                <w:sz w:val="14"/>
+              </w:rPr>
+              <w:t>RÉCRÉATION</w:t>
+            </w:r>
+          </w:p>
+        </w:tc>
+        <w:tc>
+          <w:tcPr>
+            <w:tcW w:type="dxa" w:w="1644"/>
+            <w:vAlign w:val="center"/>
+            <w:shd w:val="clear" w:color="auto" w:fill="FFFF99"/>
+          </w:tcPr>
+          <w:p>
+            <w:pPr>
+              <w:jc w:val="center"/>
+              <w:spacing w:before="0" w:after="0" w:line="240" w:lineRule="auto"/>
+            </w:pPr>
+            <w:r>
+              <w:rPr>
+                <w:rFonts w:ascii="Times New Roman" w:hAnsi="Times New Roman" w:cs="Times New Roman" w:eastAsia="Times New Roman"/>
+                <w:b w:val="0"/>
+                <w:i w:val="0"/>
+                <w:sz w:val="14"/>
+              </w:rPr>
+              <w:t>RÉCRÉATION</w:t>
+            </w:r>
+          </w:p>
+        </w:tc>
+        <w:tc>
+          <w:tcPr>
+            <w:tcW w:type="dxa" w:w="1644"/>
+            <w:vAlign w:val="center"/>
+            <w:shd w:val="clear" w:color="auto" w:fill="FFFF99"/>
+          </w:tcPr>
+          <w:p>
+            <w:pPr>
+              <w:jc w:val="center"/>
+              <w:spacing w:before="0" w:after="0" w:line="240" w:lineRule="auto"/>
+            </w:pPr>
+            <w:r>
+              <w:rPr>
+                <w:rFonts w:ascii="Times New Roman" w:hAnsi="Times New Roman" w:cs="Times New Roman" w:eastAsia="Times New Roman"/>
+                <w:b w:val="0"/>
+                <w:i w:val="0"/>
+                <w:sz w:val="14"/>
+              </w:rPr>
+              <w:t>RÉCRÉATION</w:t>
+            </w:r>
+          </w:p>
+        </w:tc>
+        <w:tc>
+          <w:tcPr>
+            <w:tcW w:type="dxa" w:w="1644"/>
+            <w:vAlign w:val="center"/>
+            <w:shd w:val="clear" w:color="auto" w:fill="FFFF99"/>
+          </w:tcPr>
+          <w:p>
+            <w:pPr>
+              <w:jc w:val="center"/>
+              <w:spacing w:before="0" w:after="0" w:line="240" w:lineRule="auto"/>
+            </w:pPr>
+            <w:r>
+              <w:rPr>
+                <w:rFonts w:ascii="Times New Roman" w:hAnsi="Times New Roman" w:cs="Times New Roman" w:eastAsia="Times New Roman"/>
+                <w:b w:val="0"/>
+                <w:i w:val="0"/>
+                <w:sz w:val="14"/>
+              </w:rPr>
+              <w:t>RÉCRÉATION</w:t>
+            </w:r>
+          </w:p>
+        </w:tc>
+        <w:tc>
+          <w:tcPr>
+            <w:tcW w:type="dxa" w:w="113"/>
+            <w:shd w:val="clear" w:color="auto" w:fill="FFFFFF"/>
+          </w:tcPr>
+          <w:p/>
+        </w:tc>
+        <w:tc>
+          <w:tcPr>
+            <w:tcW w:type="dxa" w:w="1190"/>
+            <w:vAlign w:val="center"/>
+          </w:tcPr>
+          <w:p>
+            <w:pPr>
+              <w:jc w:val="left"/>
+              <w:spacing w:before="0" w:after="0" w:line="240" w:lineRule="auto"/>
+            </w:pPr>
+            <w:r>
+              <w:rPr>
+                <w:rFonts w:ascii="Times New Roman" w:hAnsi="Times New Roman" w:cs="Times New Roman" w:eastAsia="Times New Roman"/>
+                <w:b w:val="0"/>
+                <w:i w:val="0"/>
+                <w:sz w:val="14"/>
+              </w:rPr>
+              <w:t>FOV</w:t>
+            </w:r>
+          </w:p>
+        </w:tc>
+        <w:tc>
+          <w:tcPr>
+            <w:tcW w:type="dxa" w:w="3344"/>
+            <w:vAlign w:val="center"/>
+          </w:tcPr>
+          <w:p>
+            <w:pPr>
+              <w:jc w:val="left"/>
+              <w:spacing w:before="0" w:after="0" w:line="240" w:lineRule="auto"/>
+            </w:pPr>
+            <w:r>
+              <w:rPr>
+                <w:rFonts w:ascii="Times New Roman" w:hAnsi="Times New Roman" w:cs="Times New Roman" w:eastAsia="Times New Roman"/>
+                <w:b w:val="0"/>
+                <w:i w:val="0"/>
+                <w:sz w:val="13"/>
+              </w:rPr>
+              <w:t>1h 30 min (90 min) = 30 min × 3</w:t>
+            </w:r>
+          </w:p>
+        </w:tc>
+      </w:tr>
+      <w:tr>
+        <w:tc>
+          <w:tcPr>
+            <w:tcW w:type="dxa" w:w="1133"/>
+            <w:vAlign w:val="center"/>
+            <w:shd w:val="clear" w:color="auto" w:fill="6DFFE3"/>
+          </w:tcPr>
+          <w:p>
+            <w:pPr>
+              <w:jc w:val="center"/>
+              <w:spacing w:before="0" w:after="0" w:line="240" w:lineRule="auto"/>
+            </w:pPr>
+            <w:r>
+              <w:rPr>
+                <w:rFonts w:ascii="Times New Roman" w:hAnsi="Times New Roman" w:cs="Times New Roman" w:eastAsia="Times New Roman"/>
+                <w:b/>
+                <w:i w:val="0"/>
+                <w:sz w:val="14"/>
+              </w:rPr>
               <w:t>11h 10 – 11h 40</w:t>
             </w:r>
           </w:p>
@@ -2220,7 +2403,7 @@
                 <w:i w:val="0"/>
                 <w:sz w:val="14"/>
               </w:rPr>
-              <w:t>FOV</w:t>
+              <w:t>Zavakanto</w:t>
             </w:r>
           </w:p>
         </w:tc>
@@ -2241,7 +2424,7 @@
                 <w:i w:val="0"/>
                 <w:sz w:val="13"/>
               </w:rPr>
-              <w:t>1h 30 min (90 min) = 30 min × 3</w:t>
+              <w:t>1h 20 min (80 min) = 20 min × 4 (Arts visuels, Musique, Danse, Arts dramatiques)</w:t>
             </w:r>
           </w:p>
         </w:tc>
@@ -2443,7 +2626,7 @@
                 <w:i w:val="0"/>
                 <w:sz w:val="14"/>
               </w:rPr>
-              <w:t>Zavakanto</w:t>
+              <w:t>EPS</w:t>
             </w:r>
           </w:p>
         </w:tc>
@@ -2464,7 +2647,7 @@
                 <w:i w:val="0"/>
                 <w:sz w:val="13"/>
               </w:rPr>
-              <w:t>1h 20 min (80 min) = 20 min × 4 (Arts visuels, Musique, Danse, Arts dramatiques)</w:t>
+              <w:t>2h (120 min) = 45 min × 2 + 30 min × 1</w:t>
             </w:r>
           </w:p>
         </w:tc>
@@ -2666,7 +2849,6 @@
                 <w:i w:val="0"/>
                 <w:sz w:val="14"/>
               </w:rPr>
-              <w:t>EPS</w:t>
             </w:r>
           </w:p>
         </w:tc>
@@ -2687,7 +2869,6 @@
                 <w:i w:val="0"/>
                 <w:sz w:val="13"/>
               </w:rPr>
-              <w:t>2h (120 min) = 45 min × 2 + 30 min × 1</w:t>
             </w:r>
           </w:p>
         </w:tc>
@@ -2697,7 +2878,7 @@
           <w:tcPr>
             <w:tcW w:type="dxa" w:w="1133"/>
             <w:vAlign w:val="center"/>
-            <w:shd w:val="clear" w:color="auto" w:fill="6DFFE3"/>
+            <w:shd w:val="clear" w:color="auto" w:fill="AB7800"/>
           </w:tcPr>
           <w:p>
             <w:pPr>
@@ -2917,187 +3098,6 @@
         <w:tc>
           <w:tcPr>
             <w:tcW w:type="dxa" w:w="1133"/>
-            <w:vAlign w:val="center"/>
-            <w:shd w:val="clear" w:color="auto" w:fill="AB7800"/>
-          </w:tcPr>
-          <w:p>
-            <w:pPr>
-              <w:jc w:val="center"/>
-              <w:spacing w:before="0" w:after="0" w:line="240" w:lineRule="auto"/>
-            </w:pPr>
-            <w:r>
-              <w:rPr>
-                <w:rFonts w:ascii="Times New Roman" w:hAnsi="Times New Roman" w:cs="Times New Roman" w:eastAsia="Times New Roman"/>
-                <w:b/>
-                <w:i w:val="0"/>
-                <w:sz w:val="14"/>
-              </w:rPr>
-            </w:r>
-          </w:p>
-        </w:tc>
-        <w:tc>
-          <w:tcPr>
-            <w:tcW w:type="dxa" w:w="1644"/>
-            <w:vAlign w:val="center"/>
-            <w:shd w:val="clear" w:color="auto" w:fill="FFF0C0"/>
-          </w:tcPr>
-          <w:p>
-            <w:pPr>
-              <w:jc w:val="center"/>
-              <w:spacing w:before="0" w:after="0" w:line="240" w:lineRule="auto"/>
-            </w:pPr>
-            <w:r>
-              <w:rPr>
-                <w:rFonts w:ascii="Times New Roman" w:hAnsi="Times New Roman" w:cs="Times New Roman" w:eastAsia="Times New Roman"/>
-                <w:b w:val="0"/>
-                <w:i w:val="0"/>
-                <w:sz w:val="14"/>
-              </w:rPr>
-            </w:r>
-          </w:p>
-        </w:tc>
-        <w:tc>
-          <w:tcPr>
-            <w:tcW w:type="dxa" w:w="1644"/>
-            <w:vAlign w:val="center"/>
-            <w:shd w:val="clear" w:color="auto" w:fill="FFF0C0"/>
-          </w:tcPr>
-          <w:p>
-            <w:pPr>
-              <w:jc w:val="center"/>
-              <w:spacing w:before="0" w:after="0" w:line="240" w:lineRule="auto"/>
-            </w:pPr>
-            <w:r>
-              <w:rPr>
-                <w:rFonts w:ascii="Times New Roman" w:hAnsi="Times New Roman" w:cs="Times New Roman" w:eastAsia="Times New Roman"/>
-                <w:b w:val="0"/>
-                <w:i w:val="0"/>
-                <w:sz w:val="14"/>
-              </w:rPr>
-            </w:r>
-          </w:p>
-        </w:tc>
-        <w:tc>
-          <w:tcPr>
-            <w:tcW w:type="dxa" w:w="1644"/>
-            <w:vAlign w:val="center"/>
-            <w:shd w:val="clear" w:color="auto" w:fill="FFF0C0"/>
-          </w:tcPr>
-          <w:p>
-            <w:pPr>
-              <w:jc w:val="center"/>
-              <w:spacing w:before="0" w:after="0" w:line="240" w:lineRule="auto"/>
-            </w:pPr>
-            <w:r>
-              <w:rPr>
-                <w:rFonts w:ascii="Times New Roman" w:hAnsi="Times New Roman" w:cs="Times New Roman" w:eastAsia="Times New Roman"/>
-                <w:b w:val="0"/>
-                <w:i w:val="0"/>
-                <w:sz w:val="14"/>
-              </w:rPr>
-            </w:r>
-          </w:p>
-        </w:tc>
-        <w:tc>
-          <w:tcPr>
-            <w:tcW w:type="dxa" w:w="1644"/>
-            <w:vAlign w:val="center"/>
-            <w:shd w:val="clear" w:color="auto" w:fill="FFF0C0"/>
-          </w:tcPr>
-          <w:p>
-            <w:pPr>
-              <w:jc w:val="center"/>
-              <w:spacing w:before="0" w:after="0" w:line="240" w:lineRule="auto"/>
-            </w:pPr>
-            <w:r>
-              <w:rPr>
-                <w:rFonts w:ascii="Times New Roman" w:hAnsi="Times New Roman" w:cs="Times New Roman" w:eastAsia="Times New Roman"/>
-                <w:b w:val="0"/>
-                <w:i w:val="0"/>
-                <w:sz w:val="14"/>
-              </w:rPr>
-            </w:r>
-          </w:p>
-        </w:tc>
-        <w:tc>
-          <w:tcPr>
-            <w:tcW w:type="dxa" w:w="1644"/>
-            <w:vAlign w:val="center"/>
-            <w:shd w:val="clear" w:color="auto" w:fill="FFF0C0"/>
-          </w:tcPr>
-          <w:p>
-            <w:pPr>
-              <w:jc w:val="center"/>
-              <w:spacing w:before="0" w:after="0" w:line="240" w:lineRule="auto"/>
-            </w:pPr>
-            <w:r>
-              <w:rPr>
-                <w:rFonts w:ascii="Times New Roman" w:hAnsi="Times New Roman" w:cs="Times New Roman" w:eastAsia="Times New Roman"/>
-                <w:b w:val="0"/>
-                <w:i w:val="0"/>
-                <w:sz w:val="14"/>
-              </w:rPr>
-            </w:r>
-          </w:p>
-        </w:tc>
-        <w:tc>
-          <w:tcPr>
-            <w:tcW w:type="dxa" w:w="113"/>
-            <w:shd w:val="clear" w:color="auto" w:fill="FFFFFF"/>
-          </w:tcPr>
-          <w:p>
-            <w:r>
-              <w:rPr>
-                <w:rFonts w:ascii="Times New Roman" w:hAnsi="Times New Roman" w:cs="Times New Roman" w:eastAsia="Times New Roman"/>
-              </w:rPr>
-            </w:r>
-          </w:p>
-        </w:tc>
-        <w:tc>
-          <w:tcPr>
-            <w:tcW w:type="dxa" w:w="1190"/>
-            <w:vAlign w:val="center"/>
-          </w:tcPr>
-          <w:p>
-            <w:pPr>
-              <w:jc w:val="left"/>
-              <w:spacing w:before="0" w:after="0" w:line="240" w:lineRule="auto"/>
-            </w:pPr>
-            <w:r>
-              <w:rPr>
-                <w:rFonts w:ascii="Times New Roman" w:hAnsi="Times New Roman" w:cs="Times New Roman" w:eastAsia="Times New Roman"/>
-                <w:b w:val="0"/>
-                <w:i w:val="0"/>
-                <w:sz w:val="14"/>
-              </w:rPr>
-            </w:r>
-          </w:p>
-        </w:tc>
-        <w:tc>
-          <w:tcPr>
-            <w:tcW w:type="dxa" w:w="3344"/>
-            <w:vAlign w:val="center"/>
-          </w:tcPr>
-          <w:p>
-            <w:pPr>
-              <w:jc w:val="left"/>
-              <w:spacing w:before="0" w:after="0" w:line="240" w:lineRule="auto"/>
-            </w:pPr>
-            <w:r>
-              <w:rPr>
-                <w:rFonts w:ascii="Times New Roman" w:hAnsi="Times New Roman" w:cs="Times New Roman" w:eastAsia="Times New Roman"/>
-                <w:b w:val="0"/>
-                <w:i w:val="0"/>
-                <w:sz w:val="13"/>
-              </w:rPr>
-            </w:r>
-          </w:p>
-        </w:tc>
-      </w:tr>
-      <w:tr>
-        <w:tc>
-          <w:tcPr>
-            <w:tcW w:type="dxa" w:w="1133"/>
             <w:shd w:val="clear" w:color="auto" w:fill="FFFFFF"/>
           </w:tcPr>
           <w:p/>
@@ -3182,7 +3182,7 @@
                 <w:i w:val="0"/>
                 <w:sz w:val="13"/>
               </w:rPr>
-              <w:t>1h 40 min (100 min) = 20 min × 5</w:t>
+              <w:t>1h 40 min (100 min) = 10 min × 2 × 5</w:t>
             </w:r>
           </w:p>
         </w:tc>
@@ -3228,9 +3228,7 @@
                 <w:i w:val="0"/>
                 <w:sz w:val="16"/>
               </w:rPr>
-              <w:t>Total</w:t>
-              <w:br/>
-              <w:t>27h 30 min (1650 min)</w:t>
+              <w:t>Total : 27h 30 min (1650 min)</w:t>
             </w:r>
           </w:p>
         </w:tc>

</xml_diff>